<commit_message>
Se hicieron precisiones en el código e informe, se sube el informe en PDF
</commit_message>
<xml_diff>
--- a/TP1/TP1_Programacion_Grupo3.docx
+++ b/TP1/TP1_Programacion_Grupo3.docx
@@ -1,6 +1,6 @@
 
 <file path=word/document.xml><?xml version="1.0" encoding="utf-8"?>
-<w:document xmlns:wpc="http://schemas.microsoft.com/office/word/2010/wordprocessingCanvas" xmlns:cx="http://schemas.microsoft.com/office/drawing/2014/chartex" xmlns:cx1="http://schemas.microsoft.com/office/drawing/2015/9/8/chartex" xmlns:cx2="http://schemas.microsoft.com/office/drawing/2015/10/21/chartex" xmlns:cx3="http://schemas.microsoft.com/office/drawing/2016/5/9/chartex" xmlns:cx4="http://schemas.microsoft.com/office/drawing/2016/5/10/chartex" xmlns:cx5="http://schemas.microsoft.com/office/drawing/2016/5/11/chartex" xmlns:cx6="http://schemas.microsoft.com/office/drawing/2016/5/12/chartex" xmlns:cx7="http://schemas.microsoft.com/office/drawing/2016/5/13/chartex" xmlns:cx8="http://schemas.microsoft.com/office/drawing/2016/5/14/chartex" xmlns:mc="http://schemas.openxmlformats.org/markup-compatibility/2006" xmlns:aink="http://schemas.microsoft.com/office/drawing/2016/ink" xmlns:am3d="http://schemas.microsoft.com/office/drawing/2017/model3d" xmlns:o="urn:schemas-microsoft-com:office:office" xmlns:oel="http://schemas.microsoft.com/office/2019/extlst" xmlns:r="http://schemas.openxmlformats.org/officeDocument/2006/relationships" xmlns:m="http://schemas.openxmlformats.org/officeDocument/2006/math" xmlns:v="urn:schemas-microsoft-com:vml" xmlns:wp14="http://schemas.microsoft.com/office/word/2010/wordprocessingDrawing" xmlns:wp="http://schemas.openxmlformats.org/drawingml/2006/wordprocessingDrawing" xmlns:w10="urn:schemas-microsoft-com:office:word" xmlns:w="http://schemas.openxmlformats.org/wordprocessingml/2006/main" xmlns:w14="http://schemas.microsoft.com/office/word/2010/wordml" xmlns:w15="http://schemas.microsoft.com/office/word/2012/wordml" xmlns:w16cex="http://schemas.microsoft.com/office/word/2018/wordml/cex" xmlns:w16cid="http://schemas.microsoft.com/office/word/2016/wordml/cid" xmlns:w16="http://schemas.microsoft.com/office/word/2018/wordml" xmlns:w16du="http://schemas.microsoft.com/office/word/2023/wordml/word16du" xmlns:w16sdtdh="http://schemas.microsoft.com/office/word/2020/wordml/sdtdatahash" xmlns:w16sdtfl="http://schemas.microsoft.com/office/word/2024/wordml/sdtformatlock" xmlns:w16se="http://schemas.microsoft.com/office/word/2015/wordml/symex" xmlns:wpg="http://schemas.microsoft.com/office/word/2010/wordprocessingGroup" xmlns:wpi="http://schemas.microsoft.com/office/word/2010/wordprocessingInk" xmlns:wne="http://schemas.microsoft.com/office/word/2006/wordml" xmlns:wps="http://schemas.microsoft.com/office/word/2010/wordprocessingShape" mc:Ignorable="w14 w15 w16se w16cid w16 w16cex w16sdtdh w16sdtfl w16du wp14">
+<w:document xmlns:wpc="http://schemas.microsoft.com/office/word/2010/wordprocessingCanvas" xmlns:cx="http://schemas.microsoft.com/office/drawing/2014/chartex" xmlns:cx1="http://schemas.microsoft.com/office/drawing/2015/9/8/chartex" xmlns:cx2="http://schemas.microsoft.com/office/drawing/2015/10/21/chartex" xmlns:cx3="http://schemas.microsoft.com/office/drawing/2016/5/9/chartex" xmlns:cx4="http://schemas.microsoft.com/office/drawing/2016/5/10/chartex" xmlns:cx5="http://schemas.microsoft.com/office/drawing/2016/5/11/chartex" xmlns:cx6="http://schemas.microsoft.com/office/drawing/2016/5/12/chartex" xmlns:cx7="http://schemas.microsoft.com/office/drawing/2016/5/13/chartex" xmlns:cx8="http://schemas.microsoft.com/office/drawing/2016/5/14/chartex" xmlns:mc="http://schemas.openxmlformats.org/markup-compatibility/2006" xmlns:aink="http://schemas.microsoft.com/office/drawing/2016/ink" xmlns:am3d="http://schemas.microsoft.com/office/drawing/2017/model3d" xmlns:o="urn:schemas-microsoft-com:office:office" xmlns:r="http://schemas.openxmlformats.org/officeDocument/2006/relationships" xmlns:m="http://schemas.openxmlformats.org/officeDocument/2006/math" xmlns:v="urn:schemas-microsoft-com:vml" xmlns:wp14="http://schemas.microsoft.com/office/word/2010/wordprocessingDrawing" xmlns:wp="http://schemas.openxmlformats.org/drawingml/2006/wordprocessingDrawing" xmlns:w10="urn:schemas-microsoft-com:office:word" xmlns:w="http://schemas.openxmlformats.org/wordprocessingml/2006/main" xmlns:w14="http://schemas.microsoft.com/office/word/2010/wordml" xmlns:w15="http://schemas.microsoft.com/office/word/2012/wordml" xmlns:w16cex="http://schemas.microsoft.com/office/word/2018/wordml/cex" xmlns:w16cid="http://schemas.microsoft.com/office/word/2016/wordml/cid" xmlns:w16="http://schemas.microsoft.com/office/word/2018/wordml" xmlns:w16sdtdh="http://schemas.microsoft.com/office/word/2020/wordml/sdtdatahash" xmlns:w16se="http://schemas.microsoft.com/office/word/2015/wordml/symex" xmlns:wpg="http://schemas.microsoft.com/office/word/2010/wordprocessingGroup" xmlns:wpi="http://schemas.microsoft.com/office/word/2010/wordprocessingInk" xmlns:wne="http://schemas.microsoft.com/office/word/2006/wordml" xmlns:wps="http://schemas.microsoft.com/office/word/2010/wordprocessingShape" mc:Ignorable="w14 w15 w16se w16cid w16 w16cex w16sdtdh wp14">
   <w:body>
     <w:p>
       <w:pPr>
@@ -737,7 +737,23 @@
           <w:szCs w:val="20"/>
           <w:lang w:val="es-US"/>
         </w:rPr>
-        <w:t xml:space="preserve">La primera fase de este apartado persigue el análisis de la base de datos de la Encuesta Permanente de Hogares vinculada a los cuartos trimestres de los años 2024 y 2025, centrado en la identificación de la informalidad laboral tal como la caracterizan Maurizio y Monsalvo (2021). Después se presentan la selección y armonización de las variables, la modificación de los valores contradictorios y la actualización de los ingresos desde la irrupción de la inflación interanual. También incluye un análisis de los valores perdidos a partir de los </w:t>
+        <w:t xml:space="preserve">La primera fase de este apartado persigue el análisis de la base de datos de la Encuesta Permanente de Hogares vinculada a los cuartos trimestres de los años 2024 y 2025, centrado en la identificación de la informalidad laboral tal como la caracterizan </w:t>
+      </w:r>
+      <w:proofErr w:type="spellStart"/>
+      <w:r>
+        <w:rPr>
+          <w:szCs w:val="20"/>
+          <w:lang w:val="es-US"/>
+        </w:rPr>
+        <w:t>Maurizio</w:t>
+      </w:r>
+      <w:proofErr w:type="spellEnd"/>
+      <w:r>
+        <w:rPr>
+          <w:szCs w:val="20"/>
+          <w:lang w:val="es-US"/>
+        </w:rPr>
+        <w:t xml:space="preserve"> y Monsalvo (2021). Después se presentan la selección y armonización de las variables, la modificación de los valores contradictorios y la actualización de los ingresos desde la irrupción de la inflación interanual. También incluye un análisis de los valores perdidos a partir de los </w:t>
       </w:r>
       <w:proofErr w:type="spellStart"/>
       <w:r>
@@ -841,7 +857,9 @@
             <w:docPart w:val="DefaultPlaceholder_-1854013440"/>
           </w:placeholder>
         </w:sdtPr>
+        <w:sdtEndPr/>
         <w:sdtContent>
+          <w:proofErr w:type="spellStart"/>
           <w:r>
             <w:rPr>
               <w:rFonts w:cs="Times New Roman"/>
@@ -849,7 +867,17 @@
               <w:szCs w:val="20"/>
               <w:lang w:val="es-US"/>
             </w:rPr>
-            <w:t>Maurizio y Monsalvo (2021)</w:t>
+            <w:t>Maurizio</w:t>
+          </w:r>
+          <w:proofErr w:type="spellEnd"/>
+          <w:r>
+            <w:rPr>
+              <w:rFonts w:cs="Times New Roman"/>
+              <w:color w:val="000000"/>
+              <w:szCs w:val="20"/>
+              <w:lang w:val="es-US"/>
+            </w:rPr>
+            <w:t xml:space="preserve"> y Monsalvo (2021)</w:t>
           </w:r>
         </w:sdtContent>
       </w:sdt>
@@ -906,7 +934,9 @@
             <w:docPart w:val="F6998C41F6C94C4FA289D350D2806EE8"/>
           </w:placeholder>
         </w:sdtPr>
+        <w:sdtEndPr/>
         <w:sdtContent>
+          <w:proofErr w:type="spellStart"/>
           <w:r>
             <w:rPr>
               <w:rFonts w:cs="Times New Roman"/>
@@ -914,7 +944,17 @@
               <w:szCs w:val="20"/>
               <w:lang w:val="es-US"/>
             </w:rPr>
-            <w:t>Maurizio y Monsalvo (2021)</w:t>
+            <w:t>Maurizio</w:t>
+          </w:r>
+          <w:proofErr w:type="spellEnd"/>
+          <w:r>
+            <w:rPr>
+              <w:rFonts w:cs="Times New Roman"/>
+              <w:color w:val="000000"/>
+              <w:szCs w:val="20"/>
+              <w:lang w:val="es-US"/>
+            </w:rPr>
+            <w:t xml:space="preserve"> y Monsalvo (2021)</w:t>
           </w:r>
         </w:sdtContent>
       </w:sdt>
@@ -924,49 +964,431 @@
         </w:rPr>
         <w:t xml:space="preserve"> —</w:t>
       </w:r>
+      <w:proofErr w:type="spellStart"/>
       <w:r>
         <w:rPr>
           <w:i/>
           <w:iCs/>
           <w:szCs w:val="20"/>
         </w:rPr>
-        <w:t>Lower-</w:t>
-      </w:r>
-      <w:proofErr w:type="spellStart"/>
+        <w:t>Lower-tier</w:t>
+      </w:r>
+      <w:proofErr w:type="spellEnd"/>
       <w:r>
         <w:rPr>
           <w:i/>
           <w:iCs/>
           <w:szCs w:val="20"/>
         </w:rPr>
-        <w:t>tier</w:t>
-      </w:r>
-      <w:proofErr w:type="spellEnd"/>
+        <w:t xml:space="preserve"> informal </w:t>
+      </w:r>
+      <w:proofErr w:type="spellStart"/>
       <w:r>
         <w:rPr>
           <w:i/>
           <w:iCs/>
           <w:szCs w:val="20"/>
         </w:rPr>
-        <w:t xml:space="preserve"> informal </w:t>
-      </w:r>
-      <w:proofErr w:type="spellStart"/>
+        <w:t>wage</w:t>
+      </w:r>
+      <w:proofErr w:type="spellEnd"/>
       <w:r>
         <w:rPr>
           <w:i/>
           <w:iCs/>
           <w:szCs w:val="20"/>
         </w:rPr>
-        <w:t>wage</w:t>
-      </w:r>
-      <w:proofErr w:type="spellEnd"/>
+        <w:t xml:space="preserve"> </w:t>
+      </w:r>
+      <w:proofErr w:type="spellStart"/>
       <w:r>
         <w:rPr>
           <w:i/>
           <w:iCs/>
           <w:szCs w:val="20"/>
         </w:rPr>
+        <w:t>employees</w:t>
+      </w:r>
+      <w:proofErr w:type="spellEnd"/>
+      <w:r>
+        <w:rPr>
+          <w:szCs w:val="20"/>
+        </w:rPr>
+        <w:t xml:space="preserve">—, se entiende por trabajadores asalariados informales a aquellos trabajadores dependientes que se desempeñan en microempresas, es decir, unidades productivas de hasta 5 empleados. Este segmento </w:t>
+      </w:r>
+      <w:r>
+        <w:rPr>
+          <w:szCs w:val="20"/>
+        </w:rPr>
+        <w:t>es</w:t>
+      </w:r>
+      <w:r>
+        <w:rPr>
+          <w:szCs w:val="20"/>
+        </w:rPr>
+        <w:t xml:space="preserve"> el estrato más vulnerable del empleo asalariado, caracterizado por remuneraciones bajas, una elevada rotación laboral y </w:t>
+      </w:r>
+      <w:r>
+        <w:rPr>
+          <w:szCs w:val="20"/>
+        </w:rPr>
+        <w:t>escasas</w:t>
+      </w:r>
+      <w:r>
+        <w:rPr>
+          <w:szCs w:val="20"/>
+        </w:rPr>
+        <w:t xml:space="preserve"> posibilidades de transición </w:t>
+      </w:r>
+      <w:r>
+        <w:rPr>
+          <w:szCs w:val="20"/>
+        </w:rPr>
+        <w:t>a</w:t>
+      </w:r>
+      <w:r>
+        <w:rPr>
+          <w:szCs w:val="20"/>
+        </w:rPr>
+        <w:t>l empleo formal.</w:t>
+      </w:r>
+    </w:p>
+    <w:p>
+      <w:pPr>
+        <w:rPr>
+          <w:szCs w:val="20"/>
+          <w:lang w:val="es-US"/>
+        </w:rPr>
+      </w:pPr>
+      <w:r>
+        <w:rPr>
+          <w:szCs w:val="20"/>
+        </w:rPr>
+        <w:t>A partir de esta definición, la identificación del grupo se realizó siguiendo tres criterios secuenciales. En primer lugar, se consideró únicamente a quienes se clasifican como asalariados (</w:t>
+      </w:r>
+      <w:proofErr w:type="spellStart"/>
+      <w:r>
+        <w:rPr>
+          <w:szCs w:val="20"/>
+        </w:rPr>
+        <w:t>cat_ocup</w:t>
+      </w:r>
+      <w:proofErr w:type="spellEnd"/>
+      <w:r>
+        <w:rPr>
+          <w:szCs w:val="20"/>
+        </w:rPr>
+        <w:t xml:space="preserve"> = 3), es decir, empleados u obreros, excluyendo de este análisis a los patrones y a los trabajadores por cuenta propia. En segundo lugar, se verificó la ausencia de aportes o descuento jubilatorio (</w:t>
+      </w:r>
+      <w:proofErr w:type="spellStart"/>
+      <w:r>
+        <w:rPr>
+          <w:szCs w:val="20"/>
+        </w:rPr>
+        <w:t>desc_jubilatorio</w:t>
+      </w:r>
+      <w:proofErr w:type="spellEnd"/>
+      <w:r>
+        <w:rPr>
+          <w:szCs w:val="20"/>
+        </w:rPr>
+        <w:t>) como indicador de informalidad laboral. Finalmente, se incorporó el criterio de tamaño del establecimiento (</w:t>
+      </w:r>
+      <w:proofErr w:type="spellStart"/>
+      <w:r>
+        <w:rPr>
+          <w:szCs w:val="20"/>
+        </w:rPr>
+        <w:t>tam_estab</w:t>
+      </w:r>
+      <w:proofErr w:type="spellEnd"/>
+      <w:r>
+        <w:rPr>
+          <w:szCs w:val="20"/>
+        </w:rPr>
+        <w:t xml:space="preserve"> y </w:t>
+      </w:r>
+      <w:proofErr w:type="spellStart"/>
+      <w:r>
+        <w:rPr>
+          <w:szCs w:val="20"/>
+        </w:rPr>
+        <w:t>tam_estab_agrup</w:t>
+      </w:r>
+      <w:proofErr w:type="spellEnd"/>
+      <w:r>
+        <w:rPr>
+          <w:szCs w:val="20"/>
+        </w:rPr>
+        <w:t>), estableciendo que, para ser clasificad</w:t>
+      </w:r>
+      <w:r>
+        <w:rPr>
+          <w:szCs w:val="20"/>
+        </w:rPr>
+        <w:t>a</w:t>
+      </w:r>
+      <w:r>
+        <w:rPr>
+          <w:szCs w:val="20"/>
+        </w:rPr>
         <w:t xml:space="preserve"> </w:t>
+      </w:r>
+      <w:r>
+        <w:rPr>
+          <w:szCs w:val="20"/>
+        </w:rPr>
+        <w:t>en</w:t>
+      </w:r>
+      <w:r>
+        <w:rPr>
+          <w:szCs w:val="20"/>
+        </w:rPr>
+        <w:t xml:space="preserve"> esta categoría según </w:t>
+      </w:r>
+      <w:proofErr w:type="spellStart"/>
+      <w:r>
+        <w:rPr>
+          <w:szCs w:val="20"/>
+        </w:rPr>
+        <w:t>Maurizio</w:t>
+      </w:r>
+      <w:proofErr w:type="spellEnd"/>
+      <w:r>
+        <w:rPr>
+          <w:szCs w:val="20"/>
+        </w:rPr>
+        <w:t xml:space="preserve"> y Monsalvo (2021), la empresa debía contar con 5 empleados o menos.</w:t>
+      </w:r>
+    </w:p>
+    <w:p>
+      <w:pPr>
+        <w:pStyle w:val="Ttulo2"/>
+        <w:rPr>
+          <w:szCs w:val="20"/>
+          <w:lang w:val="es-US"/>
+        </w:rPr>
+      </w:pPr>
+      <w:r>
+        <w:rPr>
+          <w:szCs w:val="20"/>
+          <w:lang w:val="es-US"/>
+        </w:rPr>
+        <w:t>Proceso de descarga, elección de variables</w:t>
+      </w:r>
+      <w:r>
+        <w:rPr>
+          <w:szCs w:val="20"/>
+          <w:lang w:val="es-US"/>
+        </w:rPr>
+        <w:t xml:space="preserve">, </w:t>
+      </w:r>
+      <w:r>
+        <w:rPr>
+          <w:szCs w:val="20"/>
+          <w:lang w:val="es-US"/>
+        </w:rPr>
+        <w:t>corrección de valores</w:t>
+      </w:r>
+      <w:r>
+        <w:rPr>
+          <w:szCs w:val="20"/>
+          <w:lang w:val="es-US"/>
+        </w:rPr>
+        <w:t xml:space="preserve"> y actualización de variables de ingreso</w:t>
+      </w:r>
+    </w:p>
+    <w:p>
+      <w:pPr>
+        <w:rPr>
+          <w:szCs w:val="20"/>
+          <w:lang w:val="es-US"/>
+        </w:rPr>
+      </w:pPr>
+      <w:r>
+        <w:rPr>
+          <w:szCs w:val="20"/>
+        </w:rPr>
+        <w:t xml:space="preserve">Tras la descarga de los datos correspondientes a </w:t>
+      </w:r>
+      <w:r>
+        <w:rPr>
+          <w:szCs w:val="20"/>
+        </w:rPr>
+        <w:t>los</w:t>
+      </w:r>
+      <w:r>
+        <w:rPr>
+          <w:szCs w:val="20"/>
+        </w:rPr>
+        <w:t xml:space="preserve"> </w:t>
+      </w:r>
+      <w:r>
+        <w:rPr>
+          <w:szCs w:val="20"/>
+        </w:rPr>
+        <w:t>cuartos trimestres</w:t>
+      </w:r>
+      <w:r>
+        <w:rPr>
+          <w:szCs w:val="20"/>
+        </w:rPr>
+        <w:t xml:space="preserve"> de 2024 y 2025, se seleccionaron las variables detalladas en el Anexo 1. Para ello, fue necesario realizar una revisión minuciosa de las variables continuas de mayor interés, como </w:t>
+      </w:r>
+      <w:r>
+        <w:rPr>
+          <w:szCs w:val="20"/>
+        </w:rPr>
+        <w:t xml:space="preserve">los </w:t>
+      </w:r>
+      <w:r>
+        <w:rPr>
+          <w:szCs w:val="20"/>
+        </w:rPr>
+        <w:t>ingresos,</w:t>
+      </w:r>
+      <w:r>
+        <w:rPr>
+          <w:szCs w:val="20"/>
+        </w:rPr>
+        <w:t xml:space="preserve"> la</w:t>
+      </w:r>
+      <w:r>
+        <w:rPr>
+          <w:szCs w:val="20"/>
+        </w:rPr>
+        <w:t xml:space="preserve"> edad y el factor de ponderación. Con base en el diccionario de variables, se identificaron los códigos utilizados por la EPH para representar valores no declarados o sin respuesta (NS/NR), habitualmente registrados como -9, 9 o 99, así como la presencia de valores negativos o atípicos, particularmente en el caso de la edad. En cuanto a la variable de ponderación, se corroboró la ausencia de valores iguales a cero, dado que, al tratarse de un factor de expansión estadística, un valor nulo invalidaría cualquier interpretación posterior de los resultados. Este proceso incluyó la revisión de estadísticos descriptivos</w:t>
+      </w:r>
+      <w:r>
+        <w:rPr>
+          <w:szCs w:val="20"/>
+        </w:rPr>
+        <w:t xml:space="preserve"> y</w:t>
+      </w:r>
+      <w:r>
+        <w:rPr>
+          <w:szCs w:val="20"/>
+        </w:rPr>
+        <w:t xml:space="preserve"> distribuciones de frecuencia</w:t>
+      </w:r>
+      <w:r>
+        <w:rPr>
+          <w:szCs w:val="20"/>
+        </w:rPr>
+        <w:t>s</w:t>
+      </w:r>
+      <w:r>
+        <w:rPr>
+          <w:szCs w:val="20"/>
+        </w:rPr>
+        <w:t>,</w:t>
+      </w:r>
+      <w:r>
+        <w:rPr>
+          <w:szCs w:val="20"/>
+        </w:rPr>
+        <w:t xml:space="preserve"> </w:t>
+      </w:r>
+      <w:r>
+        <w:rPr>
+          <w:szCs w:val="20"/>
+        </w:rPr>
+        <w:t>así como</w:t>
+      </w:r>
+      <w:r>
+        <w:rPr>
+          <w:szCs w:val="20"/>
+        </w:rPr>
+        <w:t xml:space="preserve"> la realización de los reemplazos correspondientes</w:t>
+      </w:r>
+      <w:r>
+        <w:rPr>
+          <w:szCs w:val="20"/>
+        </w:rPr>
+        <w:t xml:space="preserve"> y</w:t>
+      </w:r>
+      <w:r>
+        <w:rPr>
+          <w:szCs w:val="20"/>
+        </w:rPr>
+        <w:t xml:space="preserve"> </w:t>
+      </w:r>
+      <w:r>
+        <w:rPr>
+          <w:szCs w:val="20"/>
+        </w:rPr>
+        <w:t>la identificación de</w:t>
+      </w:r>
+      <w:r>
+        <w:rPr>
+          <w:szCs w:val="20"/>
+        </w:rPr>
+        <w:t xml:space="preserve"> inconsistencias </w:t>
+      </w:r>
+      <w:r>
+        <w:rPr>
+          <w:szCs w:val="20"/>
+        </w:rPr>
+        <w:t>en el resto de variables</w:t>
+      </w:r>
+      <w:r>
+        <w:rPr>
+          <w:szCs w:val="20"/>
+        </w:rPr>
+        <w:t>.</w:t>
+      </w:r>
+    </w:p>
+    <w:p>
+      <w:pPr>
+        <w:rPr>
+          <w:szCs w:val="20"/>
+        </w:rPr>
+      </w:pPr>
+      <w:r>
+        <w:rPr>
+          <w:szCs w:val="20"/>
+        </w:rPr>
+        <w:t xml:space="preserve">Merece una mención aparte el procedimiento de actualización de las variables de ingreso, para el cual se recurrió a </w:t>
+      </w:r>
+      <w:r>
+        <w:rPr>
+          <w:szCs w:val="20"/>
+        </w:rPr>
+        <w:t xml:space="preserve">la </w:t>
+      </w:r>
+      <w:r>
+        <w:rPr>
+          <w:szCs w:val="20"/>
+        </w:rPr>
+        <w:t xml:space="preserve">información oficial del INDEC </w:t>
+      </w:r>
+      <w:r>
+        <w:rPr>
+          <w:szCs w:val="20"/>
+        </w:rPr>
+        <w:t>sobre</w:t>
+      </w:r>
+      <w:r>
+        <w:rPr>
+          <w:szCs w:val="20"/>
+        </w:rPr>
+        <w:t xml:space="preserve"> la inflación interanual registrada entre noviembre de 2024 y noviembre de 2025 (31,4%). Se optó por este mes en particular por corresponder al mes central del trimestre bajo análisis, evitando así la elección de períodos afectados por efectos estacionales, como ocurre con las fiestas de fin de año.</w:t>
+      </w:r>
+    </w:p>
+    <w:p>
+      <w:pPr>
+        <w:pStyle w:val="Ttulo2"/>
+        <w:rPr>
+          <w:szCs w:val="20"/>
+          <w:lang w:val="es-US"/>
+        </w:rPr>
+      </w:pPr>
+      <w:r>
+        <w:rPr>
+          <w:szCs w:val="20"/>
+          <w:lang w:val="es-US"/>
+        </w:rPr>
+        <w:t xml:space="preserve">Gráfico </w:t>
       </w:r>
       <w:proofErr w:type="spellStart"/>
       <w:r>
@@ -974,85 +1396,104 @@
           <w:i/>
           <w:iCs/>
           <w:szCs w:val="20"/>
-        </w:rPr>
-        <w:t>employees</w:t>
+          <w:lang w:val="es-US"/>
+        </w:rPr>
+        <w:t>heatmap</w:t>
       </w:r>
       <w:proofErr w:type="spellEnd"/>
       <w:r>
         <w:rPr>
           <w:szCs w:val="20"/>
-        </w:rPr>
-        <w:t xml:space="preserve">—, se entiende por trabajadores asalariados informales a aquellos trabajadores dependientes que se desempeñan en microempresas, es decir, unidades productivas de hasta 5 empleados. Este segmento </w:t>
-      </w:r>
-      <w:r>
-        <w:rPr>
-          <w:szCs w:val="20"/>
-        </w:rPr>
-        <w:t>es</w:t>
-      </w:r>
-      <w:r>
-        <w:rPr>
-          <w:szCs w:val="20"/>
-        </w:rPr>
-        <w:t xml:space="preserve"> el estrato más vulnerable del empleo asalariado, caracterizado por remuneraciones bajas, una elevada rotación laboral y </w:t>
-      </w:r>
-      <w:r>
-        <w:rPr>
-          <w:szCs w:val="20"/>
-        </w:rPr>
-        <w:t>escasas</w:t>
-      </w:r>
-      <w:r>
-        <w:rPr>
-          <w:szCs w:val="20"/>
-        </w:rPr>
-        <w:t xml:space="preserve"> posibilidades de transición </w:t>
-      </w:r>
-      <w:r>
-        <w:rPr>
-          <w:szCs w:val="20"/>
-        </w:rPr>
-        <w:t>a</w:t>
-      </w:r>
-      <w:r>
-        <w:rPr>
-          <w:szCs w:val="20"/>
-        </w:rPr>
-        <w:t>l empleo formal.</w:t>
-      </w:r>
+          <w:lang w:val="es-US"/>
+        </w:rPr>
+        <w:t xml:space="preserve"> sobre valores </w:t>
+      </w:r>
+      <w:proofErr w:type="spellStart"/>
+      <w:r>
+        <w:rPr>
+          <w:szCs w:val="20"/>
+          <w:lang w:val="es-US"/>
+        </w:rPr>
+        <w:t>N</w:t>
+      </w:r>
+      <w:r>
+        <w:rPr>
+          <w:szCs w:val="20"/>
+          <w:lang w:val="es-US"/>
+        </w:rPr>
+        <w:t>aN</w:t>
+      </w:r>
+      <w:proofErr w:type="spellEnd"/>
     </w:p>
     <w:p>
       <w:pPr>
         <w:rPr>
           <w:szCs w:val="20"/>
-          <w:lang w:val="es-US"/>
-        </w:rPr>
-      </w:pPr>
-      <w:r>
-        <w:rPr>
-          <w:szCs w:val="20"/>
-        </w:rPr>
-        <w:t>A partir de esta definición, la identificación del grupo se realizó siguiendo tres criterios secuenciales. En primer lugar, se consideró únicamente a quienes se clasifican como asalariados (</w:t>
+        </w:rPr>
+      </w:pPr>
+      <w:r>
+        <w:rPr>
+          <w:szCs w:val="20"/>
+        </w:rPr>
+        <w:t xml:space="preserve">El </w:t>
       </w:r>
       <w:proofErr w:type="spellStart"/>
       <w:r>
         <w:rPr>
           <w:szCs w:val="20"/>
         </w:rPr>
-        <w:t>cat_ocup</w:t>
+        <w:t>heatmap</w:t>
       </w:r>
       <w:proofErr w:type="spellEnd"/>
       <w:r>
         <w:rPr>
           <w:szCs w:val="20"/>
         </w:rPr>
-        <w:t xml:space="preserve"> = 3), es decir, empleados u obreros, excluyendo de este análisis a los patrones y a los trabajadores por cuenta propia. En segundo lugar, se verificó la ausencia de aportes o descuento jubilatorio (</w:t>
+        <w:t xml:space="preserve"> permite visualizar los valores </w:t>
       </w:r>
       <w:proofErr w:type="spellStart"/>
       <w:r>
         <w:rPr>
           <w:szCs w:val="20"/>
         </w:rPr>
+        <w:t>NaN</w:t>
+      </w:r>
+      <w:proofErr w:type="spellEnd"/>
+      <w:r>
+        <w:rPr>
+          <w:szCs w:val="20"/>
+        </w:rPr>
+        <w:t xml:space="preserve"> presentes en las bases </w:t>
+      </w:r>
+      <w:r>
+        <w:rPr>
+          <w:szCs w:val="20"/>
+        </w:rPr>
+        <w:t xml:space="preserve">de datos </w:t>
+      </w:r>
+      <w:r>
+        <w:rPr>
+          <w:szCs w:val="20"/>
+        </w:rPr>
+        <w:t xml:space="preserve">"respondieron" y "ocupados". En la base "respondieron", las variables que se destacan en </w:t>
+      </w:r>
+      <w:r>
+        <w:rPr>
+          <w:szCs w:val="20"/>
+        </w:rPr>
+        <w:t>rojo</w:t>
+      </w:r>
+      <w:r>
+        <w:rPr>
+          <w:szCs w:val="20"/>
+        </w:rPr>
+        <w:t>, como descuento jubilatorio (</w:t>
+      </w:r>
+      <w:proofErr w:type="spellStart"/>
+      <w:r>
+        <w:rPr>
+          <w:szCs w:val="20"/>
+        </w:rPr>
         <w:t>desc_jubilatorio</w:t>
       </w:r>
       <w:proofErr w:type="spellEnd"/>
@@ -1060,7 +1501,7 @@
         <w:rPr>
           <w:szCs w:val="20"/>
         </w:rPr>
-        <w:t>) como indicador de informalidad laboral. Finalmente, se incorporó el criterio de tamaño del establecimiento (</w:t>
+        <w:t>) y tamaño de establecimiento (</w:t>
       </w:r>
       <w:proofErr w:type="spellStart"/>
       <w:r>
@@ -1074,21 +1515,43 @@
         <w:rPr>
           <w:szCs w:val="20"/>
         </w:rPr>
-        <w:t xml:space="preserve"> y </w:t>
-      </w:r>
-      <w:proofErr w:type="spellStart"/>
-      <w:r>
-        <w:rPr>
-          <w:szCs w:val="20"/>
-        </w:rPr>
-        <w:t>tam_estab_agrup</w:t>
-      </w:r>
-      <w:proofErr w:type="spellEnd"/>
-      <w:r>
-        <w:rPr>
-          <w:szCs w:val="20"/>
-        </w:rPr>
-        <w:t>), estableciendo que, para ser clasificad</w:t>
+        <w:t>), presentan</w:t>
+      </w:r>
+      <w:r>
+        <w:rPr>
+          <w:szCs w:val="20"/>
+        </w:rPr>
+        <w:t>,</w:t>
+      </w:r>
+      <w:r>
+        <w:rPr>
+          <w:szCs w:val="20"/>
+        </w:rPr>
+        <w:t xml:space="preserve"> en ambos años</w:t>
+      </w:r>
+      <w:r>
+        <w:rPr>
+          <w:szCs w:val="20"/>
+        </w:rPr>
+        <w:t>,</w:t>
+      </w:r>
+      <w:r>
+        <w:rPr>
+          <w:szCs w:val="20"/>
+        </w:rPr>
+        <w:t xml:space="preserve"> un porcentaje de valores faltantes del 54,9%. Este resultado </w:t>
+      </w:r>
+      <w:r>
+        <w:rPr>
+          <w:szCs w:val="20"/>
+        </w:rPr>
+        <w:t>es</w:t>
+      </w:r>
+      <w:r>
+        <w:rPr>
+          <w:szCs w:val="20"/>
+        </w:rPr>
+        <w:t xml:space="preserve"> esperable dad</w:t>
       </w:r>
       <w:r>
         <w:rPr>
@@ -1100,428 +1563,146 @@
         <w:rPr>
           <w:szCs w:val="20"/>
         </w:rPr>
-        <w:t xml:space="preserve"> </w:t>
-      </w:r>
-      <w:r>
-        <w:rPr>
-          <w:szCs w:val="20"/>
-        </w:rPr>
-        <w:t>en</w:t>
-      </w:r>
-      <w:r>
-        <w:rPr>
-          <w:szCs w:val="20"/>
-        </w:rPr>
-        <w:t xml:space="preserve"> esta categoría según Maurizio y Monsalvo (2021), la empresa debía contar con 5 empleados o menos.</w:t>
+        <w:t xml:space="preserve"> su magnitud, ya que dicha base incluye tanto a personas inactivas y desocupadas como a menores de 10 años, población que</w:t>
+      </w:r>
+      <w:r>
+        <w:rPr>
+          <w:szCs w:val="20"/>
+        </w:rPr>
+        <w:t>,</w:t>
+      </w:r>
+      <w:r>
+        <w:rPr>
+          <w:szCs w:val="20"/>
+        </w:rPr>
+        <w:t xml:space="preserve"> por definición</w:t>
+      </w:r>
+      <w:r>
+        <w:rPr>
+          <w:szCs w:val="20"/>
+        </w:rPr>
+        <w:t>,</w:t>
+      </w:r>
+      <w:r>
+        <w:rPr>
+          <w:szCs w:val="20"/>
+        </w:rPr>
+        <w:t xml:space="preserve"> no está en condiciones de responder este tipo de preguntas</w:t>
+      </w:r>
+      <w:r>
+        <w:rPr>
+          <w:szCs w:val="20"/>
+        </w:rPr>
+        <w:t xml:space="preserve">, de la misma forma una persona podría estar en condición de </w:t>
+      </w:r>
+      <w:r>
+        <w:rPr>
+          <w:szCs w:val="20"/>
+        </w:rPr>
+        <w:t>empleada,</w:t>
+      </w:r>
+      <w:r>
+        <w:rPr>
+          <w:szCs w:val="20"/>
+        </w:rPr>
+        <w:t xml:space="preserve"> pero no de asalariada, lo cual en e</w:t>
+      </w:r>
+      <w:r>
+        <w:rPr>
+          <w:szCs w:val="20"/>
+        </w:rPr>
+        <w:t xml:space="preserve">se caso tampoco correspondería una respuesta, lo que no </w:t>
+      </w:r>
+      <w:r>
+        <w:rPr>
+          <w:szCs w:val="20"/>
+        </w:rPr>
+        <w:t>significa,</w:t>
+      </w:r>
+      <w:r>
+        <w:rPr>
+          <w:szCs w:val="20"/>
+        </w:rPr>
+        <w:t xml:space="preserve"> sin embargo; que este sea un valor </w:t>
+      </w:r>
+      <w:r>
+        <w:rPr>
+          <w:szCs w:val="20"/>
+        </w:rPr>
+        <w:lastRenderedPageBreak/>
+        <w:t>nulo.</w:t>
+      </w:r>
+      <w:r>
+        <w:rPr>
+          <w:szCs w:val="20"/>
+        </w:rPr>
+        <w:t xml:space="preserve"> En</w:t>
+      </w:r>
+      <w:r>
+        <w:rPr>
+          <w:szCs w:val="20"/>
+        </w:rPr>
+        <w:t xml:space="preserve"> esa misma línea, en</w:t>
+      </w:r>
+      <w:r>
+        <w:rPr>
+          <w:szCs w:val="20"/>
+        </w:rPr>
+        <w:t xml:space="preserve"> relación con los ingresos, es probable que una parte considerable de este grupo haya declarado un valor de cero, lo cual no equivale a un valor nulo (-9).</w:t>
       </w:r>
     </w:p>
     <w:p>
       <w:pPr>
-        <w:pStyle w:val="Ttulo2"/>
-        <w:rPr>
-          <w:szCs w:val="20"/>
-          <w:lang w:val="es-US"/>
-        </w:rPr>
-      </w:pPr>
-      <w:r>
-        <w:rPr>
-          <w:szCs w:val="20"/>
-          <w:lang w:val="es-US"/>
-        </w:rPr>
-        <w:t>Proceso de descarga, elección de variables</w:t>
-      </w:r>
-      <w:r>
-        <w:rPr>
-          <w:szCs w:val="20"/>
-          <w:lang w:val="es-US"/>
-        </w:rPr>
-        <w:t xml:space="preserve">, </w:t>
-      </w:r>
-      <w:r>
-        <w:rPr>
-          <w:szCs w:val="20"/>
-          <w:lang w:val="es-US"/>
-        </w:rPr>
-        <w:t>corrección de valores</w:t>
-      </w:r>
-      <w:r>
-        <w:rPr>
-          <w:szCs w:val="20"/>
-          <w:lang w:val="es-US"/>
-        </w:rPr>
-        <w:t xml:space="preserve"> y actualización de variables de ingreso</w:t>
+        <w:spacing w:after="0"/>
+        <w:rPr>
+          <w:szCs w:val="20"/>
+        </w:rPr>
+      </w:pPr>
+      <w:r>
+        <w:rPr>
+          <w:szCs w:val="20"/>
+        </w:rPr>
+        <w:t xml:space="preserve">Por otro lado, en la base "ocupados" se observa un incremento en el porcentaje de valores faltantes </w:t>
+      </w:r>
+      <w:r>
+        <w:rPr>
+          <w:szCs w:val="20"/>
+        </w:rPr>
+        <w:t>en</w:t>
+      </w:r>
+      <w:r>
+        <w:rPr>
+          <w:szCs w:val="20"/>
+        </w:rPr>
+        <w:t xml:space="preserve"> </w:t>
+      </w:r>
+      <w:r>
+        <w:rPr>
+          <w:szCs w:val="20"/>
+        </w:rPr>
+        <w:t>las</w:t>
+      </w:r>
+      <w:r>
+        <w:rPr>
+          <w:szCs w:val="20"/>
+        </w:rPr>
+        <w:t xml:space="preserve"> variables de ingreso, no porque su cantidad absoluta haya aumentado, sino como consecuencia de un efecto de proporción: al reducirse el número total de observaciones en esta base, el peso relativo de los faltantes se eleva. En cambio, respecto a las variables descuento jubilatorio y tamaño de establecimiento, el porcentaje de valores nulos se reduce a cero, dado que en este subconjunto se trabaja exclusivamente con personas </w:t>
+      </w:r>
+      <w:r>
+        <w:rPr>
+          <w:szCs w:val="20"/>
+        </w:rPr>
+        <w:t>ocupadas</w:t>
+      </w:r>
+      <w:r>
+        <w:rPr>
+          <w:szCs w:val="20"/>
+        </w:rPr>
+        <w:t>.</w:t>
       </w:r>
     </w:p>
     <w:p>
       <w:pPr>
-        <w:rPr>
-          <w:szCs w:val="20"/>
-          <w:lang w:val="es-US"/>
-        </w:rPr>
-      </w:pPr>
-      <w:r>
-        <w:rPr>
-          <w:szCs w:val="20"/>
-        </w:rPr>
-        <w:t xml:space="preserve">Tras la descarga de los datos correspondientes a </w:t>
-      </w:r>
-      <w:r>
-        <w:rPr>
-          <w:szCs w:val="20"/>
-        </w:rPr>
-        <w:t>los</w:t>
-      </w:r>
-      <w:r>
-        <w:rPr>
-          <w:szCs w:val="20"/>
-        </w:rPr>
-        <w:t xml:space="preserve"> </w:t>
-      </w:r>
-      <w:r>
-        <w:rPr>
-          <w:szCs w:val="20"/>
-        </w:rPr>
-        <w:t>cuartos trimestres</w:t>
-      </w:r>
-      <w:r>
-        <w:rPr>
-          <w:szCs w:val="20"/>
-        </w:rPr>
-        <w:t xml:space="preserve"> de 2024 y 2025, se seleccionaron las variables detalladas en el Anexo 1. Para ello, fue necesario realizar una revisión minuciosa de las variables continuas de mayor interés, como </w:t>
-      </w:r>
-      <w:r>
-        <w:rPr>
-          <w:szCs w:val="20"/>
-        </w:rPr>
-        <w:t xml:space="preserve">los </w:t>
-      </w:r>
-      <w:r>
-        <w:rPr>
-          <w:szCs w:val="20"/>
-        </w:rPr>
-        <w:t>ingresos,</w:t>
-      </w:r>
-      <w:r>
-        <w:rPr>
-          <w:szCs w:val="20"/>
-        </w:rPr>
-        <w:t xml:space="preserve"> la</w:t>
-      </w:r>
-      <w:r>
-        <w:rPr>
-          <w:szCs w:val="20"/>
-        </w:rPr>
-        <w:t xml:space="preserve"> edad y el factor de ponderación. Con base en el diccionario de variables, se identificaron los códigos utilizados por la EPH para representar valores no declarados o sin respuesta (NS/NR), habitualmente registrados como -9, 9 o 99, así como la presencia de valores negativos o atípicos, particularmente en el caso de la edad. En cuanto a la variable de ponderación, se corroboró la ausencia de valores iguales a cero, dado que, al tratarse de un factor de expansión estadística, un valor nulo invalidaría cualquier interpretación posterior de los resultados. Este proceso incluyó la revisión de estadísticos descriptivos</w:t>
-      </w:r>
-      <w:r>
-        <w:rPr>
-          <w:szCs w:val="20"/>
-        </w:rPr>
-        <w:t xml:space="preserve"> y</w:t>
-      </w:r>
-      <w:r>
-        <w:rPr>
-          <w:szCs w:val="20"/>
-        </w:rPr>
-        <w:t xml:space="preserve"> distribuciones de frecuencia</w:t>
-      </w:r>
-      <w:r>
-        <w:rPr>
-          <w:szCs w:val="20"/>
-        </w:rPr>
-        <w:t>s</w:t>
-      </w:r>
-      <w:r>
-        <w:rPr>
-          <w:szCs w:val="20"/>
-        </w:rPr>
-        <w:t>,</w:t>
-      </w:r>
-      <w:r>
-        <w:rPr>
-          <w:szCs w:val="20"/>
-        </w:rPr>
-        <w:t xml:space="preserve"> </w:t>
-      </w:r>
-      <w:r>
-        <w:rPr>
-          <w:szCs w:val="20"/>
-        </w:rPr>
-        <w:t>así como</w:t>
-      </w:r>
-      <w:r>
-        <w:rPr>
-          <w:szCs w:val="20"/>
-        </w:rPr>
-        <w:t xml:space="preserve"> la realización de los reemplazos correspondientes</w:t>
-      </w:r>
-      <w:r>
-        <w:rPr>
-          <w:szCs w:val="20"/>
-        </w:rPr>
-        <w:t xml:space="preserve"> y</w:t>
-      </w:r>
-      <w:r>
-        <w:rPr>
-          <w:szCs w:val="20"/>
-        </w:rPr>
-        <w:t xml:space="preserve"> </w:t>
-      </w:r>
-      <w:r>
-        <w:rPr>
-          <w:szCs w:val="20"/>
-        </w:rPr>
-        <w:t>la identificación de</w:t>
-      </w:r>
-      <w:r>
-        <w:rPr>
-          <w:szCs w:val="20"/>
-        </w:rPr>
-        <w:t xml:space="preserve"> inconsistencias </w:t>
-      </w:r>
-      <w:r>
-        <w:rPr>
-          <w:szCs w:val="20"/>
-        </w:rPr>
-        <w:t>en el resto de variables</w:t>
-      </w:r>
-      <w:r>
-        <w:rPr>
-          <w:szCs w:val="20"/>
-        </w:rPr>
-        <w:t>.</w:t>
-      </w:r>
-    </w:p>
-    <w:p>
-      <w:pPr>
-        <w:rPr>
-          <w:szCs w:val="20"/>
-        </w:rPr>
-      </w:pPr>
-      <w:r>
-        <w:rPr>
-          <w:szCs w:val="20"/>
-        </w:rPr>
-        <w:t xml:space="preserve">Merece una mención aparte el procedimiento de actualización de las variables de ingreso, para el cual se recurrió a </w:t>
-      </w:r>
-      <w:r>
-        <w:rPr>
-          <w:szCs w:val="20"/>
-        </w:rPr>
-        <w:t xml:space="preserve">la </w:t>
-      </w:r>
-      <w:r>
-        <w:rPr>
-          <w:szCs w:val="20"/>
-        </w:rPr>
-        <w:t xml:space="preserve">información oficial del INDEC </w:t>
-      </w:r>
-      <w:r>
-        <w:rPr>
-          <w:szCs w:val="20"/>
-        </w:rPr>
-        <w:t>sobre</w:t>
-      </w:r>
-      <w:r>
-        <w:rPr>
-          <w:szCs w:val="20"/>
-        </w:rPr>
-        <w:t xml:space="preserve"> la inflación interanual registrada entre noviembre de 2024 y noviembre de 2025 (31,4%). Se optó por este mes en particular por corresponder al mes central del trimestre bajo análisis, evitando así la elección de períodos afectados por efectos estacionales, como ocurre con las fiestas de fin de año.</w:t>
-      </w:r>
-    </w:p>
-    <w:p>
-      <w:pPr>
-        <w:pStyle w:val="Ttulo2"/>
-        <w:rPr>
-          <w:szCs w:val="20"/>
-          <w:lang w:val="es-US"/>
-        </w:rPr>
-      </w:pPr>
-      <w:r>
-        <w:rPr>
-          <w:szCs w:val="20"/>
-          <w:lang w:val="es-US"/>
-        </w:rPr>
-        <w:t xml:space="preserve">Gráfico </w:t>
-      </w:r>
-      <w:proofErr w:type="spellStart"/>
-      <w:r>
-        <w:rPr>
-          <w:i/>
-          <w:iCs/>
-          <w:szCs w:val="20"/>
-          <w:lang w:val="es-US"/>
-        </w:rPr>
-        <w:t>heatmap</w:t>
-      </w:r>
-      <w:proofErr w:type="spellEnd"/>
-      <w:r>
-        <w:rPr>
-          <w:szCs w:val="20"/>
-          <w:lang w:val="es-US"/>
-        </w:rPr>
-        <w:t xml:space="preserve"> sobre valores N</w:t>
-      </w:r>
-      <w:r>
-        <w:rPr>
-          <w:szCs w:val="20"/>
-          <w:lang w:val="es-US"/>
-        </w:rPr>
-        <w:t>aN</w:t>
-      </w:r>
-    </w:p>
-    <w:p>
-      <w:pPr>
-        <w:rPr>
-          <w:szCs w:val="20"/>
-        </w:rPr>
-      </w:pPr>
-      <w:r>
-        <w:rPr>
-          <w:szCs w:val="20"/>
-        </w:rPr>
-        <w:t xml:space="preserve">El heatmap permite visualizar los valores NaN presentes en las bases </w:t>
-      </w:r>
-      <w:r>
-        <w:rPr>
-          <w:szCs w:val="20"/>
-        </w:rPr>
-        <w:t xml:space="preserve">de datos </w:t>
-      </w:r>
-      <w:r>
-        <w:rPr>
-          <w:szCs w:val="20"/>
-        </w:rPr>
-        <w:t>"respondieron" y "ocupados". En la base "respondieron", las variables que se destacan en rojo, como descuento jubilatorio (desc_jubilatorio) y tamaño de establecimiento (</w:t>
-      </w:r>
-      <w:proofErr w:type="spellStart"/>
-      <w:r>
-        <w:rPr>
-          <w:szCs w:val="20"/>
-        </w:rPr>
-        <w:t>tam_estab</w:t>
-      </w:r>
-      <w:proofErr w:type="spellEnd"/>
-      <w:r>
-        <w:rPr>
-          <w:szCs w:val="20"/>
-        </w:rPr>
-        <w:t>), presentan</w:t>
-      </w:r>
-      <w:r>
-        <w:rPr>
-          <w:szCs w:val="20"/>
-        </w:rPr>
-        <w:t>,</w:t>
-      </w:r>
-      <w:r>
-        <w:rPr>
-          <w:szCs w:val="20"/>
-        </w:rPr>
-        <w:t xml:space="preserve"> en ambos años</w:t>
-      </w:r>
-      <w:r>
-        <w:rPr>
-          <w:szCs w:val="20"/>
-        </w:rPr>
-        <w:t>,</w:t>
-      </w:r>
-      <w:r>
-        <w:rPr>
-          <w:szCs w:val="20"/>
-        </w:rPr>
-        <w:t xml:space="preserve"> un porcentaje de valores faltantes del 54,9%. Este resultado </w:t>
-      </w:r>
-      <w:r>
-        <w:rPr>
-          <w:szCs w:val="20"/>
-        </w:rPr>
-        <w:t>es</w:t>
-      </w:r>
-      <w:r>
-        <w:rPr>
-          <w:szCs w:val="20"/>
-        </w:rPr>
-        <w:t xml:space="preserve"> esperable dad</w:t>
-      </w:r>
-      <w:r>
-        <w:rPr>
-          <w:szCs w:val="20"/>
-        </w:rPr>
-        <w:t>a</w:t>
-      </w:r>
-      <w:r>
-        <w:rPr>
-          <w:szCs w:val="20"/>
-        </w:rPr>
-        <w:t xml:space="preserve"> su magnitud, ya que dicha base incluye tanto a personas inactivas y desocupadas como a menores de 10 años, población que</w:t>
-      </w:r>
-      <w:r>
-        <w:rPr>
-          <w:szCs w:val="20"/>
-        </w:rPr>
-        <w:t>,</w:t>
-      </w:r>
-      <w:r>
-        <w:rPr>
-          <w:szCs w:val="20"/>
-        </w:rPr>
-        <w:t xml:space="preserve"> por definición</w:t>
-      </w:r>
-      <w:r>
-        <w:rPr>
-          <w:szCs w:val="20"/>
-        </w:rPr>
-        <w:t>,</w:t>
-      </w:r>
-      <w:r>
-        <w:rPr>
-          <w:szCs w:val="20"/>
-        </w:rPr>
-        <w:t xml:space="preserve"> no está en condiciones de responder este tipo de preguntas. En relación con los ingresos, es probable que una parte considerable de este grupo haya declarado un valor de cero, lo cual no equivale a un valor nulo (-9).</w:t>
-      </w:r>
-    </w:p>
-    <w:p>
-      <w:pPr>
-        <w:spacing w:after="0"/>
-        <w:rPr>
-          <w:szCs w:val="20"/>
-        </w:rPr>
-      </w:pPr>
-      <w:r>
-        <w:rPr>
-          <w:szCs w:val="20"/>
-        </w:rPr>
-        <w:lastRenderedPageBreak/>
-        <w:t xml:space="preserve">Por otro lado, en la base "ocupados" se observa un incremento en el porcentaje de valores faltantes </w:t>
-      </w:r>
-      <w:r>
-        <w:rPr>
-          <w:szCs w:val="20"/>
-        </w:rPr>
-        <w:t>en</w:t>
-      </w:r>
-      <w:r>
-        <w:rPr>
-          <w:szCs w:val="20"/>
-        </w:rPr>
-        <w:t xml:space="preserve"> estas variables de ingreso, no porque su cantidad absoluta haya aumentado, sino como consecuencia de un efecto de proporción: al reducirse el número total de observaciones en esta base, el peso relativo de los faltantes se eleva. En cambio, respecto a las variables descuento jubilatorio y tamaño de establecimiento, el porcentaje de valores nulos se reduce a cero, dado que en este subconjunto se trabaja exclusivamente con personas </w:t>
-      </w:r>
-      <w:r>
-        <w:rPr>
-          <w:szCs w:val="20"/>
-        </w:rPr>
-        <w:t>ocupadas</w:t>
-      </w:r>
-      <w:r>
-        <w:rPr>
-          <w:szCs w:val="20"/>
-        </w:rPr>
-        <w:t>.</w:t>
-      </w:r>
-    </w:p>
-    <w:p>
-      <w:pPr>
         <w:pStyle w:val="Descripcin"/>
         <w:ind w:left="2694" w:right="2691"/>
         <w:rPr>
@@ -1530,96 +1711,22 @@
       </w:pPr>
       <w:r>
         <w:rPr>
-          <w:szCs w:val="20"/>
-        </w:rPr>
-        <w:t xml:space="preserve">Figura </w:t>
-      </w:r>
-      <w:r>
-        <w:rPr>
-          <w:szCs w:val="20"/>
-        </w:rPr>
-        <w:fldChar w:fldCharType="begin"/>
-      </w:r>
-      <w:r>
-        <w:rPr>
-          <w:szCs w:val="20"/>
-        </w:rPr>
-        <w:instrText xml:space="preserve"> SEQ Figura \* ARABIC </w:instrText>
-      </w:r>
-      <w:r>
-        <w:rPr>
-          <w:szCs w:val="20"/>
-        </w:rPr>
-        <w:fldChar w:fldCharType="separate"/>
-      </w:r>
-      <w:r>
-        <w:rPr>
           <w:noProof/>
           <w:szCs w:val="20"/>
         </w:rPr>
-        <w:t>1</w:t>
-      </w:r>
-      <w:r>
-        <w:rPr>
-          <w:szCs w:val="20"/>
-        </w:rPr>
-        <w:fldChar w:fldCharType="end"/>
-      </w:r>
-      <w:r>
-        <w:rPr>
-          <w:szCs w:val="20"/>
-        </w:rPr>
-        <w:tab/>
-      </w:r>
-      <w:r>
-        <w:rPr>
-          <w:szCs w:val="20"/>
-        </w:rPr>
-        <w:br/>
-      </w:r>
-      <w:proofErr w:type="spellStart"/>
-      <w:r>
-        <w:rPr>
-          <w:b w:val="0"/>
-          <w:bCs/>
-          <w:i/>
-          <w:iCs w:val="0"/>
-          <w:szCs w:val="20"/>
-        </w:rPr>
-        <w:t>Heatmap</w:t>
-      </w:r>
-      <w:proofErr w:type="spellEnd"/>
-      <w:r>
-        <w:rPr>
-          <w:b w:val="0"/>
-          <w:bCs/>
-          <w:i/>
-          <w:iCs w:val="0"/>
-          <w:szCs w:val="20"/>
-        </w:rPr>
-        <w:t xml:space="preserve"> de valores faltantes en bases respondieron y ocupados </w:t>
-      </w:r>
-    </w:p>
-    <w:p>
-      <w:pPr>
-        <w:pStyle w:val="Sinespaciado"/>
-        <w:jc w:val="center"/>
-        <w:rPr>
-          <w:sz w:val="20"/>
-          <w:szCs w:val="20"/>
-        </w:rPr>
-      </w:pPr>
-      <w:r>
-        <w:rPr>
-          <w:noProof/>
-          <w:sz w:val="20"/>
-          <w:szCs w:val="20"/>
-        </w:rPr>
         <w:drawing>
-          <wp:inline distT="0" distB="0" distL="0" distR="0" wp14:anchorId="5577414C" wp14:editId="56026F10">
-            <wp:extent cx="3243418" cy="2257865"/>
-            <wp:effectExtent l="0" t="0" r="0" b="3175"/>
-            <wp:docPr id="921613015" name="Imagen 1"/>
+          <wp:anchor distT="0" distB="0" distL="114300" distR="114300" simplePos="0" relativeHeight="251658240" behindDoc="0" locked="0" layoutInCell="1" allowOverlap="1" wp14:anchorId="2F376FA9" wp14:editId="00C8220F">
+            <wp:simplePos x="0" y="0"/>
+            <wp:positionH relativeFrom="column">
+              <wp:posOffset>1511292</wp:posOffset>
+            </wp:positionH>
+            <wp:positionV relativeFrom="paragraph">
+              <wp:posOffset>392639</wp:posOffset>
+            </wp:positionV>
+            <wp:extent cx="3697605" cy="3047365"/>
+            <wp:effectExtent l="0" t="0" r="0" b="635"/>
+            <wp:wrapTopAndBottom/>
+            <wp:docPr id="1" name="Imagen 1"/>
             <wp:cNvGraphicFramePr>
               <a:graphicFrameLocks xmlns:a="http://schemas.openxmlformats.org/drawingml/2006/main" noChangeAspect="1"/>
             </wp:cNvGraphicFramePr>
@@ -1627,11 +1734,17 @@
               <a:graphicData uri="http://schemas.openxmlformats.org/drawingml/2006/picture">
                 <pic:pic xmlns:pic="http://schemas.openxmlformats.org/drawingml/2006/picture">
                   <pic:nvPicPr>
-                    <pic:cNvPr id="921613015" name=""/>
+                    <pic:cNvPr id="1" name="Imagen 1"/>
                     <pic:cNvPicPr/>
                   </pic:nvPicPr>
                   <pic:blipFill>
-                    <a:blip r:embed="rId14"/>
+                    <a:blip r:embed="rId14" cstate="print">
+                      <a:extLst>
+                        <a:ext uri="{28A0092B-C50C-407E-A947-70E740481C1C}">
+                          <a14:useLocalDpi xmlns:a14="http://schemas.microsoft.com/office/drawing/2010/main" val="0"/>
+                        </a:ext>
+                      </a:extLst>
+                    </a:blip>
                     <a:stretch>
                       <a:fillRect/>
                     </a:stretch>
@@ -1639,7 +1752,7 @@
                   <pic:spPr>
                     <a:xfrm>
                       <a:off x="0" y="0"/>
-                      <a:ext cx="3252807" cy="2264401"/>
+                      <a:ext cx="3697605" cy="3047365"/>
                     </a:xfrm>
                     <a:prstGeom prst="rect">
                       <a:avLst/>
@@ -1648,8 +1761,85 @@
                 </pic:pic>
               </a:graphicData>
             </a:graphic>
-          </wp:inline>
+            <wp14:sizeRelH relativeFrom="margin">
+              <wp14:pctWidth>0</wp14:pctWidth>
+            </wp14:sizeRelH>
+            <wp14:sizeRelV relativeFrom="margin">
+              <wp14:pctHeight>0</wp14:pctHeight>
+            </wp14:sizeRelV>
+          </wp:anchor>
         </w:drawing>
+      </w:r>
+      <w:r>
+        <w:rPr>
+          <w:szCs w:val="20"/>
+        </w:rPr>
+        <w:t xml:space="preserve">Figura </w:t>
+      </w:r>
+      <w:r>
+        <w:rPr>
+          <w:szCs w:val="20"/>
+        </w:rPr>
+        <w:fldChar w:fldCharType="begin"/>
+      </w:r>
+      <w:r>
+        <w:rPr>
+          <w:szCs w:val="20"/>
+        </w:rPr>
+        <w:instrText xml:space="preserve"> SEQ Figura \* ARABIC </w:instrText>
+      </w:r>
+      <w:r>
+        <w:rPr>
+          <w:szCs w:val="20"/>
+        </w:rPr>
+        <w:fldChar w:fldCharType="separate"/>
+      </w:r>
+      <w:r>
+        <w:rPr>
+          <w:noProof/>
+          <w:szCs w:val="20"/>
+        </w:rPr>
+        <w:t>1</w:t>
+      </w:r>
+      <w:r>
+        <w:rPr>
+          <w:szCs w:val="20"/>
+        </w:rPr>
+        <w:fldChar w:fldCharType="end"/>
+      </w:r>
+      <w:r>
+        <w:rPr>
+          <w:szCs w:val="20"/>
+        </w:rPr>
+        <w:tab/>
+      </w:r>
+      <w:r>
+        <w:rPr>
+          <w:szCs w:val="20"/>
+        </w:rPr>
+        <w:br/>
+      </w:r>
+      <w:proofErr w:type="spellStart"/>
+      <w:r>
+        <w:rPr>
+          <w:b w:val="0"/>
+          <w:bCs/>
+          <w:i/>
+          <w:iCs w:val="0"/>
+          <w:szCs w:val="20"/>
+        </w:rPr>
+        <w:t>Heatmap</w:t>
+      </w:r>
+      <w:proofErr w:type="spellEnd"/>
+      <w:r>
+        <w:rPr>
+          <w:b w:val="0"/>
+          <w:bCs/>
+          <w:i/>
+          <w:iCs w:val="0"/>
+          <w:szCs w:val="20"/>
+        </w:rPr>
+        <w:t xml:space="preserve"> de valores faltantes en bases respondieron y ocupados </w:t>
       </w:r>
     </w:p>
     <w:p>
@@ -1693,6 +1883,7 @@
             <w:docPart w:val="AB1892C75F97D34FB97E8D50FF9D6DF5"/>
           </w:placeholder>
         </w:sdtPr>
+        <w:sdtEndPr/>
         <w:sdtContent>
           <w:r>
             <w:rPr>
@@ -2076,6 +2267,7 @@
         <w:spacing w:before="240"/>
       </w:pPr>
       <w:r>
+        <w:lastRenderedPageBreak/>
         <w:t>Respecto a los estadísticos descriptivos preliminares (ver Anexo 2), co</w:t>
       </w:r>
       <w:r>
@@ -2100,7 +2292,15 @@
         <w:t xml:space="preserve"> les</w:t>
       </w:r>
       <w:r>
-        <w:t xml:space="preserve"> correspondía responder determinada pregunta quedaron codificadas como NaN. Esto no debe confundirse con el problema de datos faltantes </w:t>
+        <w:t xml:space="preserve"> correspondía responder determinada pregunta quedaron codificadas como </w:t>
+      </w:r>
+      <w:proofErr w:type="spellStart"/>
+      <w:r>
+        <w:t>NaN</w:t>
+      </w:r>
+      <w:proofErr w:type="spellEnd"/>
+      <w:r>
+        <w:t xml:space="preserve">. Esto no debe confundirse con el problema de datos faltantes </w:t>
       </w:r>
       <w:r>
         <w:t>d</w:t>
@@ -2118,11 +2318,7 @@
       </w:r>
       <w:proofErr w:type="spellEnd"/>
       <w:r>
-        <w:t xml:space="preserve">, </w:t>
-      </w:r>
-      <w:r>
-        <w:lastRenderedPageBreak/>
-        <w:t xml:space="preserve">pues aquí se trata </w:t>
+        <w:t xml:space="preserve">, pues aquí se trata </w:t>
       </w:r>
       <w:r>
         <w:t>sólo</w:t>
@@ -2145,9 +2341,11 @@
       <w:r>
         <w:t>'</w:t>
       </w:r>
+      <w:proofErr w:type="spellStart"/>
       <w:r>
         <w:t>NaN</w:t>
       </w:r>
+      <w:proofErr w:type="spellEnd"/>
       <w:r>
         <w:t>'</w:t>
       </w:r>
@@ -2329,6 +2527,7 @@
             <w:docPart w:val="6796B5EBE6279F48AA0BC0D6F950B8E2"/>
           </w:placeholder>
         </w:sdtPr>
+        <w:sdtEndPr/>
         <w:sdtContent>
           <w:r>
             <w:rPr>
@@ -2521,6 +2720,7 @@
             <w:docPart w:val="DefaultPlaceholder_-1854013440"/>
           </w:placeholder>
         </w:sdtPr>
+        <w:sdtEndPr/>
         <w:sdtContent>
           <w:r>
             <w:rPr>
@@ -2529,7 +2729,27 @@
               <w:szCs w:val="20"/>
               <w:lang w:val="es-US"/>
             </w:rPr>
-            <w:t>(Hickel et al., 2024)</w:t>
+            <w:t>(</w:t>
+          </w:r>
+          <w:proofErr w:type="spellStart"/>
+          <w:r>
+            <w:rPr>
+              <w:rFonts w:cs="Times New Roman"/>
+              <w:color w:val="000000"/>
+              <w:szCs w:val="20"/>
+              <w:lang w:val="es-US"/>
+            </w:rPr>
+            <w:t>Hickel</w:t>
+          </w:r>
+          <w:proofErr w:type="spellEnd"/>
+          <w:r>
+            <w:rPr>
+              <w:rFonts w:cs="Times New Roman"/>
+              <w:color w:val="000000"/>
+              <w:szCs w:val="20"/>
+              <w:lang w:val="es-US"/>
+            </w:rPr>
+            <w:t xml:space="preserve"> et al., 2024)</w:t>
           </w:r>
         </w:sdtContent>
       </w:sdt>
@@ -2589,6 +2809,7 @@
             <w:docPart w:val="DefaultPlaceholder_-1854013440"/>
           </w:placeholder>
         </w:sdtPr>
+        <w:sdtEndPr/>
         <w:sdtContent>
           <w:r>
             <w:rPr>
@@ -2980,6 +3201,7 @@
                 <w:lang w:val="es-EC" w:eastAsia="es-MX"/>
               </w:rPr>
             </w:pPr>
+            <w:proofErr w:type="spellStart"/>
             <w:r>
               <w:rPr>
                 <w:rFonts w:eastAsia="Times New Roman" w:cs="Times New Roman"/>
@@ -2989,7 +3211,19 @@
                 <w:szCs w:val="13"/>
                 <w:lang w:val="es-EC" w:eastAsia="es-MX"/>
               </w:rPr>
-              <w:t>Abs.</w:t>
+              <w:t>Abs</w:t>
+            </w:r>
+            <w:proofErr w:type="spellEnd"/>
+            <w:r>
+              <w:rPr>
+                <w:rFonts w:eastAsia="Times New Roman" w:cs="Times New Roman"/>
+                <w:b/>
+                <w:bCs/>
+                <w:sz w:val="13"/>
+                <w:szCs w:val="13"/>
+                <w:lang w:val="es-EC" w:eastAsia="es-MX"/>
+              </w:rPr>
+              <w:t>.</w:t>
             </w:r>
           </w:p>
         </w:tc>
@@ -3058,6 +3292,7 @@
                 <w:lang w:val="es-EC" w:eastAsia="es-MX"/>
               </w:rPr>
             </w:pPr>
+            <w:proofErr w:type="spellStart"/>
             <w:r>
               <w:rPr>
                 <w:rFonts w:eastAsia="Times New Roman" w:cs="Times New Roman"/>
@@ -3067,7 +3302,19 @@
                 <w:szCs w:val="13"/>
                 <w:lang w:val="es-EC" w:eastAsia="es-MX"/>
               </w:rPr>
-              <w:t>Abs.</w:t>
+              <w:t>Abs</w:t>
+            </w:r>
+            <w:proofErr w:type="spellEnd"/>
+            <w:r>
+              <w:rPr>
+                <w:rFonts w:eastAsia="Times New Roman" w:cs="Times New Roman"/>
+                <w:b/>
+                <w:bCs/>
+                <w:sz w:val="13"/>
+                <w:szCs w:val="13"/>
+                <w:lang w:val="es-EC" w:eastAsia="es-MX"/>
+              </w:rPr>
+              <w:t>.</w:t>
             </w:r>
           </w:p>
         </w:tc>
@@ -3136,6 +3383,7 @@
                 <w:lang w:val="es-EC" w:eastAsia="es-MX"/>
               </w:rPr>
             </w:pPr>
+            <w:proofErr w:type="spellStart"/>
             <w:r>
               <w:rPr>
                 <w:rFonts w:eastAsia="Times New Roman" w:cs="Times New Roman"/>
@@ -3145,7 +3393,19 @@
                 <w:szCs w:val="13"/>
                 <w:lang w:val="es-EC" w:eastAsia="es-MX"/>
               </w:rPr>
-              <w:t>Abs.</w:t>
+              <w:t>Abs</w:t>
+            </w:r>
+            <w:proofErr w:type="spellEnd"/>
+            <w:r>
+              <w:rPr>
+                <w:rFonts w:eastAsia="Times New Roman" w:cs="Times New Roman"/>
+                <w:b/>
+                <w:bCs/>
+                <w:sz w:val="13"/>
+                <w:szCs w:val="13"/>
+                <w:lang w:val="es-EC" w:eastAsia="es-MX"/>
+              </w:rPr>
+              <w:t>.</w:t>
             </w:r>
           </w:p>
         </w:tc>
@@ -4874,6 +5134,7 @@
             <w:docPart w:val="8463F3F54C6DD042BBB903E9E8FF24C4"/>
           </w:placeholder>
         </w:sdtPr>
+        <w:sdtEndPr/>
         <w:sdtContent>
           <w:r>
             <w:rPr>
@@ -4908,7 +5169,15 @@
           <w:szCs w:val="20"/>
           <w:lang w:val="es-US"/>
         </w:rPr>
-        <w:t>En cuanto a los cuartos trimestres de 2024 y 2025, la tasa de informalidad de la población ocupada urbana de Argentina está en el 14 %, lo que genera unos 11,5 millones de trabajadores de la formalidad y cerca de 2 millones de trabajadores de la informalidad en los mismos períodos. Si bien la variación de un año a otro es mínima, se constata un ligero empeoramiento relativo de las condiciones laborales de las mujeres, puesto que la informalidad de las mujeres es del 17,34% en 2024 y del 18,94% en 2025. Estas tasas son casi el doble que las de los hombres en los mismos períodos, lo que demuestra que existe una brecha de género en el mercado de trabajo argentino, persistente y estructuralmente relevante en dimensiones como la cantidad de trabajadores.</w:t>
+        <w:t xml:space="preserve">En cuanto a los cuartos trimestres de 2024 y 2025, la tasa de informalidad de la población ocupada urbana de Argentina está en el 14 %, lo que genera unos 11,5 millones de trabajadores de la formalidad y cerca de 2 millones de trabajadores de la informalidad en los mismos períodos. Si bien la variación de un año a otro es mínima, se constata un ligero empeoramiento relativo de las condiciones laborales de las mujeres, puesto que la informalidad de las mujeres es del 17,34% en 2024 y del 18,94% en 2025. Estas tasas son </w:t>
+      </w:r>
+      <w:r>
+        <w:rPr>
+          <w:szCs w:val="20"/>
+          <w:lang w:val="es-US"/>
+        </w:rPr>
+        <w:lastRenderedPageBreak/>
+        <w:t>casi el doble que las de los hombres en los mismos períodos, lo que demuestra que existe una brecha de género en el mercado de trabajo argentino, persistente y estructuralmente relevante en dimensiones como la cantidad de trabajadores.</w:t>
       </w:r>
     </w:p>
     <w:p>
@@ -4930,15 +5199,23 @@
           <w:szCs w:val="20"/>
           <w:lang w:val="es-US"/>
         </w:rPr>
-        <w:t xml:space="preserve">refleja la realidad de la desigualdad, puesto que a pesar de la difusión de valores inclusivos en las sociedades contemporáneas, el sistema económico ha mantenido cierta esencia excluyente, en la que las mujeres aún enfrentan dificultades para </w:t>
-      </w:r>
-      <w:r>
-        <w:rPr>
-          <w:szCs w:val="20"/>
-          <w:lang w:val="es-US"/>
-        </w:rPr>
-        <w:lastRenderedPageBreak/>
-        <w:t>incorporarse plenamente al mercado laboral. Sin embargo, esta estructura inequitativa puede tener un trasfondo antropológico</w:t>
+        <w:t xml:space="preserve">refleja la realidad de la desigualdad, </w:t>
+      </w:r>
+      <w:proofErr w:type="gramStart"/>
+      <w:r>
+        <w:rPr>
+          <w:szCs w:val="20"/>
+          <w:lang w:val="es-US"/>
+        </w:rPr>
+        <w:t>puesto que</w:t>
+      </w:r>
+      <w:proofErr w:type="gramEnd"/>
+      <w:r>
+        <w:rPr>
+          <w:szCs w:val="20"/>
+          <w:lang w:val="es-US"/>
+        </w:rPr>
+        <w:t xml:space="preserve"> a pesar de la difusión de valores inclusivos en las sociedades contemporáneas, el sistema económico ha mantenido cierta esencia excluyente, en la que las mujeres aún enfrentan dificultades para incorporarse plenamente al mercado laboral. Sin embargo, esta estructura inequitativa puede tener un trasfondo antropológico</w:t>
       </w:r>
       <w:r>
         <w:rPr>
@@ -5010,7 +5287,9 @@
             <w:docPart w:val="DefaultPlaceholder_-1854013440"/>
           </w:placeholder>
         </w:sdtPr>
+        <w:sdtEndPr/>
         <w:sdtContent>
+          <w:proofErr w:type="spellStart"/>
           <w:r>
             <w:rPr>
               <w:rFonts w:cs="Times New Roman"/>
@@ -5018,7 +5297,17 @@
               <w:szCs w:val="20"/>
               <w:lang w:val="es-US"/>
             </w:rPr>
-            <w:t>Hassine et al. (2025)</w:t>
+            <w:t>Hassine</w:t>
+          </w:r>
+          <w:proofErr w:type="spellEnd"/>
+          <w:r>
+            <w:rPr>
+              <w:rFonts w:cs="Times New Roman"/>
+              <w:color w:val="000000"/>
+              <w:szCs w:val="20"/>
+              <w:lang w:val="es-US"/>
+            </w:rPr>
+            <w:t xml:space="preserve"> et al. (2025)</w:t>
           </w:r>
         </w:sdtContent>
       </w:sdt>
@@ -5358,6 +5647,7 @@
             <w:docPart w:val="451FE05DFD7ED94DA6FB5A681E896FD9"/>
           </w:placeholder>
         </w:sdtPr>
+        <w:sdtEndPr/>
         <w:sdtContent>
           <w:r>
             <w:rPr>
@@ -5496,6 +5786,7 @@
         <w:rPr>
           <w:szCs w:val="20"/>
         </w:rPr>
+        <w:lastRenderedPageBreak/>
         <w:t xml:space="preserve">Figura </w:t>
       </w:r>
       <w:r>
@@ -5627,6 +5918,7 @@
       </w:pPr>
       <w:r>
         <w:rPr>
+          <w:noProof/>
           <w:sz w:val="20"/>
           <w:szCs w:val="20"/>
         </w:rPr>
@@ -5708,6 +6000,7 @@
             <w:docPart w:val="1FF1D68686A5FC438FF06500EE1D99D5"/>
           </w:placeholder>
         </w:sdtPr>
+        <w:sdtEndPr/>
         <w:sdtContent>
           <w:r>
             <w:rPr>
@@ -5742,7 +6035,6 @@
           <w:szCs w:val="20"/>
           <w:lang w:val="es-US"/>
         </w:rPr>
-        <w:lastRenderedPageBreak/>
         <w:t>La Figura 4 destaca cómo se distribuye</w:t>
       </w:r>
       <w:r>
@@ -6417,6 +6709,7 @@
           <w:szCs w:val="20"/>
           <w:lang w:val="es-US"/>
         </w:rPr>
+        <w:lastRenderedPageBreak/>
         <w:t>Prompts</w:t>
       </w:r>
       <w:proofErr w:type="spellEnd"/>
@@ -6684,6 +6977,7 @@
           <w:docPart w:val="DefaultPlaceholder_-1854013440"/>
         </w:placeholder>
       </w:sdtPr>
+      <w:sdtEndPr/>
       <w:sdtContent>
         <w:p>
           <w:pPr>
@@ -6698,6 +6992,7 @@
               <w:lang w:val="en-US"/>
             </w:rPr>
           </w:pPr>
+          <w:proofErr w:type="spellStart"/>
           <w:r>
             <w:rPr>
               <w:rFonts w:eastAsia="Times New Roman" w:cs="Times New Roman"/>
@@ -6705,7 +7000,17 @@
               <w:szCs w:val="20"/>
               <w:lang w:val="en-US"/>
             </w:rPr>
-            <w:t xml:space="preserve">Duman, A. (2023). The Gendered Relationship Between Temporary, Informal Employment and Wages: Evidence from the Turkish Labor Market. </w:t>
+            <w:t>Duman</w:t>
+          </w:r>
+          <w:proofErr w:type="spellEnd"/>
+          <w:r>
+            <w:rPr>
+              <w:rFonts w:eastAsia="Times New Roman" w:cs="Times New Roman"/>
+              <w:color w:val="000000"/>
+              <w:szCs w:val="20"/>
+              <w:lang w:val="en-US"/>
+            </w:rPr>
+            <w:t xml:space="preserve">, A. (2023). The Gendered Relationship Between Temporary, Informal Employment and Wages: Evidence from the Turkish Labor Market. </w:t>
           </w:r>
           <w:r>
             <w:rPr>
@@ -6761,6 +7066,7 @@
               <w:lang w:val="en-US"/>
             </w:rPr>
           </w:pPr>
+          <w:proofErr w:type="spellStart"/>
           <w:r>
             <w:rPr>
               <w:rFonts w:eastAsia="Times New Roman" w:cs="Times New Roman"/>
@@ -6768,7 +7074,17 @@
               <w:szCs w:val="20"/>
               <w:lang w:val="en-US"/>
             </w:rPr>
-            <w:t xml:space="preserve">Hassine, A., </w:t>
+            <w:t>Hassine</w:t>
+          </w:r>
+          <w:proofErr w:type="spellEnd"/>
+          <w:r>
+            <w:rPr>
+              <w:rFonts w:eastAsia="Times New Roman" w:cs="Times New Roman"/>
+              <w:color w:val="000000"/>
+              <w:szCs w:val="20"/>
+              <w:lang w:val="en-US"/>
+            </w:rPr>
+            <w:t xml:space="preserve">, A., </w:t>
           </w:r>
           <w:proofErr w:type="spellStart"/>
           <w:r>
@@ -6892,6 +7208,7 @@
             </w:rPr>
             <w:t xml:space="preserve"> in the world economy. </w:t>
           </w:r>
+          <w:proofErr w:type="spellStart"/>
           <w:r>
             <w:rPr>
               <w:rFonts w:eastAsia="Times New Roman" w:cs="Times New Roman"/>
@@ -6900,7 +7217,18 @@
               <w:color w:val="000000"/>
               <w:szCs w:val="20"/>
             </w:rPr>
-            <w:t xml:space="preserve">Nature </w:t>
+            <w:t>Nature</w:t>
+          </w:r>
+          <w:proofErr w:type="spellEnd"/>
+          <w:r>
+            <w:rPr>
+              <w:rFonts w:eastAsia="Times New Roman" w:cs="Times New Roman"/>
+              <w:i/>
+              <w:iCs/>
+              <w:color w:val="000000"/>
+              <w:szCs w:val="20"/>
+            </w:rPr>
+            <w:t xml:space="preserve"> </w:t>
           </w:r>
           <w:proofErr w:type="spellStart"/>
           <w:r>
@@ -6992,13 +7320,23 @@
               <w:szCs w:val="20"/>
             </w:rPr>
           </w:pPr>
+          <w:proofErr w:type="spellStart"/>
           <w:r>
             <w:rPr>
               <w:rFonts w:eastAsia="Times New Roman" w:cs="Times New Roman"/>
               <w:color w:val="000000"/>
               <w:szCs w:val="20"/>
             </w:rPr>
-            <w:t xml:space="preserve">Maurizio, R., y Monsalvo, A. P. (2021). </w:t>
+            <w:t>Maurizio</w:t>
+          </w:r>
+          <w:proofErr w:type="spellEnd"/>
+          <w:r>
+            <w:rPr>
+              <w:rFonts w:eastAsia="Times New Roman" w:cs="Times New Roman"/>
+              <w:color w:val="000000"/>
+              <w:szCs w:val="20"/>
+            </w:rPr>
+            <w:t xml:space="preserve">, R., y Monsalvo, A. P. (2021). </w:t>
           </w:r>
           <w:r>
             <w:rPr>
@@ -7060,7 +7398,25 @@
               <w:color w:val="000000"/>
               <w:szCs w:val="20"/>
             </w:rPr>
-            <w:t xml:space="preserve"> Nations. https://doi.org/10.35188/UNU-WIDER/2021/953-2</w:t>
+            <w:t xml:space="preserve"> </w:t>
+          </w:r>
+          <w:proofErr w:type="spellStart"/>
+          <w:r>
+            <w:rPr>
+              <w:rFonts w:eastAsia="Times New Roman" w:cs="Times New Roman"/>
+              <w:color w:val="000000"/>
+              <w:szCs w:val="20"/>
+            </w:rPr>
+            <w:t>Nations</w:t>
+          </w:r>
+          <w:proofErr w:type="spellEnd"/>
+          <w:r>
+            <w:rPr>
+              <w:rFonts w:eastAsia="Times New Roman" w:cs="Times New Roman"/>
+              <w:color w:val="000000"/>
+              <w:szCs w:val="20"/>
+            </w:rPr>
+            <w:t>. https://doi.org/10.35188/UNU-WIDER/2021/953-2</w:t>
           </w:r>
         </w:p>
         <w:p>
@@ -7576,6 +7932,9 @@
         <w:jc w:val="center"/>
       </w:pPr>
       <w:r>
+        <w:rPr>
+          <w:noProof/>
+        </w:rPr>
         <w:drawing>
           <wp:inline distT="0" distB="0" distL="0" distR="0" wp14:anchorId="17F7DD67" wp14:editId="7982DED2">
             <wp:extent cx="3574110" cy="2395008"/>
@@ -7718,6 +8077,9 @@
         <w:jc w:val="center"/>
       </w:pPr>
       <w:r>
+        <w:rPr>
+          <w:noProof/>
+        </w:rPr>
         <w:drawing>
           <wp:inline distT="0" distB="0" distL="0" distR="0" wp14:anchorId="7EDD14C5" wp14:editId="46DF90B4">
             <wp:extent cx="3590676" cy="2406109"/>
@@ -7851,6 +8213,9 @@
         <w:jc w:val="center"/>
       </w:pPr>
       <w:r>
+        <w:rPr>
+          <w:noProof/>
+        </w:rPr>
         <w:drawing>
           <wp:inline distT="0" distB="0" distL="0" distR="0" wp14:anchorId="535D27BB" wp14:editId="078A7255">
             <wp:extent cx="3528974" cy="2305879"/>
@@ -8003,6 +8368,9 @@
         <w:jc w:val="center"/>
       </w:pPr>
       <w:r>
+        <w:rPr>
+          <w:noProof/>
+        </w:rPr>
         <w:drawing>
           <wp:inline distT="0" distB="0" distL="0" distR="0" wp14:anchorId="4CFEA60E" wp14:editId="1FF6DFBD">
             <wp:extent cx="3601986" cy="2353586"/>
@@ -8242,6 +8610,9 @@
         <w:jc w:val="center"/>
       </w:pPr>
       <w:r>
+        <w:rPr>
+          <w:noProof/>
+        </w:rPr>
         <w:drawing>
           <wp:inline distT="0" distB="0" distL="0" distR="0" wp14:anchorId="582FBA85" wp14:editId="42FCC94D">
             <wp:extent cx="3585320" cy="2354580"/>
@@ -8366,6 +8737,9 @@
         <w:jc w:val="center"/>
       </w:pPr>
       <w:r>
+        <w:rPr>
+          <w:noProof/>
+        </w:rPr>
         <w:drawing>
           <wp:inline distT="0" distB="0" distL="0" distR="0" wp14:anchorId="36198D4A" wp14:editId="391BE018">
             <wp:extent cx="3606579" cy="2356587"/>
@@ -8425,6 +8799,9 @@
         <w:fldChar w:fldCharType="separate"/>
       </w:r>
       <w:r>
+        <w:rPr>
+          <w:noProof/>
+        </w:rPr>
         <w:t>10</w:t>
       </w:r>
       <w:r>
@@ -8491,6 +8868,9 @@
         <w:jc w:val="center"/>
       </w:pPr>
       <w:r>
+        <w:rPr>
+          <w:noProof/>
+        </w:rPr>
         <w:drawing>
           <wp:inline distT="0" distB="0" distL="0" distR="0" wp14:anchorId="49DCF01B" wp14:editId="0BA2C0F9">
             <wp:extent cx="3590175" cy="2369488"/>
@@ -8830,7 +9210,25 @@
           <w:szCs w:val="20"/>
           <w:lang w:val="es-US"/>
         </w:rPr>
-        <w:t xml:space="preserve"> y respeta los siguiente niveles (1=Pareja (&lt;3) ; 2=Sin pareja (&gt;=3)), NIVEL_ED será nivel_ed2 (1=</w:t>
+        <w:t xml:space="preserve"> y respeta los siguiente niveles (1=Pareja (&lt;3</w:t>
+      </w:r>
+      <w:proofErr w:type="gramStart"/>
+      <w:r>
+        <w:rPr>
+          <w:sz w:val="20"/>
+          <w:szCs w:val="20"/>
+          <w:lang w:val="es-US"/>
+        </w:rPr>
+        <w:t>) ;</w:t>
+      </w:r>
+      <w:proofErr w:type="gramEnd"/>
+      <w:r>
+        <w:rPr>
+          <w:sz w:val="20"/>
+          <w:szCs w:val="20"/>
+          <w:lang w:val="es-US"/>
+        </w:rPr>
+        <w:t xml:space="preserve"> 2=Sin pareja (&gt;=3)), NIVEL_ED será nivel_ed2 (1=</w:t>
       </w:r>
       <w:proofErr w:type="spellStart"/>
       <w:r>
@@ -9047,7 +9445,25 @@
           <w:szCs w:val="20"/>
           <w:lang w:val="es-US"/>
         </w:rPr>
-        <w:t>gráfico: como puedes ver, tiene la leyenda en la parte superior derecha, debajo del título; los ejes son claros; no están sobrecargados. En general,</w:t>
+        <w:t xml:space="preserve">gráfico: </w:t>
+      </w:r>
+      <w:proofErr w:type="spellStart"/>
+      <w:r>
+        <w:rPr>
+          <w:sz w:val="20"/>
+          <w:szCs w:val="20"/>
+          <w:lang w:val="es-US"/>
+        </w:rPr>
+        <w:t>como</w:t>
+      </w:r>
+      <w:proofErr w:type="spellEnd"/>
+      <w:r>
+        <w:rPr>
+          <w:sz w:val="20"/>
+          <w:szCs w:val="20"/>
+          <w:lang w:val="es-US"/>
+        </w:rPr>
+        <w:t xml:space="preserve"> puedes ver, tiene la leyenda en la parte superior derecha, debajo del título; los ejes son claros; no están sobrecargados. En general,</w:t>
       </w:r>
       <w:r>
         <w:rPr>
@@ -9121,7 +9537,43 @@
           <w:szCs w:val="20"/>
           <w:lang w:val="es-US"/>
         </w:rPr>
-        <w:t>, donde se contabilice el número de NaN; mientras más proporción de NaN tenga, más oscuro debe ser el color. Recuerda</w:t>
+        <w:t xml:space="preserve">, donde se contabilice el número de </w:t>
+      </w:r>
+      <w:proofErr w:type="spellStart"/>
+      <w:r>
+        <w:rPr>
+          <w:sz w:val="20"/>
+          <w:szCs w:val="20"/>
+          <w:lang w:val="es-US"/>
+        </w:rPr>
+        <w:t>NaN</w:t>
+      </w:r>
+      <w:proofErr w:type="spellEnd"/>
+      <w:r>
+        <w:rPr>
+          <w:sz w:val="20"/>
+          <w:szCs w:val="20"/>
+          <w:lang w:val="es-US"/>
+        </w:rPr>
+        <w:t xml:space="preserve">; mientras más proporción de </w:t>
+      </w:r>
+      <w:proofErr w:type="spellStart"/>
+      <w:r>
+        <w:rPr>
+          <w:sz w:val="20"/>
+          <w:szCs w:val="20"/>
+          <w:lang w:val="es-US"/>
+        </w:rPr>
+        <w:t>NaN</w:t>
+      </w:r>
+      <w:proofErr w:type="spellEnd"/>
+      <w:r>
+        <w:rPr>
+          <w:sz w:val="20"/>
+          <w:szCs w:val="20"/>
+          <w:lang w:val="es-US"/>
+        </w:rPr>
+        <w:t xml:space="preserve"> tenga, más oscuro debe ser el color. Recuerda</w:t>
       </w:r>
       <w:r>
         <w:rPr>
@@ -9429,7 +9881,16 @@
           <w:szCs w:val="20"/>
           <w:lang w:val="es-US"/>
         </w:rPr>
-        <w:t xml:space="preserve">Deseo realizar una tabla descriptiva con todas las variables de mi base, excluyendo ( </w:t>
+        <w:t xml:space="preserve">Deseo realizar una tabla descriptiva con todas las variables de mi base, excluyendo </w:t>
+      </w:r>
+      <w:proofErr w:type="gramStart"/>
+      <w:r>
+        <w:rPr>
+          <w:sz w:val="20"/>
+          <w:szCs w:val="20"/>
+          <w:lang w:val="es-US"/>
+        </w:rPr>
+        <w:t xml:space="preserve">( </w:t>
       </w:r>
       <w:proofErr w:type="spellStart"/>
       <w:r>
@@ -9438,7 +9899,16 @@
           <w:szCs w:val="20"/>
           <w:lang w:val="es-US"/>
         </w:rPr>
-        <w:t>cod_vivienda</w:t>
+        <w:t>cod</w:t>
+      </w:r>
+      <w:proofErr w:type="gramEnd"/>
+      <w:r>
+        <w:rPr>
+          <w:sz w:val="20"/>
+          <w:szCs w:val="20"/>
+          <w:lang w:val="es-US"/>
+        </w:rPr>
+        <w:t>_vivienda</w:t>
       </w:r>
       <w:proofErr w:type="spellEnd"/>
       <w:r>
@@ -9564,7 +10034,7 @@
 </file>
 
 <file path=word/endnotes.xml><?xml version="1.0" encoding="utf-8"?>
-<w:endnotes xmlns:wpc="http://schemas.microsoft.com/office/word/2010/wordprocessingCanvas" xmlns:cx="http://schemas.microsoft.com/office/drawing/2014/chartex" xmlns:cx1="http://schemas.microsoft.com/office/drawing/2015/9/8/chartex" xmlns:cx2="http://schemas.microsoft.com/office/drawing/2015/10/21/chartex" xmlns:cx3="http://schemas.microsoft.com/office/drawing/2016/5/9/chartex" xmlns:cx4="http://schemas.microsoft.com/office/drawing/2016/5/10/chartex" xmlns:cx5="http://schemas.microsoft.com/office/drawing/2016/5/11/chartex" xmlns:cx6="http://schemas.microsoft.com/office/drawing/2016/5/12/chartex" xmlns:cx7="http://schemas.microsoft.com/office/drawing/2016/5/13/chartex" xmlns:cx8="http://schemas.microsoft.com/office/drawing/2016/5/14/chartex" xmlns:mc="http://schemas.openxmlformats.org/markup-compatibility/2006" xmlns:aink="http://schemas.microsoft.com/office/drawing/2016/ink" xmlns:am3d="http://schemas.microsoft.com/office/drawing/2017/model3d" xmlns:o="urn:schemas-microsoft-com:office:office" xmlns:oel="http://schemas.microsoft.com/office/2019/extlst" xmlns:r="http://schemas.openxmlformats.org/officeDocument/2006/relationships" xmlns:m="http://schemas.openxmlformats.org/officeDocument/2006/math" xmlns:v="urn:schemas-microsoft-com:vml" xmlns:wp14="http://schemas.microsoft.com/office/word/2010/wordprocessingDrawing" xmlns:wp="http://schemas.openxmlformats.org/drawingml/2006/wordprocessingDrawing" xmlns:w10="urn:schemas-microsoft-com:office:word" xmlns:w="http://schemas.openxmlformats.org/wordprocessingml/2006/main" xmlns:w14="http://schemas.microsoft.com/office/word/2010/wordml" xmlns:w15="http://schemas.microsoft.com/office/word/2012/wordml" xmlns:w16cex="http://schemas.microsoft.com/office/word/2018/wordml/cex" xmlns:w16cid="http://schemas.microsoft.com/office/word/2016/wordml/cid" xmlns:w16="http://schemas.microsoft.com/office/word/2018/wordml" xmlns:w16du="http://schemas.microsoft.com/office/word/2023/wordml/word16du" xmlns:w16sdtdh="http://schemas.microsoft.com/office/word/2020/wordml/sdtdatahash" xmlns:w16sdtfl="http://schemas.microsoft.com/office/word/2024/wordml/sdtformatlock" xmlns:w16se="http://schemas.microsoft.com/office/word/2015/wordml/symex" xmlns:wpg="http://schemas.microsoft.com/office/word/2010/wordprocessingGroup" xmlns:wpi="http://schemas.microsoft.com/office/word/2010/wordprocessingInk" xmlns:wne="http://schemas.microsoft.com/office/word/2006/wordml" xmlns:wps="http://schemas.microsoft.com/office/word/2010/wordprocessingShape" mc:Ignorable="w14 w15 w16se w16cid w16 w16cex w16sdtdh w16sdtfl w16du wp14">
+<w:endnotes xmlns:wpc="http://schemas.microsoft.com/office/word/2010/wordprocessingCanvas" xmlns:cx="http://schemas.microsoft.com/office/drawing/2014/chartex" xmlns:cx1="http://schemas.microsoft.com/office/drawing/2015/9/8/chartex" xmlns:cx2="http://schemas.microsoft.com/office/drawing/2015/10/21/chartex" xmlns:cx3="http://schemas.microsoft.com/office/drawing/2016/5/9/chartex" xmlns:cx4="http://schemas.microsoft.com/office/drawing/2016/5/10/chartex" xmlns:cx5="http://schemas.microsoft.com/office/drawing/2016/5/11/chartex" xmlns:cx6="http://schemas.microsoft.com/office/drawing/2016/5/12/chartex" xmlns:cx7="http://schemas.microsoft.com/office/drawing/2016/5/13/chartex" xmlns:cx8="http://schemas.microsoft.com/office/drawing/2016/5/14/chartex" xmlns:mc="http://schemas.openxmlformats.org/markup-compatibility/2006" xmlns:aink="http://schemas.microsoft.com/office/drawing/2016/ink" xmlns:am3d="http://schemas.microsoft.com/office/drawing/2017/model3d" xmlns:o="urn:schemas-microsoft-com:office:office" xmlns:r="http://schemas.openxmlformats.org/officeDocument/2006/relationships" xmlns:m="http://schemas.openxmlformats.org/officeDocument/2006/math" xmlns:v="urn:schemas-microsoft-com:vml" xmlns:wp14="http://schemas.microsoft.com/office/word/2010/wordprocessingDrawing" xmlns:wp="http://schemas.openxmlformats.org/drawingml/2006/wordprocessingDrawing" xmlns:w10="urn:schemas-microsoft-com:office:word" xmlns:w="http://schemas.openxmlformats.org/wordprocessingml/2006/main" xmlns:w14="http://schemas.microsoft.com/office/word/2010/wordml" xmlns:w15="http://schemas.microsoft.com/office/word/2012/wordml" xmlns:w16cex="http://schemas.microsoft.com/office/word/2018/wordml/cex" xmlns:w16cid="http://schemas.microsoft.com/office/word/2016/wordml/cid" xmlns:w16="http://schemas.microsoft.com/office/word/2018/wordml" xmlns:w16sdtdh="http://schemas.microsoft.com/office/word/2020/wordml/sdtdatahash" xmlns:w16se="http://schemas.microsoft.com/office/word/2015/wordml/symex" xmlns:wpg="http://schemas.microsoft.com/office/word/2010/wordprocessingGroup" xmlns:wpi="http://schemas.microsoft.com/office/word/2010/wordprocessingInk" xmlns:wne="http://schemas.microsoft.com/office/word/2006/wordml" xmlns:wps="http://schemas.microsoft.com/office/word/2010/wordprocessingShape" mc:Ignorable="w14 w15 w16se w16cid w16 w16cex w16sdtdh wp14">
   <w:endnote w:type="separator" w:id="-1">
     <w:p>
       <w:pPr>
@@ -9589,7 +10059,7 @@
 </file>
 
 <file path=word/footer1.xml><?xml version="1.0" encoding="utf-8"?>
-<w:ftr xmlns:wpc="http://schemas.microsoft.com/office/word/2010/wordprocessingCanvas" xmlns:cx="http://schemas.microsoft.com/office/drawing/2014/chartex" xmlns:cx1="http://schemas.microsoft.com/office/drawing/2015/9/8/chartex" xmlns:cx2="http://schemas.microsoft.com/office/drawing/2015/10/21/chartex" xmlns:cx3="http://schemas.microsoft.com/office/drawing/2016/5/9/chartex" xmlns:cx4="http://schemas.microsoft.com/office/drawing/2016/5/10/chartex" xmlns:cx5="http://schemas.microsoft.com/office/drawing/2016/5/11/chartex" xmlns:cx6="http://schemas.microsoft.com/office/drawing/2016/5/12/chartex" xmlns:cx7="http://schemas.microsoft.com/office/drawing/2016/5/13/chartex" xmlns:cx8="http://schemas.microsoft.com/office/drawing/2016/5/14/chartex" xmlns:mc="http://schemas.openxmlformats.org/markup-compatibility/2006" xmlns:aink="http://schemas.microsoft.com/office/drawing/2016/ink" xmlns:am3d="http://schemas.microsoft.com/office/drawing/2017/model3d" xmlns:o="urn:schemas-microsoft-com:office:office" xmlns:oel="http://schemas.microsoft.com/office/2019/extlst" xmlns:r="http://schemas.openxmlformats.org/officeDocument/2006/relationships" xmlns:m="http://schemas.openxmlformats.org/officeDocument/2006/math" xmlns:v="urn:schemas-microsoft-com:vml" xmlns:wp14="http://schemas.microsoft.com/office/word/2010/wordprocessingDrawing" xmlns:wp="http://schemas.openxmlformats.org/drawingml/2006/wordprocessingDrawing" xmlns:w10="urn:schemas-microsoft-com:office:word" xmlns:w="http://schemas.openxmlformats.org/wordprocessingml/2006/main" xmlns:w14="http://schemas.microsoft.com/office/word/2010/wordml" xmlns:w15="http://schemas.microsoft.com/office/word/2012/wordml" xmlns:w16cex="http://schemas.microsoft.com/office/word/2018/wordml/cex" xmlns:w16cid="http://schemas.microsoft.com/office/word/2016/wordml/cid" xmlns:w16="http://schemas.microsoft.com/office/word/2018/wordml" xmlns:w16du="http://schemas.microsoft.com/office/word/2023/wordml/word16du" xmlns:w16sdtdh="http://schemas.microsoft.com/office/word/2020/wordml/sdtdatahash" xmlns:w16sdtfl="http://schemas.microsoft.com/office/word/2024/wordml/sdtformatlock" xmlns:w16se="http://schemas.microsoft.com/office/word/2015/wordml/symex" xmlns:wpg="http://schemas.microsoft.com/office/word/2010/wordprocessingGroup" xmlns:wpi="http://schemas.microsoft.com/office/word/2010/wordprocessingInk" xmlns:wne="http://schemas.microsoft.com/office/word/2006/wordml" xmlns:wps="http://schemas.microsoft.com/office/word/2010/wordprocessingShape" mc:Ignorable="w14 w15 w16se w16cid w16 w16cex w16sdtdh w16sdtfl w16du wp14">
+<w:ftr xmlns:wpc="http://schemas.microsoft.com/office/word/2010/wordprocessingCanvas" xmlns:cx="http://schemas.microsoft.com/office/drawing/2014/chartex" xmlns:cx1="http://schemas.microsoft.com/office/drawing/2015/9/8/chartex" xmlns:cx2="http://schemas.microsoft.com/office/drawing/2015/10/21/chartex" xmlns:cx3="http://schemas.microsoft.com/office/drawing/2016/5/9/chartex" xmlns:cx4="http://schemas.microsoft.com/office/drawing/2016/5/10/chartex" xmlns:cx5="http://schemas.microsoft.com/office/drawing/2016/5/11/chartex" xmlns:cx6="http://schemas.microsoft.com/office/drawing/2016/5/12/chartex" xmlns:cx7="http://schemas.microsoft.com/office/drawing/2016/5/13/chartex" xmlns:cx8="http://schemas.microsoft.com/office/drawing/2016/5/14/chartex" xmlns:mc="http://schemas.openxmlformats.org/markup-compatibility/2006" xmlns:aink="http://schemas.microsoft.com/office/drawing/2016/ink" xmlns:am3d="http://schemas.microsoft.com/office/drawing/2017/model3d" xmlns:o="urn:schemas-microsoft-com:office:office" xmlns:r="http://schemas.openxmlformats.org/officeDocument/2006/relationships" xmlns:m="http://schemas.openxmlformats.org/officeDocument/2006/math" xmlns:v="urn:schemas-microsoft-com:vml" xmlns:wp14="http://schemas.microsoft.com/office/word/2010/wordprocessingDrawing" xmlns:wp="http://schemas.openxmlformats.org/drawingml/2006/wordprocessingDrawing" xmlns:w10="urn:schemas-microsoft-com:office:word" xmlns:w="http://schemas.openxmlformats.org/wordprocessingml/2006/main" xmlns:w14="http://schemas.microsoft.com/office/word/2010/wordml" xmlns:w15="http://schemas.microsoft.com/office/word/2012/wordml" xmlns:w16cex="http://schemas.microsoft.com/office/word/2018/wordml/cex" xmlns:w16cid="http://schemas.microsoft.com/office/word/2016/wordml/cid" xmlns:w16="http://schemas.microsoft.com/office/word/2018/wordml" xmlns:w16sdtdh="http://schemas.microsoft.com/office/word/2020/wordml/sdtdatahash" xmlns:w16se="http://schemas.microsoft.com/office/word/2015/wordml/symex" xmlns:wpg="http://schemas.microsoft.com/office/word/2010/wordprocessingGroup" xmlns:wpi="http://schemas.microsoft.com/office/word/2010/wordprocessingInk" xmlns:wne="http://schemas.microsoft.com/office/word/2006/wordml" xmlns:wps="http://schemas.microsoft.com/office/word/2010/wordprocessingShape" mc:Ignorable="w14 w15 w16se w16cid w16 w16cex w16sdtdh wp14">
   <w:sdt>
     <w:sdtPr>
       <w:rPr>
@@ -9601,6 +10071,11 @@
         <w:docPartUnique/>
       </w:docPartObj>
     </w:sdtPr>
+    <w:sdtEndPr>
+      <w:rPr>
+        <w:rStyle w:val="Nmerodepgina"/>
+      </w:rPr>
+    </w:sdtEndPr>
     <w:sdtContent>
       <w:p>
         <w:pPr>
@@ -9646,7 +10121,7 @@
 </file>
 
 <file path=word/footer2.xml><?xml version="1.0" encoding="utf-8"?>
-<w:ftr xmlns:wpc="http://schemas.microsoft.com/office/word/2010/wordprocessingCanvas" xmlns:cx="http://schemas.microsoft.com/office/drawing/2014/chartex" xmlns:cx1="http://schemas.microsoft.com/office/drawing/2015/9/8/chartex" xmlns:cx2="http://schemas.microsoft.com/office/drawing/2015/10/21/chartex" xmlns:cx3="http://schemas.microsoft.com/office/drawing/2016/5/9/chartex" xmlns:cx4="http://schemas.microsoft.com/office/drawing/2016/5/10/chartex" xmlns:cx5="http://schemas.microsoft.com/office/drawing/2016/5/11/chartex" xmlns:cx6="http://schemas.microsoft.com/office/drawing/2016/5/12/chartex" xmlns:cx7="http://schemas.microsoft.com/office/drawing/2016/5/13/chartex" xmlns:cx8="http://schemas.microsoft.com/office/drawing/2016/5/14/chartex" xmlns:mc="http://schemas.openxmlformats.org/markup-compatibility/2006" xmlns:aink="http://schemas.microsoft.com/office/drawing/2016/ink" xmlns:am3d="http://schemas.microsoft.com/office/drawing/2017/model3d" xmlns:o="urn:schemas-microsoft-com:office:office" xmlns:oel="http://schemas.microsoft.com/office/2019/extlst" xmlns:r="http://schemas.openxmlformats.org/officeDocument/2006/relationships" xmlns:m="http://schemas.openxmlformats.org/officeDocument/2006/math" xmlns:v="urn:schemas-microsoft-com:vml" xmlns:wp14="http://schemas.microsoft.com/office/word/2010/wordprocessingDrawing" xmlns:wp="http://schemas.openxmlformats.org/drawingml/2006/wordprocessingDrawing" xmlns:w10="urn:schemas-microsoft-com:office:word" xmlns:w="http://schemas.openxmlformats.org/wordprocessingml/2006/main" xmlns:w14="http://schemas.microsoft.com/office/word/2010/wordml" xmlns:w15="http://schemas.microsoft.com/office/word/2012/wordml" xmlns:w16cex="http://schemas.microsoft.com/office/word/2018/wordml/cex" xmlns:w16cid="http://schemas.microsoft.com/office/word/2016/wordml/cid" xmlns:w16="http://schemas.microsoft.com/office/word/2018/wordml" xmlns:w16du="http://schemas.microsoft.com/office/word/2023/wordml/word16du" xmlns:w16sdtdh="http://schemas.microsoft.com/office/word/2020/wordml/sdtdatahash" xmlns:w16sdtfl="http://schemas.microsoft.com/office/word/2024/wordml/sdtformatlock" xmlns:w16se="http://schemas.microsoft.com/office/word/2015/wordml/symex" xmlns:wpg="http://schemas.microsoft.com/office/word/2010/wordprocessingGroup" xmlns:wpi="http://schemas.microsoft.com/office/word/2010/wordprocessingInk" xmlns:wne="http://schemas.microsoft.com/office/word/2006/wordml" xmlns:wps="http://schemas.microsoft.com/office/word/2010/wordprocessingShape" mc:Ignorable="w14 w15 w16se w16cid w16 w16cex w16sdtdh w16sdtfl w16du wp14">
+<w:ftr xmlns:wpc="http://schemas.microsoft.com/office/word/2010/wordprocessingCanvas" xmlns:cx="http://schemas.microsoft.com/office/drawing/2014/chartex" xmlns:cx1="http://schemas.microsoft.com/office/drawing/2015/9/8/chartex" xmlns:cx2="http://schemas.microsoft.com/office/drawing/2015/10/21/chartex" xmlns:cx3="http://schemas.microsoft.com/office/drawing/2016/5/9/chartex" xmlns:cx4="http://schemas.microsoft.com/office/drawing/2016/5/10/chartex" xmlns:cx5="http://schemas.microsoft.com/office/drawing/2016/5/11/chartex" xmlns:cx6="http://schemas.microsoft.com/office/drawing/2016/5/12/chartex" xmlns:cx7="http://schemas.microsoft.com/office/drawing/2016/5/13/chartex" xmlns:cx8="http://schemas.microsoft.com/office/drawing/2016/5/14/chartex" xmlns:mc="http://schemas.openxmlformats.org/markup-compatibility/2006" xmlns:aink="http://schemas.microsoft.com/office/drawing/2016/ink" xmlns:am3d="http://schemas.microsoft.com/office/drawing/2017/model3d" xmlns:o="urn:schemas-microsoft-com:office:office" xmlns:r="http://schemas.openxmlformats.org/officeDocument/2006/relationships" xmlns:m="http://schemas.openxmlformats.org/officeDocument/2006/math" xmlns:v="urn:schemas-microsoft-com:vml" xmlns:wp14="http://schemas.microsoft.com/office/word/2010/wordprocessingDrawing" xmlns:wp="http://schemas.openxmlformats.org/drawingml/2006/wordprocessingDrawing" xmlns:w10="urn:schemas-microsoft-com:office:word" xmlns:w="http://schemas.openxmlformats.org/wordprocessingml/2006/main" xmlns:w14="http://schemas.microsoft.com/office/word/2010/wordml" xmlns:w15="http://schemas.microsoft.com/office/word/2012/wordml" xmlns:w16cex="http://schemas.microsoft.com/office/word/2018/wordml/cex" xmlns:w16cid="http://schemas.microsoft.com/office/word/2016/wordml/cid" xmlns:w16="http://schemas.microsoft.com/office/word/2018/wordml" xmlns:w16sdtdh="http://schemas.microsoft.com/office/word/2020/wordml/sdtdatahash" xmlns:w16se="http://schemas.microsoft.com/office/word/2015/wordml/symex" xmlns:wpg="http://schemas.microsoft.com/office/word/2010/wordprocessingGroup" xmlns:wpi="http://schemas.microsoft.com/office/word/2010/wordprocessingInk" xmlns:wne="http://schemas.microsoft.com/office/word/2006/wordml" xmlns:wps="http://schemas.microsoft.com/office/word/2010/wordprocessingShape" mc:Ignorable="w14 w15 w16se w16cid w16 w16cex w16sdtdh wp14">
   <w:p>
     <w:pPr>
       <w:pStyle w:val="Piedepgina"/>
@@ -9665,7 +10140,7 @@
 </file>
 
 <file path=word/footer3.xml><?xml version="1.0" encoding="utf-8"?>
-<w:ftr xmlns:wpc="http://schemas.microsoft.com/office/word/2010/wordprocessingCanvas" xmlns:cx="http://schemas.microsoft.com/office/drawing/2014/chartex" xmlns:cx1="http://schemas.microsoft.com/office/drawing/2015/9/8/chartex" xmlns:cx2="http://schemas.microsoft.com/office/drawing/2015/10/21/chartex" xmlns:cx3="http://schemas.microsoft.com/office/drawing/2016/5/9/chartex" xmlns:cx4="http://schemas.microsoft.com/office/drawing/2016/5/10/chartex" xmlns:cx5="http://schemas.microsoft.com/office/drawing/2016/5/11/chartex" xmlns:cx6="http://schemas.microsoft.com/office/drawing/2016/5/12/chartex" xmlns:cx7="http://schemas.microsoft.com/office/drawing/2016/5/13/chartex" xmlns:cx8="http://schemas.microsoft.com/office/drawing/2016/5/14/chartex" xmlns:mc="http://schemas.openxmlformats.org/markup-compatibility/2006" xmlns:aink="http://schemas.microsoft.com/office/drawing/2016/ink" xmlns:am3d="http://schemas.microsoft.com/office/drawing/2017/model3d" xmlns:o="urn:schemas-microsoft-com:office:office" xmlns:oel="http://schemas.microsoft.com/office/2019/extlst" xmlns:r="http://schemas.openxmlformats.org/officeDocument/2006/relationships" xmlns:m="http://schemas.openxmlformats.org/officeDocument/2006/math" xmlns:v="urn:schemas-microsoft-com:vml" xmlns:wp14="http://schemas.microsoft.com/office/word/2010/wordprocessingDrawing" xmlns:wp="http://schemas.openxmlformats.org/drawingml/2006/wordprocessingDrawing" xmlns:w10="urn:schemas-microsoft-com:office:word" xmlns:w="http://schemas.openxmlformats.org/wordprocessingml/2006/main" xmlns:w14="http://schemas.microsoft.com/office/word/2010/wordml" xmlns:w15="http://schemas.microsoft.com/office/word/2012/wordml" xmlns:w16cex="http://schemas.microsoft.com/office/word/2018/wordml/cex" xmlns:w16cid="http://schemas.microsoft.com/office/word/2016/wordml/cid" xmlns:w16="http://schemas.microsoft.com/office/word/2018/wordml" xmlns:w16du="http://schemas.microsoft.com/office/word/2023/wordml/word16du" xmlns:w16sdtdh="http://schemas.microsoft.com/office/word/2020/wordml/sdtdatahash" xmlns:w16sdtfl="http://schemas.microsoft.com/office/word/2024/wordml/sdtformatlock" xmlns:w16se="http://schemas.microsoft.com/office/word/2015/wordml/symex" xmlns:wpg="http://schemas.microsoft.com/office/word/2010/wordprocessingGroup" xmlns:wpi="http://schemas.microsoft.com/office/word/2010/wordprocessingInk" xmlns:wne="http://schemas.microsoft.com/office/word/2006/wordml" xmlns:wps="http://schemas.microsoft.com/office/word/2010/wordprocessingShape" mc:Ignorable="w14 w15 w16se w16cid w16 w16cex w16sdtdh w16sdtfl w16du wp14">
+<w:ftr xmlns:wpc="http://schemas.microsoft.com/office/word/2010/wordprocessingCanvas" xmlns:cx="http://schemas.microsoft.com/office/drawing/2014/chartex" xmlns:cx1="http://schemas.microsoft.com/office/drawing/2015/9/8/chartex" xmlns:cx2="http://schemas.microsoft.com/office/drawing/2015/10/21/chartex" xmlns:cx3="http://schemas.microsoft.com/office/drawing/2016/5/9/chartex" xmlns:cx4="http://schemas.microsoft.com/office/drawing/2016/5/10/chartex" xmlns:cx5="http://schemas.microsoft.com/office/drawing/2016/5/11/chartex" xmlns:cx6="http://schemas.microsoft.com/office/drawing/2016/5/12/chartex" xmlns:cx7="http://schemas.microsoft.com/office/drawing/2016/5/13/chartex" xmlns:cx8="http://schemas.microsoft.com/office/drawing/2016/5/14/chartex" xmlns:mc="http://schemas.openxmlformats.org/markup-compatibility/2006" xmlns:aink="http://schemas.microsoft.com/office/drawing/2016/ink" xmlns:am3d="http://schemas.microsoft.com/office/drawing/2017/model3d" xmlns:o="urn:schemas-microsoft-com:office:office" xmlns:r="http://schemas.openxmlformats.org/officeDocument/2006/relationships" xmlns:m="http://schemas.openxmlformats.org/officeDocument/2006/math" xmlns:v="urn:schemas-microsoft-com:vml" xmlns:wp14="http://schemas.microsoft.com/office/word/2010/wordprocessingDrawing" xmlns:wp="http://schemas.openxmlformats.org/drawingml/2006/wordprocessingDrawing" xmlns:w10="urn:schemas-microsoft-com:office:word" xmlns:w="http://schemas.openxmlformats.org/wordprocessingml/2006/main" xmlns:w14="http://schemas.microsoft.com/office/word/2010/wordml" xmlns:w15="http://schemas.microsoft.com/office/word/2012/wordml" xmlns:w16cex="http://schemas.microsoft.com/office/word/2018/wordml/cex" xmlns:w16cid="http://schemas.microsoft.com/office/word/2016/wordml/cid" xmlns:w16="http://schemas.microsoft.com/office/word/2018/wordml" xmlns:w16sdtdh="http://schemas.microsoft.com/office/word/2020/wordml/sdtdatahash" xmlns:w16se="http://schemas.microsoft.com/office/word/2015/wordml/symex" xmlns:wpg="http://schemas.microsoft.com/office/word/2010/wordprocessingGroup" xmlns:wpi="http://schemas.microsoft.com/office/word/2010/wordprocessingInk" xmlns:wne="http://schemas.microsoft.com/office/word/2006/wordml" xmlns:wps="http://schemas.microsoft.com/office/word/2010/wordprocessingShape" mc:Ignorable="w14 w15 w16se w16cid w16 w16cex w16sdtdh wp14">
   <w:sdt>
     <w:sdtPr>
       <w:rPr>
@@ -9677,6 +10152,11 @@
         <w:docPartUnique/>
       </w:docPartObj>
     </w:sdtPr>
+    <w:sdtEndPr>
+      <w:rPr>
+        <w:rStyle w:val="Nmerodepgina"/>
+      </w:rPr>
+    </w:sdtEndPr>
     <w:sdtContent>
       <w:p>
         <w:pPr>
@@ -9729,7 +10209,7 @@
 </file>
 
 <file path=word/footnotes.xml><?xml version="1.0" encoding="utf-8"?>
-<w:footnotes xmlns:wpc="http://schemas.microsoft.com/office/word/2010/wordprocessingCanvas" xmlns:cx="http://schemas.microsoft.com/office/drawing/2014/chartex" xmlns:cx1="http://schemas.microsoft.com/office/drawing/2015/9/8/chartex" xmlns:cx2="http://schemas.microsoft.com/office/drawing/2015/10/21/chartex" xmlns:cx3="http://schemas.microsoft.com/office/drawing/2016/5/9/chartex" xmlns:cx4="http://schemas.microsoft.com/office/drawing/2016/5/10/chartex" xmlns:cx5="http://schemas.microsoft.com/office/drawing/2016/5/11/chartex" xmlns:cx6="http://schemas.microsoft.com/office/drawing/2016/5/12/chartex" xmlns:cx7="http://schemas.microsoft.com/office/drawing/2016/5/13/chartex" xmlns:cx8="http://schemas.microsoft.com/office/drawing/2016/5/14/chartex" xmlns:mc="http://schemas.openxmlformats.org/markup-compatibility/2006" xmlns:aink="http://schemas.microsoft.com/office/drawing/2016/ink" xmlns:am3d="http://schemas.microsoft.com/office/drawing/2017/model3d" xmlns:o="urn:schemas-microsoft-com:office:office" xmlns:oel="http://schemas.microsoft.com/office/2019/extlst" xmlns:r="http://schemas.openxmlformats.org/officeDocument/2006/relationships" xmlns:m="http://schemas.openxmlformats.org/officeDocument/2006/math" xmlns:v="urn:schemas-microsoft-com:vml" xmlns:wp14="http://schemas.microsoft.com/office/word/2010/wordprocessingDrawing" xmlns:wp="http://schemas.openxmlformats.org/drawingml/2006/wordprocessingDrawing" xmlns:w10="urn:schemas-microsoft-com:office:word" xmlns:w="http://schemas.openxmlformats.org/wordprocessingml/2006/main" xmlns:w14="http://schemas.microsoft.com/office/word/2010/wordml" xmlns:w15="http://schemas.microsoft.com/office/word/2012/wordml" xmlns:w16cex="http://schemas.microsoft.com/office/word/2018/wordml/cex" xmlns:w16cid="http://schemas.microsoft.com/office/word/2016/wordml/cid" xmlns:w16="http://schemas.microsoft.com/office/word/2018/wordml" xmlns:w16du="http://schemas.microsoft.com/office/word/2023/wordml/word16du" xmlns:w16sdtdh="http://schemas.microsoft.com/office/word/2020/wordml/sdtdatahash" xmlns:w16sdtfl="http://schemas.microsoft.com/office/word/2024/wordml/sdtformatlock" xmlns:w16se="http://schemas.microsoft.com/office/word/2015/wordml/symex" xmlns:wpg="http://schemas.microsoft.com/office/word/2010/wordprocessingGroup" xmlns:wpi="http://schemas.microsoft.com/office/word/2010/wordprocessingInk" xmlns:wne="http://schemas.microsoft.com/office/word/2006/wordml" xmlns:wps="http://schemas.microsoft.com/office/word/2010/wordprocessingShape" mc:Ignorable="w14 w15 w16se w16cid w16 w16cex w16sdtdh w16sdtfl w16du wp14">
+<w:footnotes xmlns:wpc="http://schemas.microsoft.com/office/word/2010/wordprocessingCanvas" xmlns:cx="http://schemas.microsoft.com/office/drawing/2014/chartex" xmlns:cx1="http://schemas.microsoft.com/office/drawing/2015/9/8/chartex" xmlns:cx2="http://schemas.microsoft.com/office/drawing/2015/10/21/chartex" xmlns:cx3="http://schemas.microsoft.com/office/drawing/2016/5/9/chartex" xmlns:cx4="http://schemas.microsoft.com/office/drawing/2016/5/10/chartex" xmlns:cx5="http://schemas.microsoft.com/office/drawing/2016/5/11/chartex" xmlns:cx6="http://schemas.microsoft.com/office/drawing/2016/5/12/chartex" xmlns:cx7="http://schemas.microsoft.com/office/drawing/2016/5/13/chartex" xmlns:cx8="http://schemas.microsoft.com/office/drawing/2016/5/14/chartex" xmlns:mc="http://schemas.openxmlformats.org/markup-compatibility/2006" xmlns:aink="http://schemas.microsoft.com/office/drawing/2016/ink" xmlns:am3d="http://schemas.microsoft.com/office/drawing/2017/model3d" xmlns:o="urn:schemas-microsoft-com:office:office" xmlns:r="http://schemas.openxmlformats.org/officeDocument/2006/relationships" xmlns:m="http://schemas.openxmlformats.org/officeDocument/2006/math" xmlns:v="urn:schemas-microsoft-com:vml" xmlns:wp14="http://schemas.microsoft.com/office/word/2010/wordprocessingDrawing" xmlns:wp="http://schemas.openxmlformats.org/drawingml/2006/wordprocessingDrawing" xmlns:w10="urn:schemas-microsoft-com:office:word" xmlns:w="http://schemas.openxmlformats.org/wordprocessingml/2006/main" xmlns:w14="http://schemas.microsoft.com/office/word/2010/wordml" xmlns:w15="http://schemas.microsoft.com/office/word/2012/wordml" xmlns:w16cex="http://schemas.microsoft.com/office/word/2018/wordml/cex" xmlns:w16cid="http://schemas.microsoft.com/office/word/2016/wordml/cid" xmlns:w16="http://schemas.microsoft.com/office/word/2018/wordml" xmlns:w16sdtdh="http://schemas.microsoft.com/office/word/2020/wordml/sdtdatahash" xmlns:w16se="http://schemas.microsoft.com/office/word/2015/wordml/symex" xmlns:wpg="http://schemas.microsoft.com/office/word/2010/wordprocessingGroup" xmlns:wpi="http://schemas.microsoft.com/office/word/2010/wordprocessingInk" xmlns:wne="http://schemas.microsoft.com/office/word/2006/wordml" xmlns:wps="http://schemas.microsoft.com/office/word/2010/wordprocessingShape" mc:Ignorable="w14 w15 w16se w16cid w16 w16cex w16sdtdh wp14">
   <w:footnote w:type="separator" w:id="-1">
     <w:p>
       <w:pPr>
@@ -9788,7 +10268,7 @@
 </file>
 
 <file path=word/numbering.xml><?xml version="1.0" encoding="utf-8"?>
-<w:numbering xmlns:wpc="http://schemas.microsoft.com/office/word/2010/wordprocessingCanvas" xmlns:cx="http://schemas.microsoft.com/office/drawing/2014/chartex" xmlns:cx1="http://schemas.microsoft.com/office/drawing/2015/9/8/chartex" xmlns:cx2="http://schemas.microsoft.com/office/drawing/2015/10/21/chartex" xmlns:cx3="http://schemas.microsoft.com/office/drawing/2016/5/9/chartex" xmlns:cx4="http://schemas.microsoft.com/office/drawing/2016/5/10/chartex" xmlns:cx5="http://schemas.microsoft.com/office/drawing/2016/5/11/chartex" xmlns:cx6="http://schemas.microsoft.com/office/drawing/2016/5/12/chartex" xmlns:cx7="http://schemas.microsoft.com/office/drawing/2016/5/13/chartex" xmlns:cx8="http://schemas.microsoft.com/office/drawing/2016/5/14/chartex" xmlns:mc="http://schemas.openxmlformats.org/markup-compatibility/2006" xmlns:aink="http://schemas.microsoft.com/office/drawing/2016/ink" xmlns:am3d="http://schemas.microsoft.com/office/drawing/2017/model3d" xmlns:o="urn:schemas-microsoft-com:office:office" xmlns:oel="http://schemas.microsoft.com/office/2019/extlst" xmlns:r="http://schemas.openxmlformats.org/officeDocument/2006/relationships" xmlns:m="http://schemas.openxmlformats.org/officeDocument/2006/math" xmlns:v="urn:schemas-microsoft-com:vml" xmlns:wp14="http://schemas.microsoft.com/office/word/2010/wordprocessingDrawing" xmlns:wp="http://schemas.openxmlformats.org/drawingml/2006/wordprocessingDrawing" xmlns:w10="urn:schemas-microsoft-com:office:word" xmlns:w="http://schemas.openxmlformats.org/wordprocessingml/2006/main" xmlns:w14="http://schemas.microsoft.com/office/word/2010/wordml" xmlns:w15="http://schemas.microsoft.com/office/word/2012/wordml" xmlns:w16cex="http://schemas.microsoft.com/office/word/2018/wordml/cex" xmlns:w16cid="http://schemas.microsoft.com/office/word/2016/wordml/cid" xmlns:w16="http://schemas.microsoft.com/office/word/2018/wordml" xmlns:w16du="http://schemas.microsoft.com/office/word/2023/wordml/word16du" xmlns:w16sdtdh="http://schemas.microsoft.com/office/word/2020/wordml/sdtdatahash" xmlns:w16sdtfl="http://schemas.microsoft.com/office/word/2024/wordml/sdtformatlock" xmlns:w16se="http://schemas.microsoft.com/office/word/2015/wordml/symex" xmlns:wpg="http://schemas.microsoft.com/office/word/2010/wordprocessingGroup" xmlns:wpi="http://schemas.microsoft.com/office/word/2010/wordprocessingInk" xmlns:wne="http://schemas.microsoft.com/office/word/2006/wordml" xmlns:wps="http://schemas.microsoft.com/office/word/2010/wordprocessingShape" mc:Ignorable="w14 w15 w16se w16cid w16 w16cex w16sdtdh w16sdtfl w16du wp14">
+<w:numbering xmlns:wpc="http://schemas.microsoft.com/office/word/2010/wordprocessingCanvas" xmlns:cx="http://schemas.microsoft.com/office/drawing/2014/chartex" xmlns:cx1="http://schemas.microsoft.com/office/drawing/2015/9/8/chartex" xmlns:cx2="http://schemas.microsoft.com/office/drawing/2015/10/21/chartex" xmlns:cx3="http://schemas.microsoft.com/office/drawing/2016/5/9/chartex" xmlns:cx4="http://schemas.microsoft.com/office/drawing/2016/5/10/chartex" xmlns:cx5="http://schemas.microsoft.com/office/drawing/2016/5/11/chartex" xmlns:cx6="http://schemas.microsoft.com/office/drawing/2016/5/12/chartex" xmlns:cx7="http://schemas.microsoft.com/office/drawing/2016/5/13/chartex" xmlns:cx8="http://schemas.microsoft.com/office/drawing/2016/5/14/chartex" xmlns:mc="http://schemas.openxmlformats.org/markup-compatibility/2006" xmlns:aink="http://schemas.microsoft.com/office/drawing/2016/ink" xmlns:am3d="http://schemas.microsoft.com/office/drawing/2017/model3d" xmlns:o="urn:schemas-microsoft-com:office:office" xmlns:r="http://schemas.openxmlformats.org/officeDocument/2006/relationships" xmlns:m="http://schemas.openxmlformats.org/officeDocument/2006/math" xmlns:v="urn:schemas-microsoft-com:vml" xmlns:wp14="http://schemas.microsoft.com/office/word/2010/wordprocessingDrawing" xmlns:wp="http://schemas.openxmlformats.org/drawingml/2006/wordprocessingDrawing" xmlns:w10="urn:schemas-microsoft-com:office:word" xmlns:w="http://schemas.openxmlformats.org/wordprocessingml/2006/main" xmlns:w14="http://schemas.microsoft.com/office/word/2010/wordml" xmlns:w15="http://schemas.microsoft.com/office/word/2012/wordml" xmlns:w16cex="http://schemas.microsoft.com/office/word/2018/wordml/cex" xmlns:w16cid="http://schemas.microsoft.com/office/word/2016/wordml/cid" xmlns:w16="http://schemas.microsoft.com/office/word/2018/wordml" xmlns:w16sdtdh="http://schemas.microsoft.com/office/word/2020/wordml/sdtdatahash" xmlns:w16se="http://schemas.microsoft.com/office/word/2015/wordml/symex" xmlns:wpg="http://schemas.microsoft.com/office/word/2010/wordprocessingGroup" xmlns:wpi="http://schemas.microsoft.com/office/word/2010/wordprocessingInk" xmlns:wne="http://schemas.microsoft.com/office/word/2006/wordml" xmlns:wps="http://schemas.microsoft.com/office/word/2010/wordprocessingShape" mc:Ignorable="w14 w15 w16se w16cid w16 w16cex w16sdtdh wp14">
   <w:abstractNum w:abstractNumId="0" w15:restartNumberingAfterBreak="0">
     <w:nsid w:val="00543D0E"/>
     <w:multiLevelType w:val="hybridMultilevel"/>
@@ -14481,155 +14961,155 @@
       </w:rPr>
     </w:lvl>
   </w:abstractNum>
-  <w:num w:numId="1" w16cid:durableId="261886317">
+  <w:num w:numId="1">
     <w:abstractNumId w:val="4"/>
   </w:num>
-  <w:num w:numId="2" w16cid:durableId="795873600">
+  <w:num w:numId="2">
     <w:abstractNumId w:val="41"/>
   </w:num>
-  <w:num w:numId="3" w16cid:durableId="1355182708">
+  <w:num w:numId="3">
     <w:abstractNumId w:val="8"/>
   </w:num>
-  <w:num w:numId="4" w16cid:durableId="700008221">
+  <w:num w:numId="4">
     <w:abstractNumId w:val="2"/>
   </w:num>
-  <w:num w:numId="5" w16cid:durableId="793712608">
+  <w:num w:numId="5">
     <w:abstractNumId w:val="7"/>
   </w:num>
-  <w:num w:numId="6" w16cid:durableId="576745881">
+  <w:num w:numId="6">
     <w:abstractNumId w:val="12"/>
   </w:num>
-  <w:num w:numId="7" w16cid:durableId="5253655">
+  <w:num w:numId="7">
     <w:abstractNumId w:val="42"/>
   </w:num>
-  <w:num w:numId="8" w16cid:durableId="1802530687">
+  <w:num w:numId="8">
     <w:abstractNumId w:val="31"/>
   </w:num>
-  <w:num w:numId="9" w16cid:durableId="343747431">
+  <w:num w:numId="9">
     <w:abstractNumId w:val="22"/>
   </w:num>
-  <w:num w:numId="10" w16cid:durableId="1289094365">
+  <w:num w:numId="10">
     <w:abstractNumId w:val="32"/>
   </w:num>
-  <w:num w:numId="11" w16cid:durableId="1101027186">
+  <w:num w:numId="11">
     <w:abstractNumId w:val="9"/>
   </w:num>
-  <w:num w:numId="12" w16cid:durableId="25452924">
+  <w:num w:numId="12">
     <w:abstractNumId w:val="14"/>
   </w:num>
-  <w:num w:numId="13" w16cid:durableId="1582330000">
+  <w:num w:numId="13">
     <w:abstractNumId w:val="13"/>
   </w:num>
-  <w:num w:numId="14" w16cid:durableId="1156536009">
+  <w:num w:numId="14">
     <w:abstractNumId w:val="11"/>
   </w:num>
-  <w:num w:numId="15" w16cid:durableId="571620881">
+  <w:num w:numId="15">
     <w:abstractNumId w:val="10"/>
   </w:num>
-  <w:num w:numId="16" w16cid:durableId="1555508202">
+  <w:num w:numId="16">
     <w:abstractNumId w:val="24"/>
   </w:num>
-  <w:num w:numId="17" w16cid:durableId="698891364">
+  <w:num w:numId="17">
     <w:abstractNumId w:val="40"/>
   </w:num>
-  <w:num w:numId="18" w16cid:durableId="983662581">
+  <w:num w:numId="18">
     <w:abstractNumId w:val="35"/>
   </w:num>
-  <w:num w:numId="19" w16cid:durableId="106395937">
+  <w:num w:numId="19">
     <w:abstractNumId w:val="27"/>
   </w:num>
-  <w:num w:numId="20" w16cid:durableId="1434327842">
+  <w:num w:numId="20">
     <w:abstractNumId w:val="0"/>
   </w:num>
-  <w:num w:numId="21" w16cid:durableId="1342928660">
+  <w:num w:numId="21">
     <w:abstractNumId w:val="15"/>
   </w:num>
-  <w:num w:numId="22" w16cid:durableId="475608166">
+  <w:num w:numId="22">
     <w:abstractNumId w:val="6"/>
   </w:num>
-  <w:num w:numId="23" w16cid:durableId="773136856">
+  <w:num w:numId="23">
     <w:abstractNumId w:val="37"/>
   </w:num>
-  <w:num w:numId="24" w16cid:durableId="925112537">
+  <w:num w:numId="24">
     <w:abstractNumId w:val="44"/>
   </w:num>
-  <w:num w:numId="25" w16cid:durableId="1011298270">
+  <w:num w:numId="25">
     <w:abstractNumId w:val="33"/>
   </w:num>
-  <w:num w:numId="26" w16cid:durableId="1052341759">
+  <w:num w:numId="26">
     <w:abstractNumId w:val="34"/>
   </w:num>
-  <w:num w:numId="27" w16cid:durableId="1339890545">
+  <w:num w:numId="27">
     <w:abstractNumId w:val="43"/>
   </w:num>
-  <w:num w:numId="28" w16cid:durableId="992106171">
+  <w:num w:numId="28">
     <w:abstractNumId w:val="23"/>
   </w:num>
-  <w:num w:numId="29" w16cid:durableId="1002582801">
+  <w:num w:numId="29">
     <w:abstractNumId w:val="28"/>
   </w:num>
-  <w:num w:numId="30" w16cid:durableId="2084907322">
+  <w:num w:numId="30">
     <w:abstractNumId w:val="38"/>
   </w:num>
-  <w:num w:numId="31" w16cid:durableId="367678757">
+  <w:num w:numId="31">
     <w:abstractNumId w:val="19"/>
   </w:num>
-  <w:num w:numId="32" w16cid:durableId="1365906840">
+  <w:num w:numId="32">
     <w:abstractNumId w:val="1"/>
   </w:num>
-  <w:num w:numId="33" w16cid:durableId="165367470">
+  <w:num w:numId="33">
     <w:abstractNumId w:val="16"/>
   </w:num>
-  <w:num w:numId="34" w16cid:durableId="1797942322">
+  <w:num w:numId="34">
     <w:abstractNumId w:val="39"/>
   </w:num>
-  <w:num w:numId="35" w16cid:durableId="1677465730">
+  <w:num w:numId="35">
     <w:abstractNumId w:val="3"/>
   </w:num>
-  <w:num w:numId="36" w16cid:durableId="1726755335">
+  <w:num w:numId="36">
     <w:abstractNumId w:val="17"/>
   </w:num>
-  <w:num w:numId="37" w16cid:durableId="1737360181">
+  <w:num w:numId="37">
     <w:abstractNumId w:val="36"/>
   </w:num>
-  <w:num w:numId="38" w16cid:durableId="995568854">
+  <w:num w:numId="38">
     <w:abstractNumId w:val="18"/>
   </w:num>
-  <w:num w:numId="39" w16cid:durableId="647250076">
+  <w:num w:numId="39">
     <w:abstractNumId w:val="5"/>
   </w:num>
-  <w:num w:numId="40" w16cid:durableId="450708880">
+  <w:num w:numId="40">
     <w:abstractNumId w:val="25"/>
   </w:num>
-  <w:num w:numId="41" w16cid:durableId="1129975666">
+  <w:num w:numId="41">
     <w:abstractNumId w:val="17"/>
   </w:num>
-  <w:num w:numId="42" w16cid:durableId="1378622968">
+  <w:num w:numId="42">
     <w:abstractNumId w:val="20"/>
   </w:num>
-  <w:num w:numId="43" w16cid:durableId="1226793910">
+  <w:num w:numId="43">
     <w:abstractNumId w:val="21"/>
   </w:num>
-  <w:num w:numId="44" w16cid:durableId="1789660152">
+  <w:num w:numId="44">
     <w:abstractNumId w:val="17"/>
   </w:num>
-  <w:num w:numId="45" w16cid:durableId="1834224402">
+  <w:num w:numId="45">
     <w:abstractNumId w:val="17"/>
   </w:num>
-  <w:num w:numId="46" w16cid:durableId="116602534">
+  <w:num w:numId="46">
     <w:abstractNumId w:val="30"/>
   </w:num>
-  <w:num w:numId="47" w16cid:durableId="2081367130">
+  <w:num w:numId="47">
     <w:abstractNumId w:val="29"/>
   </w:num>
-  <w:num w:numId="48" w16cid:durableId="2116439444">
+  <w:num w:numId="48">
     <w:abstractNumId w:val="26"/>
   </w:num>
 </w:numbering>
 </file>
 
 <file path=word/styles.xml><?xml version="1.0" encoding="utf-8"?>
-<w:styles xmlns:mc="http://schemas.openxmlformats.org/markup-compatibility/2006" xmlns:r="http://schemas.openxmlformats.org/officeDocument/2006/relationships" xmlns:w="http://schemas.openxmlformats.org/wordprocessingml/2006/main" xmlns:w14="http://schemas.microsoft.com/office/word/2010/wordml" xmlns:w15="http://schemas.microsoft.com/office/word/2012/wordml" xmlns:w16cex="http://schemas.microsoft.com/office/word/2018/wordml/cex" xmlns:w16cid="http://schemas.microsoft.com/office/word/2016/wordml/cid" xmlns:w16="http://schemas.microsoft.com/office/word/2018/wordml" xmlns:w16du="http://schemas.microsoft.com/office/word/2023/wordml/word16du" xmlns:w16sdtdh="http://schemas.microsoft.com/office/word/2020/wordml/sdtdatahash" xmlns:w16sdtfl="http://schemas.microsoft.com/office/word/2024/wordml/sdtformatlock" xmlns:w16se="http://schemas.microsoft.com/office/word/2015/wordml/symex" mc:Ignorable="w14 w15 w16se w16cid w16 w16cex w16sdtdh w16sdtfl w16du">
+<w:styles xmlns:mc="http://schemas.openxmlformats.org/markup-compatibility/2006" xmlns:r="http://schemas.openxmlformats.org/officeDocument/2006/relationships" xmlns:w="http://schemas.openxmlformats.org/wordprocessingml/2006/main" xmlns:w14="http://schemas.microsoft.com/office/word/2010/wordml" xmlns:w15="http://schemas.microsoft.com/office/word/2012/wordml" xmlns:w16cex="http://schemas.microsoft.com/office/word/2018/wordml/cex" xmlns:w16cid="http://schemas.microsoft.com/office/word/2016/wordml/cid" xmlns:w16="http://schemas.microsoft.com/office/word/2018/wordml" xmlns:w16sdtdh="http://schemas.microsoft.com/office/word/2020/wordml/sdtdatahash" xmlns:w16se="http://schemas.microsoft.com/office/word/2015/wordml/symex" mc:Ignorable="w14 w15 w16se w16cid w16 w16cex w16sdtdh">
   <w:docDefaults>
     <w:rPrDefault>
       <w:rPr>
@@ -16204,7 +16684,7 @@
 </file>
 
 <file path=word/glossary/document.xml><?xml version="1.0" encoding="utf-8"?>
-<w:glossaryDocument xmlns:wpc="http://schemas.microsoft.com/office/word/2010/wordprocessingCanvas" xmlns:cx="http://schemas.microsoft.com/office/drawing/2014/chartex" xmlns:cx1="http://schemas.microsoft.com/office/drawing/2015/9/8/chartex" xmlns:cx2="http://schemas.microsoft.com/office/drawing/2015/10/21/chartex" xmlns:cx3="http://schemas.microsoft.com/office/drawing/2016/5/9/chartex" xmlns:cx4="http://schemas.microsoft.com/office/drawing/2016/5/10/chartex" xmlns:cx5="http://schemas.microsoft.com/office/drawing/2016/5/11/chartex" xmlns:cx6="http://schemas.microsoft.com/office/drawing/2016/5/12/chartex" xmlns:cx7="http://schemas.microsoft.com/office/drawing/2016/5/13/chartex" xmlns:cx8="http://schemas.microsoft.com/office/drawing/2016/5/14/chartex" xmlns:mc="http://schemas.openxmlformats.org/markup-compatibility/2006" xmlns:aink="http://schemas.microsoft.com/office/drawing/2016/ink" xmlns:am3d="http://schemas.microsoft.com/office/drawing/2017/model3d" xmlns:o="urn:schemas-microsoft-com:office:office" xmlns:oel="http://schemas.microsoft.com/office/2019/extlst" xmlns:r="http://schemas.openxmlformats.org/officeDocument/2006/relationships" xmlns:m="http://schemas.openxmlformats.org/officeDocument/2006/math" xmlns:v="urn:schemas-microsoft-com:vml" xmlns:wp14="http://schemas.microsoft.com/office/word/2010/wordprocessingDrawing" xmlns:wp="http://schemas.openxmlformats.org/drawingml/2006/wordprocessingDrawing" xmlns:w10="urn:schemas-microsoft-com:office:word" xmlns:w="http://schemas.openxmlformats.org/wordprocessingml/2006/main" xmlns:w14="http://schemas.microsoft.com/office/word/2010/wordml" xmlns:w15="http://schemas.microsoft.com/office/word/2012/wordml" xmlns:w16cex="http://schemas.microsoft.com/office/word/2018/wordml/cex" xmlns:w16cid="http://schemas.microsoft.com/office/word/2016/wordml/cid" xmlns:w16="http://schemas.microsoft.com/office/word/2018/wordml" xmlns:w16du="http://schemas.microsoft.com/office/word/2023/wordml/word16du" xmlns:w16sdtdh="http://schemas.microsoft.com/office/word/2020/wordml/sdtdatahash" xmlns:w16sdtfl="http://schemas.microsoft.com/office/word/2024/wordml/sdtformatlock" xmlns:w16se="http://schemas.microsoft.com/office/word/2015/wordml/symex" xmlns:wpg="http://schemas.microsoft.com/office/word/2010/wordprocessingGroup" xmlns:wpi="http://schemas.microsoft.com/office/word/2010/wordprocessingInk" xmlns:wne="http://schemas.microsoft.com/office/word/2006/wordml" xmlns:wps="http://schemas.microsoft.com/office/word/2010/wordprocessingShape" mc:Ignorable="w14 w15 w16se w16cid w16 w16cex w16sdtdh w16sdtfl w16du wp14">
+<w:glossaryDocument xmlns:wpc="http://schemas.microsoft.com/office/word/2010/wordprocessingCanvas" xmlns:cx="http://schemas.microsoft.com/office/drawing/2014/chartex" xmlns:cx1="http://schemas.microsoft.com/office/drawing/2015/9/8/chartex" xmlns:cx2="http://schemas.microsoft.com/office/drawing/2015/10/21/chartex" xmlns:cx3="http://schemas.microsoft.com/office/drawing/2016/5/9/chartex" xmlns:cx4="http://schemas.microsoft.com/office/drawing/2016/5/10/chartex" xmlns:cx5="http://schemas.microsoft.com/office/drawing/2016/5/11/chartex" xmlns:cx6="http://schemas.microsoft.com/office/drawing/2016/5/12/chartex" xmlns:cx7="http://schemas.microsoft.com/office/drawing/2016/5/13/chartex" xmlns:cx8="http://schemas.microsoft.com/office/drawing/2016/5/14/chartex" xmlns:mc="http://schemas.openxmlformats.org/markup-compatibility/2006" xmlns:aink="http://schemas.microsoft.com/office/drawing/2016/ink" xmlns:am3d="http://schemas.microsoft.com/office/drawing/2017/model3d" xmlns:o="urn:schemas-microsoft-com:office:office" xmlns:r="http://schemas.openxmlformats.org/officeDocument/2006/relationships" xmlns:m="http://schemas.openxmlformats.org/officeDocument/2006/math" xmlns:v="urn:schemas-microsoft-com:vml" xmlns:wp14="http://schemas.microsoft.com/office/word/2010/wordprocessingDrawing" xmlns:wp="http://schemas.openxmlformats.org/drawingml/2006/wordprocessingDrawing" xmlns:w10="urn:schemas-microsoft-com:office:word" xmlns:w="http://schemas.openxmlformats.org/wordprocessingml/2006/main" xmlns:w14="http://schemas.microsoft.com/office/word/2010/wordml" xmlns:w15="http://schemas.microsoft.com/office/word/2012/wordml" xmlns:w16cex="http://schemas.microsoft.com/office/word/2018/wordml/cex" xmlns:w16cid="http://schemas.microsoft.com/office/word/2016/wordml/cid" xmlns:w16="http://schemas.microsoft.com/office/word/2018/wordml" xmlns:w16sdtdh="http://schemas.microsoft.com/office/word/2020/wordml/sdtdatahash" xmlns:w16se="http://schemas.microsoft.com/office/word/2015/wordml/symex" xmlns:wpg="http://schemas.microsoft.com/office/word/2010/wordprocessingGroup" xmlns:wpi="http://schemas.microsoft.com/office/word/2010/wordprocessingInk" xmlns:wne="http://schemas.microsoft.com/office/word/2006/wordml" xmlns:wps="http://schemas.microsoft.com/office/word/2010/wordprocessingShape" mc:Ignorable="w14 w15 w16se w16cid w16 w16cex w16sdtdh wp14">
   <w:docParts>
     <w:docPart>
       <w:docPartPr>
@@ -16418,11 +16898,11 @@
 </file>
 
 <file path=word/glossary/fontTable.xml><?xml version="1.0" encoding="utf-8"?>
-<w:fonts xmlns:mc="http://schemas.openxmlformats.org/markup-compatibility/2006" xmlns:r="http://schemas.openxmlformats.org/officeDocument/2006/relationships" xmlns:w="http://schemas.openxmlformats.org/wordprocessingml/2006/main" xmlns:w14="http://schemas.microsoft.com/office/word/2010/wordml" xmlns:w15="http://schemas.microsoft.com/office/word/2012/wordml" xmlns:w16cex="http://schemas.microsoft.com/office/word/2018/wordml/cex" xmlns:w16cid="http://schemas.microsoft.com/office/word/2016/wordml/cid" xmlns:w16="http://schemas.microsoft.com/office/word/2018/wordml" xmlns:w16du="http://schemas.microsoft.com/office/word/2023/wordml/word16du" xmlns:w16sdtdh="http://schemas.microsoft.com/office/word/2020/wordml/sdtdatahash" xmlns:w16sdtfl="http://schemas.microsoft.com/office/word/2024/wordml/sdtformatlock" xmlns:w16se="http://schemas.microsoft.com/office/word/2015/wordml/symex" mc:Ignorable="w14 w15 w16se w16cid w16 w16cex w16sdtdh w16sdtfl w16du">
+<w:fonts xmlns:mc="http://schemas.openxmlformats.org/markup-compatibility/2006" xmlns:r="http://schemas.openxmlformats.org/officeDocument/2006/relationships" xmlns:w="http://schemas.openxmlformats.org/wordprocessingml/2006/main" xmlns:w14="http://schemas.microsoft.com/office/word/2010/wordml" xmlns:w15="http://schemas.microsoft.com/office/word/2012/wordml" xmlns:w16cex="http://schemas.microsoft.com/office/word/2018/wordml/cex" xmlns:w16cid="http://schemas.microsoft.com/office/word/2016/wordml/cid" xmlns:w16="http://schemas.microsoft.com/office/word/2018/wordml" xmlns:w16sdtdh="http://schemas.microsoft.com/office/word/2020/wordml/sdtdatahash" xmlns:w16se="http://schemas.microsoft.com/office/word/2015/wordml/symex" mc:Ignorable="w14 w15 w16se w16cid w16 w16cex w16sdtdh">
   <w:font w:name="Symbol">
     <w:panose1 w:val="05050102010706020507"/>
     <w:charset w:val="02"/>
-    <w:family w:val="decorative"/>
+    <w:family w:val="roman"/>
     <w:pitch w:val="variable"/>
     <w:sig w:usb0="00000000" w:usb1="10000000" w:usb2="00000000" w:usb3="00000000" w:csb0="80000000" w:csb1="00000000"/>
   </w:font>
@@ -16442,24 +16922,24 @@
   </w:font>
   <w:font w:name="Wingdings">
     <w:panose1 w:val="05000000000000000000"/>
-    <w:charset w:val="4D"/>
-    <w:family w:val="decorative"/>
+    <w:charset w:val="02"/>
+    <w:family w:val="auto"/>
     <w:pitch w:val="variable"/>
-    <w:sig w:usb0="00000003" w:usb1="00000000" w:usb2="00000000" w:usb3="00000000" w:csb0="80000001" w:csb1="00000000"/>
+    <w:sig w:usb0="00000000" w:usb1="10000000" w:usb2="00000000" w:usb3="00000000" w:csb0="80000000" w:csb1="00000000"/>
   </w:font>
   <w:font w:name="Calibri">
     <w:panose1 w:val="020F0502020204030204"/>
     <w:charset w:val="00"/>
     <w:family w:val="swiss"/>
     <w:pitch w:val="variable"/>
-    <w:sig w:usb0="E0002AFF" w:usb1="C000ACFF" w:usb2="00000009" w:usb3="00000000" w:csb0="000001FF" w:csb1="00000000"/>
+    <w:sig w:usb0="E4002EFF" w:usb1="C200247B" w:usb2="00000009" w:usb3="00000000" w:csb0="000001FF" w:csb1="00000000"/>
   </w:font>
   <w:font w:name="Arial">
     <w:panose1 w:val="020B0604020202020204"/>
     <w:charset w:val="00"/>
     <w:family w:val="swiss"/>
     <w:pitch w:val="variable"/>
-    <w:sig w:usb0="E0002AFF" w:usb1="C0007843" w:usb2="00000009" w:usb3="00000000" w:csb0="000001FF" w:csb1="00000000"/>
+    <w:sig w:usb0="E0002EFF" w:usb1="C000785B" w:usb2="00000009" w:usb3="00000000" w:csb0="000001FF" w:csb1="00000000"/>
   </w:font>
   <w:font w:name="MS Mincho">
     <w:altName w:val="ＭＳ 明朝"/>
@@ -16481,34 +16961,19 @@
     <w:charset w:val="00"/>
     <w:family w:val="swiss"/>
     <w:pitch w:val="variable"/>
-    <w:sig w:usb0="E0002AFF" w:usb1="C000247B" w:usb2="00000009" w:usb3="00000000" w:csb0="000001FF" w:csb1="00000000"/>
+    <w:sig w:usb0="E4002EFF" w:usb1="C200247B" w:usb2="00000009" w:usb3="00000000" w:csb0="000001FF" w:csb1="00000000"/>
   </w:font>
   <w:font w:name="Yu Mincho">
-    <w:panose1 w:val="02020400000000000000"/>
     <w:charset w:val="80"/>
     <w:family w:val="roman"/>
     <w:pitch w:val="variable"/>
     <w:sig w:usb0="800002E7" w:usb1="2AC7FCFF" w:usb2="00000012" w:usb3="00000000" w:csb0="0002009F" w:csb1="00000000"/>
   </w:font>
-  <w:font w:name="Aptos">
-    <w:panose1 w:val="020B0004020202020204"/>
-    <w:charset w:val="00"/>
-    <w:family w:val="swiss"/>
-    <w:pitch w:val="variable"/>
-    <w:sig w:usb0="20000287" w:usb1="00000003" w:usb2="00000000" w:usb3="00000000" w:csb0="0000019F" w:csb1="00000000"/>
-  </w:font>
-  <w:font w:name="Aptos Display">
-    <w:panose1 w:val="020B0004020202020204"/>
-    <w:charset w:val="00"/>
-    <w:family w:val="swiss"/>
-    <w:pitch w:val="variable"/>
-    <w:sig w:usb0="20000287" w:usb1="00000003" w:usb2="00000000" w:usb3="00000000" w:csb0="0000019F" w:csb1="00000000"/>
-  </w:font>
 </w:fonts>
 </file>
 
 <file path=word/glossary/settings.xml><?xml version="1.0" encoding="utf-8"?>
-<w:settings xmlns:mc="http://schemas.openxmlformats.org/markup-compatibility/2006" xmlns:o="urn:schemas-microsoft-com:office:office" xmlns:r="http://schemas.openxmlformats.org/officeDocument/2006/relationships" xmlns:m="http://schemas.openxmlformats.org/officeDocument/2006/math" xmlns:v="urn:schemas-microsoft-com:vml" xmlns:w10="urn:schemas-microsoft-com:office:word" xmlns:w="http://schemas.openxmlformats.org/wordprocessingml/2006/main" xmlns:w14="http://schemas.microsoft.com/office/word/2010/wordml" xmlns:w15="http://schemas.microsoft.com/office/word/2012/wordml" xmlns:w16cex="http://schemas.microsoft.com/office/word/2018/wordml/cex" xmlns:w16cid="http://schemas.microsoft.com/office/word/2016/wordml/cid" xmlns:w16="http://schemas.microsoft.com/office/word/2018/wordml" xmlns:w16du="http://schemas.microsoft.com/office/word/2023/wordml/word16du" xmlns:w16sdtdh="http://schemas.microsoft.com/office/word/2020/wordml/sdtdatahash" xmlns:w16sdtfl="http://schemas.microsoft.com/office/word/2024/wordml/sdtformatlock" xmlns:w16se="http://schemas.microsoft.com/office/word/2015/wordml/symex" xmlns:sl="http://schemas.openxmlformats.org/schemaLibrary/2006/main" mc:Ignorable="w14 w15 w16se w16cid w16 w16cex w16sdtdh w16sdtfl w16du">
+<w:settings xmlns:mc="http://schemas.openxmlformats.org/markup-compatibility/2006" xmlns:o="urn:schemas-microsoft-com:office:office" xmlns:r="http://schemas.openxmlformats.org/officeDocument/2006/relationships" xmlns:m="http://schemas.openxmlformats.org/officeDocument/2006/math" xmlns:v="urn:schemas-microsoft-com:vml" xmlns:w10="urn:schemas-microsoft-com:office:word" xmlns:w="http://schemas.openxmlformats.org/wordprocessingml/2006/main" xmlns:w14="http://schemas.microsoft.com/office/word/2010/wordml" xmlns:w15="http://schemas.microsoft.com/office/word/2012/wordml" xmlns:w16cex="http://schemas.microsoft.com/office/word/2018/wordml/cex" xmlns:w16cid="http://schemas.microsoft.com/office/word/2016/wordml/cid" xmlns:w16="http://schemas.microsoft.com/office/word/2018/wordml" xmlns:w16sdtdh="http://schemas.microsoft.com/office/word/2020/wordml/sdtdatahash" xmlns:w16se="http://schemas.microsoft.com/office/word/2015/wordml/symex" xmlns:sl="http://schemas.openxmlformats.org/schemaLibrary/2006/main" mc:Ignorable="w14 w15 w16se w16cid w16 w16cex w16sdtdh">
   <w:view w:val="normal"/>
   <w:defaultTabStop w:val="708"/>
   <w:hyphenationZone w:val="425"/>
@@ -16529,12 +16994,14 @@
     <w:rsid w:val="000745AB"/>
     <w:rsid w:val="001C47A7"/>
     <w:rsid w:val="00372C2A"/>
+    <w:rsid w:val="003C24C9"/>
     <w:rsid w:val="004C2FA9"/>
     <w:rsid w:val="004C7FDE"/>
     <w:rsid w:val="004E3732"/>
     <w:rsid w:val="005A5BEE"/>
     <w:rsid w:val="006D29C6"/>
     <w:rsid w:val="008724E2"/>
+    <w:rsid w:val="009F51EB"/>
     <w:rsid w:val="00A2183C"/>
     <w:rsid w:val="00A92590"/>
     <w:rsid w:val="00AC13E3"/>
@@ -16559,14 +17026,14 @@
   </m:mathPr>
   <w:themeFontLang w:val="es-EC"/>
   <w:clrSchemeMapping w:bg1="light1" w:t1="dark1" w:bg2="light2" w:t2="dark2" w:accent1="accent1" w:accent2="accent2" w:accent3="accent3" w:accent4="accent4" w:accent5="accent5" w:accent6="accent6" w:hyperlink="hyperlink" w:followedHyperlink="followedHyperlink"/>
-  <w:decimalSymbol w:val=","/>
+  <w:decimalSymbol w:val="."/>
   <w:listSeparator w:val=";"/>
   <w15:chartTrackingRefBased/>
 </w:settings>
 </file>
 
 <file path=word/glossary/styles.xml><?xml version="1.0" encoding="utf-8"?>
-<w:styles xmlns:mc="http://schemas.openxmlformats.org/markup-compatibility/2006" xmlns:r="http://schemas.openxmlformats.org/officeDocument/2006/relationships" xmlns:w="http://schemas.openxmlformats.org/wordprocessingml/2006/main" xmlns:w14="http://schemas.microsoft.com/office/word/2010/wordml" xmlns:w15="http://schemas.microsoft.com/office/word/2012/wordml" xmlns:w16cex="http://schemas.microsoft.com/office/word/2018/wordml/cex" xmlns:w16cid="http://schemas.microsoft.com/office/word/2016/wordml/cid" xmlns:w16="http://schemas.microsoft.com/office/word/2018/wordml" xmlns:w16du="http://schemas.microsoft.com/office/word/2023/wordml/word16du" xmlns:w16sdtdh="http://schemas.microsoft.com/office/word/2020/wordml/sdtdatahash" xmlns:w16sdtfl="http://schemas.microsoft.com/office/word/2024/wordml/sdtformatlock" xmlns:w16se="http://schemas.microsoft.com/office/word/2015/wordml/symex" mc:Ignorable="w14 w15 w16se w16cid w16 w16cex w16sdtdh w16sdtfl w16du">
+<w:styles xmlns:mc="http://schemas.openxmlformats.org/markup-compatibility/2006" xmlns:r="http://schemas.openxmlformats.org/officeDocument/2006/relationships" xmlns:w="http://schemas.openxmlformats.org/wordprocessingml/2006/main" xmlns:w14="http://schemas.microsoft.com/office/word/2010/wordml" xmlns:w15="http://schemas.microsoft.com/office/word/2012/wordml" xmlns:w16cex="http://schemas.microsoft.com/office/word/2018/wordml/cex" xmlns:w16cid="http://schemas.microsoft.com/office/word/2016/wordml/cid" xmlns:w16="http://schemas.microsoft.com/office/word/2018/wordml" xmlns:w16sdtdh="http://schemas.microsoft.com/office/word/2020/wordml/sdtdatahash" xmlns:w16se="http://schemas.microsoft.com/office/word/2015/wordml/symex" mc:Ignorable="w14 w15 w16se w16cid w16 w16cex w16sdtdh">
   <w:docDefaults>
     <w:rPrDefault>
       <w:rPr>
@@ -17031,7 +17498,7 @@
 </file>
 
 <file path=word/glossary/webSettings.xml><?xml version="1.0" encoding="utf-8"?>
-<w:webSettings xmlns:mc="http://schemas.openxmlformats.org/markup-compatibility/2006" xmlns:r="http://schemas.openxmlformats.org/officeDocument/2006/relationships" xmlns:w="http://schemas.openxmlformats.org/wordprocessingml/2006/main" xmlns:w14="http://schemas.microsoft.com/office/word/2010/wordml" xmlns:w15="http://schemas.microsoft.com/office/word/2012/wordml" xmlns:w16cex="http://schemas.microsoft.com/office/word/2018/wordml/cex" xmlns:w16cid="http://schemas.microsoft.com/office/word/2016/wordml/cid" xmlns:w16="http://schemas.microsoft.com/office/word/2018/wordml" xmlns:w16du="http://schemas.microsoft.com/office/word/2023/wordml/word16du" xmlns:w16sdtdh="http://schemas.microsoft.com/office/word/2020/wordml/sdtdatahash" xmlns:w16sdtfl="http://schemas.microsoft.com/office/word/2024/wordml/sdtformatlock" xmlns:w16se="http://schemas.microsoft.com/office/word/2015/wordml/symex" mc:Ignorable="w14 w15 w16se w16cid w16 w16cex w16sdtdh w16sdtfl w16du">
+<w:webSettings xmlns:mc="http://schemas.openxmlformats.org/markup-compatibility/2006" xmlns:r="http://schemas.openxmlformats.org/officeDocument/2006/relationships" xmlns:w="http://schemas.openxmlformats.org/wordprocessingml/2006/main" xmlns:w14="http://schemas.microsoft.com/office/word/2010/wordml" xmlns:w15="http://schemas.microsoft.com/office/word/2012/wordml" xmlns:w16cex="http://schemas.microsoft.com/office/word/2018/wordml/cex" xmlns:w16cid="http://schemas.microsoft.com/office/word/2016/wordml/cid" xmlns:w16="http://schemas.microsoft.com/office/word/2018/wordml" xmlns:w16sdtdh="http://schemas.microsoft.com/office/word/2020/wordml/sdtdatahash" xmlns:w16se="http://schemas.microsoft.com/office/word/2015/wordml/symex" mc:Ignorable="w14 w15 w16se w16cid w16 w16cex w16sdtdh">
   <w:optimizeForBrowser/>
   <w:allowPNG/>
 </w:webSettings>

</xml_diff>

<commit_message>
Ajustes del formato en el reporte final
</commit_message>
<xml_diff>
--- a/TP1/TP1_Programacion_Grupo3.docx
+++ b/TP1/TP1_Programacion_Grupo3.docx
@@ -1,6 +1,6 @@
 
 <file path=word/document.xml><?xml version="1.0" encoding="utf-8"?>
-<w:document xmlns:wpc="http://schemas.microsoft.com/office/word/2010/wordprocessingCanvas" xmlns:cx="http://schemas.microsoft.com/office/drawing/2014/chartex" xmlns:cx1="http://schemas.microsoft.com/office/drawing/2015/9/8/chartex" xmlns:cx2="http://schemas.microsoft.com/office/drawing/2015/10/21/chartex" xmlns:cx3="http://schemas.microsoft.com/office/drawing/2016/5/9/chartex" xmlns:cx4="http://schemas.microsoft.com/office/drawing/2016/5/10/chartex" xmlns:cx5="http://schemas.microsoft.com/office/drawing/2016/5/11/chartex" xmlns:cx6="http://schemas.microsoft.com/office/drawing/2016/5/12/chartex" xmlns:cx7="http://schemas.microsoft.com/office/drawing/2016/5/13/chartex" xmlns:cx8="http://schemas.microsoft.com/office/drawing/2016/5/14/chartex" xmlns:mc="http://schemas.openxmlformats.org/markup-compatibility/2006" xmlns:aink="http://schemas.microsoft.com/office/drawing/2016/ink" xmlns:am3d="http://schemas.microsoft.com/office/drawing/2017/model3d" xmlns:o="urn:schemas-microsoft-com:office:office" xmlns:r="http://schemas.openxmlformats.org/officeDocument/2006/relationships" xmlns:m="http://schemas.openxmlformats.org/officeDocument/2006/math" xmlns:v="urn:schemas-microsoft-com:vml" xmlns:wp14="http://schemas.microsoft.com/office/word/2010/wordprocessingDrawing" xmlns:wp="http://schemas.openxmlformats.org/drawingml/2006/wordprocessingDrawing" xmlns:w10="urn:schemas-microsoft-com:office:word" xmlns:w="http://schemas.openxmlformats.org/wordprocessingml/2006/main" xmlns:w14="http://schemas.microsoft.com/office/word/2010/wordml" xmlns:w15="http://schemas.microsoft.com/office/word/2012/wordml" xmlns:w16cex="http://schemas.microsoft.com/office/word/2018/wordml/cex" xmlns:w16cid="http://schemas.microsoft.com/office/word/2016/wordml/cid" xmlns:w16="http://schemas.microsoft.com/office/word/2018/wordml" xmlns:w16sdtdh="http://schemas.microsoft.com/office/word/2020/wordml/sdtdatahash" xmlns:w16se="http://schemas.microsoft.com/office/word/2015/wordml/symex" xmlns:wpg="http://schemas.microsoft.com/office/word/2010/wordprocessingGroup" xmlns:wpi="http://schemas.microsoft.com/office/word/2010/wordprocessingInk" xmlns:wne="http://schemas.microsoft.com/office/word/2006/wordml" xmlns:wps="http://schemas.microsoft.com/office/word/2010/wordprocessingShape" mc:Ignorable="w14 w15 w16se w16cid w16 w16cex w16sdtdh wp14">
+<w:document xmlns:wpc="http://schemas.microsoft.com/office/word/2010/wordprocessingCanvas" xmlns:cx="http://schemas.microsoft.com/office/drawing/2014/chartex" xmlns:cx1="http://schemas.microsoft.com/office/drawing/2015/9/8/chartex" xmlns:cx2="http://schemas.microsoft.com/office/drawing/2015/10/21/chartex" xmlns:cx3="http://schemas.microsoft.com/office/drawing/2016/5/9/chartex" xmlns:cx4="http://schemas.microsoft.com/office/drawing/2016/5/10/chartex" xmlns:cx5="http://schemas.microsoft.com/office/drawing/2016/5/11/chartex" xmlns:cx6="http://schemas.microsoft.com/office/drawing/2016/5/12/chartex" xmlns:cx7="http://schemas.microsoft.com/office/drawing/2016/5/13/chartex" xmlns:cx8="http://schemas.microsoft.com/office/drawing/2016/5/14/chartex" xmlns:mc="http://schemas.openxmlformats.org/markup-compatibility/2006" xmlns:aink="http://schemas.microsoft.com/office/drawing/2016/ink" xmlns:am3d="http://schemas.microsoft.com/office/drawing/2017/model3d" xmlns:o="urn:schemas-microsoft-com:office:office" xmlns:oel="http://schemas.microsoft.com/office/2019/extlst" xmlns:r="http://schemas.openxmlformats.org/officeDocument/2006/relationships" xmlns:m="http://schemas.openxmlformats.org/officeDocument/2006/math" xmlns:v="urn:schemas-microsoft-com:vml" xmlns:wp14="http://schemas.microsoft.com/office/word/2010/wordprocessingDrawing" xmlns:wp="http://schemas.openxmlformats.org/drawingml/2006/wordprocessingDrawing" xmlns:w10="urn:schemas-microsoft-com:office:word" xmlns:w="http://schemas.openxmlformats.org/wordprocessingml/2006/main" xmlns:w14="http://schemas.microsoft.com/office/word/2010/wordml" xmlns:w15="http://schemas.microsoft.com/office/word/2012/wordml" xmlns:w16cex="http://schemas.microsoft.com/office/word/2018/wordml/cex" xmlns:w16cid="http://schemas.microsoft.com/office/word/2016/wordml/cid" xmlns:w16="http://schemas.microsoft.com/office/word/2018/wordml" xmlns:w16du="http://schemas.microsoft.com/office/word/2023/wordml/word16du" xmlns:w16sdtdh="http://schemas.microsoft.com/office/word/2020/wordml/sdtdatahash" xmlns:w16sdtfl="http://schemas.microsoft.com/office/word/2024/wordml/sdtformatlock" xmlns:w16se="http://schemas.microsoft.com/office/word/2015/wordml/symex" xmlns:wpg="http://schemas.microsoft.com/office/word/2010/wordprocessingGroup" xmlns:wpi="http://schemas.microsoft.com/office/word/2010/wordprocessingInk" xmlns:wne="http://schemas.microsoft.com/office/word/2006/wordml" xmlns:wps="http://schemas.microsoft.com/office/word/2010/wordprocessingShape" mc:Ignorable="w14 w15 w16se w16cid w16 w16cex w16sdtdh w16sdtfl w16du wp14">
   <w:body>
     <w:p>
       <w:pPr>
@@ -737,23 +737,7 @@
           <w:szCs w:val="20"/>
           <w:lang w:val="es-US"/>
         </w:rPr>
-        <w:t xml:space="preserve">La primera fase de este apartado persigue el análisis de la base de datos de la Encuesta Permanente de Hogares vinculada a los cuartos trimestres de los años 2024 y 2025, centrado en la identificación de la informalidad laboral tal como la caracterizan </w:t>
-      </w:r>
-      <w:proofErr w:type="spellStart"/>
-      <w:r>
-        <w:rPr>
-          <w:szCs w:val="20"/>
-          <w:lang w:val="es-US"/>
-        </w:rPr>
-        <w:t>Maurizio</w:t>
-      </w:r>
-      <w:proofErr w:type="spellEnd"/>
-      <w:r>
-        <w:rPr>
-          <w:szCs w:val="20"/>
-          <w:lang w:val="es-US"/>
-        </w:rPr>
-        <w:t xml:space="preserve"> y Monsalvo (2021). Después se presentan la selección y armonización de las variables, la modificación de los valores contradictorios y la actualización de los ingresos desde la irrupción de la inflación interanual. También incluye un análisis de los valores perdidos a partir de los </w:t>
+        <w:t xml:space="preserve">La primera fase de este apartado persigue el análisis de la base de datos de la Encuesta Permanente de Hogares vinculada a los cuartos trimestres de los años 2024 y 2025, centrado en la identificación de la informalidad laboral tal como la caracterizan Maurizio y Monsalvo (2021). Después se presentan la selección y armonización de las variables, la modificación de los valores contradictorios y la actualización de los ingresos desde la irrupción de la inflación interanual. También incluye un análisis de los valores perdidos a partir de los </w:t>
       </w:r>
       <w:proofErr w:type="spellStart"/>
       <w:r>
@@ -857,9 +841,7 @@
             <w:docPart w:val="DefaultPlaceholder_-1854013440"/>
           </w:placeholder>
         </w:sdtPr>
-        <w:sdtEndPr/>
         <w:sdtContent>
-          <w:proofErr w:type="spellStart"/>
           <w:r>
             <w:rPr>
               <w:rFonts w:cs="Times New Roman"/>
@@ -867,17 +849,7 @@
               <w:szCs w:val="20"/>
               <w:lang w:val="es-US"/>
             </w:rPr>
-            <w:t>Maurizio</w:t>
-          </w:r>
-          <w:proofErr w:type="spellEnd"/>
-          <w:r>
-            <w:rPr>
-              <w:rFonts w:cs="Times New Roman"/>
-              <w:color w:val="000000"/>
-              <w:szCs w:val="20"/>
-              <w:lang w:val="es-US"/>
-            </w:rPr>
-            <w:t xml:space="preserve"> y Monsalvo (2021)</w:t>
+            <w:t>Maurizio y Monsalvo (2021)</w:t>
           </w:r>
         </w:sdtContent>
       </w:sdt>
@@ -934,9 +906,7 @@
             <w:docPart w:val="F6998C41F6C94C4FA289D350D2806EE8"/>
           </w:placeholder>
         </w:sdtPr>
-        <w:sdtEndPr/>
         <w:sdtContent>
-          <w:proofErr w:type="spellStart"/>
           <w:r>
             <w:rPr>
               <w:rFonts w:cs="Times New Roman"/>
@@ -944,17 +914,7 @@
               <w:szCs w:val="20"/>
               <w:lang w:val="es-US"/>
             </w:rPr>
-            <w:t>Maurizio</w:t>
-          </w:r>
-          <w:proofErr w:type="spellEnd"/>
-          <w:r>
-            <w:rPr>
-              <w:rFonts w:cs="Times New Roman"/>
-              <w:color w:val="000000"/>
-              <w:szCs w:val="20"/>
-              <w:lang w:val="es-US"/>
-            </w:rPr>
-            <w:t xml:space="preserve"> y Monsalvo (2021)</w:t>
+            <w:t>Maurizio y Monsalvo (2021)</w:t>
           </w:r>
         </w:sdtContent>
       </w:sdt>
@@ -964,49 +924,57 @@
         </w:rPr>
         <w:t xml:space="preserve"> —</w:t>
       </w:r>
-      <w:proofErr w:type="spellStart"/>
       <w:r>
         <w:rPr>
           <w:i/>
           <w:iCs/>
           <w:szCs w:val="20"/>
         </w:rPr>
-        <w:t>Lower-tier</w:t>
-      </w:r>
-      <w:proofErr w:type="spellEnd"/>
+        <w:t>Lower-</w:t>
+      </w:r>
+      <w:proofErr w:type="spellStart"/>
       <w:r>
         <w:rPr>
           <w:i/>
           <w:iCs/>
           <w:szCs w:val="20"/>
         </w:rPr>
-        <w:t xml:space="preserve"> informal </w:t>
-      </w:r>
-      <w:proofErr w:type="spellStart"/>
+        <w:t>tier</w:t>
+      </w:r>
+      <w:proofErr w:type="spellEnd"/>
       <w:r>
         <w:rPr>
           <w:i/>
           <w:iCs/>
           <w:szCs w:val="20"/>
         </w:rPr>
-        <w:t>wage</w:t>
-      </w:r>
-      <w:proofErr w:type="spellEnd"/>
+        <w:t xml:space="preserve"> informal </w:t>
+      </w:r>
+      <w:proofErr w:type="spellStart"/>
       <w:r>
         <w:rPr>
           <w:i/>
           <w:iCs/>
           <w:szCs w:val="20"/>
         </w:rPr>
-        <w:t xml:space="preserve"> </w:t>
-      </w:r>
-      <w:proofErr w:type="spellStart"/>
+        <w:t>wage</w:t>
+      </w:r>
+      <w:proofErr w:type="spellEnd"/>
       <w:r>
         <w:rPr>
           <w:i/>
           <w:iCs/>
           <w:szCs w:val="20"/>
         </w:rPr>
+        <w:t xml:space="preserve"> </w:t>
+      </w:r>
+      <w:proofErr w:type="spellStart"/>
+      <w:r>
+        <w:rPr>
+          <w:i/>
+          <w:iCs/>
+          <w:szCs w:val="20"/>
+        </w:rPr>
         <w:t>employees</w:t>
       </w:r>
       <w:proofErr w:type="spellEnd"/>
@@ -1144,21 +1112,7 @@
         <w:rPr>
           <w:szCs w:val="20"/>
         </w:rPr>
-        <w:t xml:space="preserve"> esta categoría según </w:t>
-      </w:r>
-      <w:proofErr w:type="spellStart"/>
-      <w:r>
-        <w:rPr>
-          <w:szCs w:val="20"/>
-        </w:rPr>
-        <w:t>Maurizio</w:t>
-      </w:r>
-      <w:proofErr w:type="spellEnd"/>
-      <w:r>
-        <w:rPr>
-          <w:szCs w:val="20"/>
-        </w:rPr>
-        <w:t xml:space="preserve"> y Monsalvo (2021), la empresa debía contar con 5 empleados o menos.</w:t>
+        <w:t xml:space="preserve"> esta categoría según Maurizio y Monsalvo (2021), la empresa debía contar con 5 empleados o menos.</w:t>
       </w:r>
     </w:p>
     <w:p>
@@ -1406,15 +1360,7 @@
           <w:szCs w:val="20"/>
           <w:lang w:val="es-US"/>
         </w:rPr>
-        <w:t xml:space="preserve"> sobre valores </w:t>
-      </w:r>
-      <w:proofErr w:type="spellStart"/>
-      <w:r>
-        <w:rPr>
-          <w:szCs w:val="20"/>
-          <w:lang w:val="es-US"/>
-        </w:rPr>
-        <w:t>N</w:t>
+        <w:t xml:space="preserve"> sobre valores N</w:t>
       </w:r>
       <w:r>
         <w:rPr>
@@ -1423,7 +1369,6 @@
         </w:rPr>
         <w:t>aN</w:t>
       </w:r>
-      <w:proofErr w:type="spellEnd"/>
     </w:p>
     <w:p>
       <w:pPr>
@@ -1449,21 +1394,7 @@
         <w:rPr>
           <w:szCs w:val="20"/>
         </w:rPr>
-        <w:t xml:space="preserve"> permite visualizar los valores </w:t>
-      </w:r>
-      <w:proofErr w:type="spellStart"/>
-      <w:r>
-        <w:rPr>
-          <w:szCs w:val="20"/>
-        </w:rPr>
-        <w:t>NaN</w:t>
-      </w:r>
-      <w:proofErr w:type="spellEnd"/>
-      <w:r>
-        <w:rPr>
-          <w:szCs w:val="20"/>
-        </w:rPr>
-        <w:t xml:space="preserve"> presentes en las bases </w:t>
+        <w:t xml:space="preserve"> permite visualizar los valores NaN presentes en las bases </w:t>
       </w:r>
       <w:r>
         <w:rPr>
@@ -1715,16 +1646,16 @@
           <w:szCs w:val="20"/>
         </w:rPr>
         <w:drawing>
-          <wp:anchor distT="0" distB="0" distL="114300" distR="114300" simplePos="0" relativeHeight="251658240" behindDoc="0" locked="0" layoutInCell="1" allowOverlap="1" wp14:anchorId="2F376FA9" wp14:editId="00C8220F">
+          <wp:anchor distT="0" distB="0" distL="114300" distR="114300" simplePos="0" relativeHeight="251658240" behindDoc="0" locked="0" layoutInCell="1" allowOverlap="1" wp14:anchorId="2F376FA9" wp14:editId="23774FFD">
             <wp:simplePos x="0" y="0"/>
             <wp:positionH relativeFrom="column">
-              <wp:posOffset>1511292</wp:posOffset>
+              <wp:posOffset>1720215</wp:posOffset>
             </wp:positionH>
             <wp:positionV relativeFrom="paragraph">
-              <wp:posOffset>392639</wp:posOffset>
+              <wp:posOffset>394970</wp:posOffset>
             </wp:positionV>
-            <wp:extent cx="3697605" cy="3047365"/>
-            <wp:effectExtent l="0" t="0" r="0" b="635"/>
+            <wp:extent cx="3241675" cy="2527935"/>
+            <wp:effectExtent l="0" t="0" r="0" b="0"/>
             <wp:wrapTopAndBottom/>
             <wp:docPr id="1" name="Imagen 1"/>
             <wp:cNvGraphicFramePr>
@@ -1752,7 +1683,7 @@
                   <pic:spPr>
                     <a:xfrm>
                       <a:off x="0" y="0"/>
-                      <a:ext cx="3697605" cy="3047365"/>
+                      <a:ext cx="3241675" cy="2527935"/>
                     </a:xfrm>
                     <a:prstGeom prst="rect">
                       <a:avLst/>
@@ -1883,7 +1814,6 @@
             <w:docPart w:val="AB1892C75F97D34FB97E8D50FF9D6DF5"/>
           </w:placeholder>
         </w:sdtPr>
-        <w:sdtEndPr/>
         <w:sdtContent>
           <w:r>
             <w:rPr>
@@ -2267,40 +2197,35 @@
         <w:spacing w:before="240"/>
       </w:pPr>
       <w:r>
+        <w:t>Respecto a los estadísticos descriptivos preliminares (ver Anexo 2), co</w:t>
+      </w:r>
+      <w:r>
+        <w:t>nvien</w:t>
+      </w:r>
+      <w:r>
+        <w:t>e señalar dos aspectos previos. Primero, dada la naturaleza</w:t>
+      </w:r>
+      <w:r>
+        <w:t xml:space="preserve"> distinta</w:t>
+      </w:r>
+      <w:r>
+        <w:t xml:space="preserve"> de las variables, su tratamiento difiere: no </w:t>
+      </w:r>
+      <w:r>
+        <w:t>es</w:t>
+      </w:r>
+      <w:r>
+        <w:t xml:space="preserve"> posible calcular percentiles para variables categóricas, por lo que en </w:t>
+      </w:r>
+      <w:r>
         <w:lastRenderedPageBreak/>
-        <w:t>Respecto a los estadísticos descriptivos preliminares (ver Anexo 2), co</w:t>
-      </w:r>
-      <w:r>
-        <w:t>nvien</w:t>
-      </w:r>
-      <w:r>
-        <w:t>e señalar dos aspectos previos. Primero, dada la naturaleza</w:t>
-      </w:r>
-      <w:r>
-        <w:t xml:space="preserve"> distinta</w:t>
-      </w:r>
-      <w:r>
-        <w:t xml:space="preserve"> de las variables, su tratamiento difiere: no </w:t>
-      </w:r>
-      <w:r>
-        <w:t>es</w:t>
-      </w:r>
-      <w:r>
-        <w:t xml:space="preserve"> posible calcular percentiles para variables categóricas, por lo que en estos casos se presentan únicamente tablas de frecuencias. Segundo, en cuanto a la no correspondencia o filtrado previo, antes de generar los resultados descriptivos se etiquetaron las variables, de modo que las personas a quienes no</w:t>
+        <w:t>estos casos se presentan únicamente tablas de frecuencias. Segundo, en cuanto a la no correspondencia o filtrado previo, antes de generar los resultados descriptivos se etiquetaron las variables, de modo que las personas a quienes no</w:t>
       </w:r>
       <w:r>
         <w:t xml:space="preserve"> les</w:t>
       </w:r>
       <w:r>
-        <w:t xml:space="preserve"> correspondía responder determinada pregunta quedaron codificadas como </w:t>
-      </w:r>
-      <w:proofErr w:type="spellStart"/>
-      <w:r>
-        <w:t>NaN</w:t>
-      </w:r>
-      <w:proofErr w:type="spellEnd"/>
-      <w:r>
-        <w:t xml:space="preserve">. Esto no debe confundirse con el problema de datos faltantes </w:t>
+        <w:t xml:space="preserve"> correspondía responder determinada pregunta quedaron codificadas como NaN. Esto no debe confundirse con el problema de datos faltantes </w:t>
       </w:r>
       <w:r>
         <w:t>d</w:t>
@@ -2341,11 +2266,9 @@
       <w:r>
         <w:t>'</w:t>
       </w:r>
-      <w:proofErr w:type="spellStart"/>
       <w:r>
         <w:t>NaN</w:t>
       </w:r>
-      <w:proofErr w:type="spellEnd"/>
       <w:r>
         <w:t>'</w:t>
       </w:r>
@@ -2527,7 +2450,6 @@
             <w:docPart w:val="6796B5EBE6279F48AA0BC0D6F950B8E2"/>
           </w:placeholder>
         </w:sdtPr>
-        <w:sdtEndPr/>
         <w:sdtContent>
           <w:r>
             <w:rPr>
@@ -2720,7 +2642,6 @@
             <w:docPart w:val="DefaultPlaceholder_-1854013440"/>
           </w:placeholder>
         </w:sdtPr>
-        <w:sdtEndPr/>
         <w:sdtContent>
           <w:r>
             <w:rPr>
@@ -2729,27 +2650,7 @@
               <w:szCs w:val="20"/>
               <w:lang w:val="es-US"/>
             </w:rPr>
-            <w:t>(</w:t>
-          </w:r>
-          <w:proofErr w:type="spellStart"/>
-          <w:r>
-            <w:rPr>
-              <w:rFonts w:cs="Times New Roman"/>
-              <w:color w:val="000000"/>
-              <w:szCs w:val="20"/>
-              <w:lang w:val="es-US"/>
-            </w:rPr>
-            <w:t>Hickel</w:t>
-          </w:r>
-          <w:proofErr w:type="spellEnd"/>
-          <w:r>
-            <w:rPr>
-              <w:rFonts w:cs="Times New Roman"/>
-              <w:color w:val="000000"/>
-              <w:szCs w:val="20"/>
-              <w:lang w:val="es-US"/>
-            </w:rPr>
-            <w:t xml:space="preserve"> et al., 2024)</w:t>
+            <w:t>(Hickel et al., 2024)</w:t>
           </w:r>
         </w:sdtContent>
       </w:sdt>
@@ -2809,7 +2710,6 @@
             <w:docPart w:val="DefaultPlaceholder_-1854013440"/>
           </w:placeholder>
         </w:sdtPr>
-        <w:sdtEndPr/>
         <w:sdtContent>
           <w:r>
             <w:rPr>
@@ -3201,7 +3101,6 @@
                 <w:lang w:val="es-EC" w:eastAsia="es-MX"/>
               </w:rPr>
             </w:pPr>
-            <w:proofErr w:type="spellStart"/>
             <w:r>
               <w:rPr>
                 <w:rFonts w:eastAsia="Times New Roman" w:cs="Times New Roman"/>
@@ -3213,7 +3112,6 @@
               </w:rPr>
               <w:t>Abs</w:t>
             </w:r>
-            <w:proofErr w:type="spellEnd"/>
             <w:r>
               <w:rPr>
                 <w:rFonts w:eastAsia="Times New Roman" w:cs="Times New Roman"/>
@@ -3223,7 +3121,7 @@
                 <w:szCs w:val="13"/>
                 <w:lang w:val="es-EC" w:eastAsia="es-MX"/>
               </w:rPr>
-              <w:t>.</w:t>
+              <w:t>oluta</w:t>
             </w:r>
           </w:p>
         </w:tc>
@@ -3262,7 +3160,29 @@
                 <w:szCs w:val="13"/>
                 <w:lang w:val="es-EC" w:eastAsia="es-MX"/>
               </w:rPr>
-              <w:t>Rel. (%)</w:t>
+              <w:t>Rel</w:t>
+            </w:r>
+            <w:r>
+              <w:rPr>
+                <w:rFonts w:eastAsia="Times New Roman" w:cs="Times New Roman"/>
+                <w:b/>
+                <w:bCs/>
+                <w:sz w:val="13"/>
+                <w:szCs w:val="13"/>
+                <w:lang w:val="es-EC" w:eastAsia="es-MX"/>
+              </w:rPr>
+              <w:t>ativa</w:t>
+            </w:r>
+            <w:r>
+              <w:rPr>
+                <w:rFonts w:eastAsia="Times New Roman" w:cs="Times New Roman"/>
+                <w:b/>
+                <w:bCs/>
+                <w:sz w:val="13"/>
+                <w:szCs w:val="13"/>
+                <w:lang w:val="es-EC" w:eastAsia="es-MX"/>
+              </w:rPr>
+              <w:t xml:space="preserve"> (%)</w:t>
             </w:r>
           </w:p>
         </w:tc>
@@ -3292,7 +3212,6 @@
                 <w:lang w:val="es-EC" w:eastAsia="es-MX"/>
               </w:rPr>
             </w:pPr>
-            <w:proofErr w:type="spellStart"/>
             <w:r>
               <w:rPr>
                 <w:rFonts w:eastAsia="Times New Roman" w:cs="Times New Roman"/>
@@ -3304,7 +3223,6 @@
               </w:rPr>
               <w:t>Abs</w:t>
             </w:r>
-            <w:proofErr w:type="spellEnd"/>
             <w:r>
               <w:rPr>
                 <w:rFonts w:eastAsia="Times New Roman" w:cs="Times New Roman"/>
@@ -3314,7 +3232,7 @@
                 <w:szCs w:val="13"/>
                 <w:lang w:val="es-EC" w:eastAsia="es-MX"/>
               </w:rPr>
-              <w:t>.</w:t>
+              <w:t>oluta</w:t>
             </w:r>
           </w:p>
         </w:tc>
@@ -3353,7 +3271,29 @@
                 <w:szCs w:val="13"/>
                 <w:lang w:val="es-EC" w:eastAsia="es-MX"/>
               </w:rPr>
-              <w:t>Rel. (%)</w:t>
+              <w:t>Rel</w:t>
+            </w:r>
+            <w:r>
+              <w:rPr>
+                <w:rFonts w:eastAsia="Times New Roman" w:cs="Times New Roman"/>
+                <w:b/>
+                <w:bCs/>
+                <w:sz w:val="13"/>
+                <w:szCs w:val="13"/>
+                <w:lang w:val="es-EC" w:eastAsia="es-MX"/>
+              </w:rPr>
+              <w:t>ativa</w:t>
+            </w:r>
+            <w:r>
+              <w:rPr>
+                <w:rFonts w:eastAsia="Times New Roman" w:cs="Times New Roman"/>
+                <w:b/>
+                <w:bCs/>
+                <w:sz w:val="13"/>
+                <w:szCs w:val="13"/>
+                <w:lang w:val="es-EC" w:eastAsia="es-MX"/>
+              </w:rPr>
+              <w:t xml:space="preserve"> (%)</w:t>
             </w:r>
           </w:p>
         </w:tc>
@@ -3383,7 +3323,6 @@
                 <w:lang w:val="es-EC" w:eastAsia="es-MX"/>
               </w:rPr>
             </w:pPr>
-            <w:proofErr w:type="spellStart"/>
             <w:r>
               <w:rPr>
                 <w:rFonts w:eastAsia="Times New Roman" w:cs="Times New Roman"/>
@@ -3395,7 +3334,6 @@
               </w:rPr>
               <w:t>Abs</w:t>
             </w:r>
-            <w:proofErr w:type="spellEnd"/>
             <w:r>
               <w:rPr>
                 <w:rFonts w:eastAsia="Times New Roman" w:cs="Times New Roman"/>
@@ -3405,7 +3343,7 @@
                 <w:szCs w:val="13"/>
                 <w:lang w:val="es-EC" w:eastAsia="es-MX"/>
               </w:rPr>
-              <w:t>.</w:t>
+              <w:t>oluta</w:t>
             </w:r>
           </w:p>
         </w:tc>
@@ -3444,7 +3382,29 @@
                 <w:szCs w:val="13"/>
                 <w:lang w:val="es-EC" w:eastAsia="es-MX"/>
               </w:rPr>
-              <w:t>Rel. (%)</w:t>
+              <w:t>Rel</w:t>
+            </w:r>
+            <w:r>
+              <w:rPr>
+                <w:rFonts w:eastAsia="Times New Roman" w:cs="Times New Roman"/>
+                <w:b/>
+                <w:bCs/>
+                <w:sz w:val="13"/>
+                <w:szCs w:val="13"/>
+                <w:lang w:val="es-EC" w:eastAsia="es-MX"/>
+              </w:rPr>
+              <w:t>ativa</w:t>
+            </w:r>
+            <w:r>
+              <w:rPr>
+                <w:rFonts w:eastAsia="Times New Roman" w:cs="Times New Roman"/>
+                <w:b/>
+                <w:bCs/>
+                <w:sz w:val="13"/>
+                <w:szCs w:val="13"/>
+                <w:lang w:val="es-EC" w:eastAsia="es-MX"/>
+              </w:rPr>
+              <w:t xml:space="preserve"> (%)</w:t>
             </w:r>
           </w:p>
         </w:tc>
@@ -5134,7 +5094,6 @@
             <w:docPart w:val="8463F3F54C6DD042BBB903E9E8FF24C4"/>
           </w:placeholder>
         </w:sdtPr>
-        <w:sdtEndPr/>
         <w:sdtContent>
           <w:r>
             <w:rPr>
@@ -5169,15 +5128,7 @@
           <w:szCs w:val="20"/>
           <w:lang w:val="es-US"/>
         </w:rPr>
-        <w:t xml:space="preserve">En cuanto a los cuartos trimestres de 2024 y 2025, la tasa de informalidad de la población ocupada urbana de Argentina está en el 14 %, lo que genera unos 11,5 millones de trabajadores de la formalidad y cerca de 2 millones de trabajadores de la informalidad en los mismos períodos. Si bien la variación de un año a otro es mínima, se constata un ligero empeoramiento relativo de las condiciones laborales de las mujeres, puesto que la informalidad de las mujeres es del 17,34% en 2024 y del 18,94% en 2025. Estas tasas son </w:t>
-      </w:r>
-      <w:r>
-        <w:rPr>
-          <w:szCs w:val="20"/>
-          <w:lang w:val="es-US"/>
-        </w:rPr>
-        <w:lastRenderedPageBreak/>
-        <w:t>casi el doble que las de los hombres en los mismos períodos, lo que demuestra que existe una brecha de género en el mercado de trabajo argentino, persistente y estructuralmente relevante en dimensiones como la cantidad de trabajadores.</w:t>
+        <w:t>En cuanto a los cuartos trimestres de 2024 y 2025, la tasa de informalidad de la población ocupada urbana de Argentina está en el 14 %, lo que genera unos 11,5 millones de trabajadores de la formalidad y cerca de 2 millones de trabajadores de la informalidad en los mismos períodos. Si bien la variación de un año a otro es mínima, se constata un ligero empeoramiento relativo de las condiciones laborales de las mujeres, puesto que la informalidad de las mujeres es del 17,34% en 2024 y del 18,94% en 2025. Estas tasas son casi el doble que las de los hombres en los mismos períodos, lo que demuestra que existe una brecha de género en el mercado de trabajo argentino, persistente y estructuralmente relevante en dimensiones como la cantidad de trabajadores.</w:t>
       </w:r>
     </w:p>
     <w:p>
@@ -5192,6 +5143,7 @@
           <w:szCs w:val="20"/>
           <w:lang w:val="es-US"/>
         </w:rPr>
+        <w:lastRenderedPageBreak/>
         <w:t xml:space="preserve">Este hecho </w:t>
       </w:r>
       <w:r>
@@ -5199,23 +5151,7 @@
           <w:szCs w:val="20"/>
           <w:lang w:val="es-US"/>
         </w:rPr>
-        <w:t xml:space="preserve">refleja la realidad de la desigualdad, </w:t>
-      </w:r>
-      <w:proofErr w:type="gramStart"/>
-      <w:r>
-        <w:rPr>
-          <w:szCs w:val="20"/>
-          <w:lang w:val="es-US"/>
-        </w:rPr>
-        <w:t>puesto que</w:t>
-      </w:r>
-      <w:proofErr w:type="gramEnd"/>
-      <w:r>
-        <w:rPr>
-          <w:szCs w:val="20"/>
-          <w:lang w:val="es-US"/>
-        </w:rPr>
-        <w:t xml:space="preserve"> a pesar de la difusión de valores inclusivos en las sociedades contemporáneas, el sistema económico ha mantenido cierta esencia excluyente, en la que las mujeres aún enfrentan dificultades para incorporarse plenamente al mercado laboral. Sin embargo, esta estructura inequitativa puede tener un trasfondo antropológico</w:t>
+        <w:t>refleja la realidad de la desigualdad, puesto que a pesar de la difusión de valores inclusivos en las sociedades contemporáneas, el sistema económico ha mantenido cierta esencia excluyente, en la que las mujeres aún enfrentan dificultades para incorporarse plenamente al mercado laboral. Sin embargo, esta estructura inequitativa puede tener un trasfondo antropológico</w:t>
       </w:r>
       <w:r>
         <w:rPr>
@@ -5287,9 +5223,7 @@
             <w:docPart w:val="DefaultPlaceholder_-1854013440"/>
           </w:placeholder>
         </w:sdtPr>
-        <w:sdtEndPr/>
         <w:sdtContent>
-          <w:proofErr w:type="spellStart"/>
           <w:r>
             <w:rPr>
               <w:rFonts w:cs="Times New Roman"/>
@@ -5297,17 +5231,7 @@
               <w:szCs w:val="20"/>
               <w:lang w:val="es-US"/>
             </w:rPr>
-            <w:t>Hassine</w:t>
-          </w:r>
-          <w:proofErr w:type="spellEnd"/>
-          <w:r>
-            <w:rPr>
-              <w:rFonts w:cs="Times New Roman"/>
-              <w:color w:val="000000"/>
-              <w:szCs w:val="20"/>
-              <w:lang w:val="es-US"/>
-            </w:rPr>
-            <w:t xml:space="preserve"> et al. (2025)</w:t>
+            <w:t>Hassine et al. (2025)</w:t>
           </w:r>
         </w:sdtContent>
       </w:sdt>
@@ -5647,7 +5571,6 @@
             <w:docPart w:val="451FE05DFD7ED94DA6FB5A681E896FD9"/>
           </w:placeholder>
         </w:sdtPr>
-        <w:sdtEndPr/>
         <w:sdtContent>
           <w:r>
             <w:rPr>
@@ -5786,7 +5709,6 @@
         <w:rPr>
           <w:szCs w:val="20"/>
         </w:rPr>
-        <w:lastRenderedPageBreak/>
         <w:t xml:space="preserve">Figura </w:t>
       </w:r>
       <w:r>
@@ -5923,9 +5845,9 @@
           <w:szCs w:val="20"/>
         </w:rPr>
         <w:drawing>
-          <wp:inline distT="0" distB="0" distL="0" distR="0" wp14:anchorId="363FC262" wp14:editId="300FB663">
-            <wp:extent cx="4249797" cy="2273935"/>
-            <wp:effectExtent l="0" t="0" r="5080" b="0"/>
+          <wp:inline distT="0" distB="0" distL="0" distR="0" wp14:anchorId="363FC262" wp14:editId="73AB3E17">
+            <wp:extent cx="4248658" cy="1836751"/>
+            <wp:effectExtent l="0" t="0" r="0" b="5080"/>
             <wp:docPr id="1683349730" name="Imagen 1"/>
             <wp:cNvGraphicFramePr>
               <a:graphicFrameLocks xmlns:a="http://schemas.openxmlformats.org/drawingml/2006/main" noChangeAspect="1"/>
@@ -5946,7 +5868,7 @@
                   <pic:spPr>
                     <a:xfrm>
                       <a:off x="0" y="0"/>
-                      <a:ext cx="4293081" cy="2297095"/>
+                      <a:ext cx="4305217" cy="1861202"/>
                     </a:xfrm>
                     <a:prstGeom prst="rect">
                       <a:avLst/>
@@ -6000,7 +5922,6 @@
             <w:docPart w:val="1FF1D68686A5FC438FF06500EE1D99D5"/>
           </w:placeholder>
         </w:sdtPr>
-        <w:sdtEndPr/>
         <w:sdtContent>
           <w:r>
             <w:rPr>
@@ -6035,6 +5956,7 @@
           <w:szCs w:val="20"/>
           <w:lang w:val="es-US"/>
         </w:rPr>
+        <w:lastRenderedPageBreak/>
         <w:t>La Figura 4 destaca cómo se distribuye</w:t>
       </w:r>
       <w:r>
@@ -6709,7 +6631,6 @@
           <w:szCs w:val="20"/>
           <w:lang w:val="es-US"/>
         </w:rPr>
-        <w:lastRenderedPageBreak/>
         <w:t>Prompts</w:t>
       </w:r>
       <w:proofErr w:type="spellEnd"/>
@@ -6977,7 +6898,6 @@
           <w:docPart w:val="DefaultPlaceholder_-1854013440"/>
         </w:placeholder>
       </w:sdtPr>
-      <w:sdtEndPr/>
       <w:sdtContent>
         <w:p>
           <w:pPr>
@@ -6992,7 +6912,6 @@
               <w:lang w:val="en-US"/>
             </w:rPr>
           </w:pPr>
-          <w:proofErr w:type="spellStart"/>
           <w:r>
             <w:rPr>
               <w:rFonts w:eastAsia="Times New Roman" w:cs="Times New Roman"/>
@@ -7000,17 +6919,7 @@
               <w:szCs w:val="20"/>
               <w:lang w:val="en-US"/>
             </w:rPr>
-            <w:t>Duman</w:t>
-          </w:r>
-          <w:proofErr w:type="spellEnd"/>
-          <w:r>
-            <w:rPr>
-              <w:rFonts w:eastAsia="Times New Roman" w:cs="Times New Roman"/>
-              <w:color w:val="000000"/>
-              <w:szCs w:val="20"/>
-              <w:lang w:val="en-US"/>
-            </w:rPr>
-            <w:t xml:space="preserve">, A. (2023). The Gendered Relationship Between Temporary, Informal Employment and Wages: Evidence from the Turkish Labor Market. </w:t>
+            <w:t xml:space="preserve">Duman, A. (2023). The Gendered Relationship Between Temporary, Informal Employment and Wages: Evidence from the Turkish Labor Market. </w:t>
           </w:r>
           <w:r>
             <w:rPr>
@@ -7066,7 +6975,6 @@
               <w:lang w:val="en-US"/>
             </w:rPr>
           </w:pPr>
-          <w:proofErr w:type="spellStart"/>
           <w:r>
             <w:rPr>
               <w:rFonts w:eastAsia="Times New Roman" w:cs="Times New Roman"/>
@@ -7074,17 +6982,7 @@
               <w:szCs w:val="20"/>
               <w:lang w:val="en-US"/>
             </w:rPr>
-            <w:t>Hassine</w:t>
-          </w:r>
-          <w:proofErr w:type="spellEnd"/>
-          <w:r>
-            <w:rPr>
-              <w:rFonts w:eastAsia="Times New Roman" w:cs="Times New Roman"/>
-              <w:color w:val="000000"/>
-              <w:szCs w:val="20"/>
-              <w:lang w:val="en-US"/>
-            </w:rPr>
-            <w:t xml:space="preserve">, A., </w:t>
+            <w:t xml:space="preserve">Hassine, A., </w:t>
           </w:r>
           <w:proofErr w:type="spellStart"/>
           <w:r>
@@ -7208,7 +7106,6 @@
             </w:rPr>
             <w:t xml:space="preserve"> in the world economy. </w:t>
           </w:r>
-          <w:proofErr w:type="spellStart"/>
           <w:r>
             <w:rPr>
               <w:rFonts w:eastAsia="Times New Roman" w:cs="Times New Roman"/>
@@ -7217,18 +7114,7 @@
               <w:color w:val="000000"/>
               <w:szCs w:val="20"/>
             </w:rPr>
-            <w:t>Nature</w:t>
-          </w:r>
-          <w:proofErr w:type="spellEnd"/>
-          <w:r>
-            <w:rPr>
-              <w:rFonts w:eastAsia="Times New Roman" w:cs="Times New Roman"/>
-              <w:i/>
-              <w:iCs/>
-              <w:color w:val="000000"/>
-              <w:szCs w:val="20"/>
-            </w:rPr>
-            <w:t xml:space="preserve"> </w:t>
+            <w:t xml:space="preserve">Nature </w:t>
           </w:r>
           <w:proofErr w:type="spellStart"/>
           <w:r>
@@ -7320,23 +7206,13 @@
               <w:szCs w:val="20"/>
             </w:rPr>
           </w:pPr>
-          <w:proofErr w:type="spellStart"/>
           <w:r>
             <w:rPr>
               <w:rFonts w:eastAsia="Times New Roman" w:cs="Times New Roman"/>
               <w:color w:val="000000"/>
               <w:szCs w:val="20"/>
             </w:rPr>
-            <w:t>Maurizio</w:t>
-          </w:r>
-          <w:proofErr w:type="spellEnd"/>
-          <w:r>
-            <w:rPr>
-              <w:rFonts w:eastAsia="Times New Roman" w:cs="Times New Roman"/>
-              <w:color w:val="000000"/>
-              <w:szCs w:val="20"/>
-            </w:rPr>
-            <w:t xml:space="preserve">, R., y Monsalvo, A. P. (2021). </w:t>
+            <w:t xml:space="preserve">Maurizio, R., y Monsalvo, A. P. (2021). </w:t>
           </w:r>
           <w:r>
             <w:rPr>
@@ -7398,25 +7274,7 @@
               <w:color w:val="000000"/>
               <w:szCs w:val="20"/>
             </w:rPr>
-            <w:t xml:space="preserve"> </w:t>
-          </w:r>
-          <w:proofErr w:type="spellStart"/>
-          <w:r>
-            <w:rPr>
-              <w:rFonts w:eastAsia="Times New Roman" w:cs="Times New Roman"/>
-              <w:color w:val="000000"/>
-              <w:szCs w:val="20"/>
-            </w:rPr>
-            <w:t>Nations</w:t>
-          </w:r>
-          <w:proofErr w:type="spellEnd"/>
-          <w:r>
-            <w:rPr>
-              <w:rFonts w:eastAsia="Times New Roman" w:cs="Times New Roman"/>
-              <w:color w:val="000000"/>
-              <w:szCs w:val="20"/>
-            </w:rPr>
-            <w:t>. https://doi.org/10.35188/UNU-WIDER/2021/953-2</w:t>
+            <w:t xml:space="preserve"> Nations. https://doi.org/10.35188/UNU-WIDER/2021/953-2</w:t>
           </w:r>
         </w:p>
         <w:p>
@@ -9210,25 +9068,7 @@
           <w:szCs w:val="20"/>
           <w:lang w:val="es-US"/>
         </w:rPr>
-        <w:t xml:space="preserve"> y respeta los siguiente niveles (1=Pareja (&lt;3</w:t>
-      </w:r>
-      <w:proofErr w:type="gramStart"/>
-      <w:r>
-        <w:rPr>
-          <w:sz w:val="20"/>
-          <w:szCs w:val="20"/>
-          <w:lang w:val="es-US"/>
-        </w:rPr>
-        <w:t>) ;</w:t>
-      </w:r>
-      <w:proofErr w:type="gramEnd"/>
-      <w:r>
-        <w:rPr>
-          <w:sz w:val="20"/>
-          <w:szCs w:val="20"/>
-          <w:lang w:val="es-US"/>
-        </w:rPr>
-        <w:t xml:space="preserve"> 2=Sin pareja (&gt;=3)), NIVEL_ED será nivel_ed2 (1=</w:t>
+        <w:t xml:space="preserve"> y respeta los siguiente niveles (1=Pareja (&lt;3) ; 2=Sin pareja (&gt;=3)), NIVEL_ED será nivel_ed2 (1=</w:t>
       </w:r>
       <w:proofErr w:type="spellStart"/>
       <w:r>
@@ -9445,25 +9285,7 @@
           <w:szCs w:val="20"/>
           <w:lang w:val="es-US"/>
         </w:rPr>
-        <w:t xml:space="preserve">gráfico: </w:t>
-      </w:r>
-      <w:proofErr w:type="spellStart"/>
-      <w:r>
-        <w:rPr>
-          <w:sz w:val="20"/>
-          <w:szCs w:val="20"/>
-          <w:lang w:val="es-US"/>
-        </w:rPr>
-        <w:t>como</w:t>
-      </w:r>
-      <w:proofErr w:type="spellEnd"/>
-      <w:r>
-        <w:rPr>
-          <w:sz w:val="20"/>
-          <w:szCs w:val="20"/>
-          <w:lang w:val="es-US"/>
-        </w:rPr>
-        <w:t xml:space="preserve"> puedes ver, tiene la leyenda en la parte superior derecha, debajo del título; los ejes son claros; no están sobrecargados. En general,</w:t>
+        <w:t>gráfico: como puedes ver, tiene la leyenda en la parte superior derecha, debajo del título; los ejes son claros; no están sobrecargados. En general,</w:t>
       </w:r>
       <w:r>
         <w:rPr>
@@ -9537,43 +9359,7 @@
           <w:szCs w:val="20"/>
           <w:lang w:val="es-US"/>
         </w:rPr>
-        <w:t xml:space="preserve">, donde se contabilice el número de </w:t>
-      </w:r>
-      <w:proofErr w:type="spellStart"/>
-      <w:r>
-        <w:rPr>
-          <w:sz w:val="20"/>
-          <w:szCs w:val="20"/>
-          <w:lang w:val="es-US"/>
-        </w:rPr>
-        <w:t>NaN</w:t>
-      </w:r>
-      <w:proofErr w:type="spellEnd"/>
-      <w:r>
-        <w:rPr>
-          <w:sz w:val="20"/>
-          <w:szCs w:val="20"/>
-          <w:lang w:val="es-US"/>
-        </w:rPr>
-        <w:t xml:space="preserve">; mientras más proporción de </w:t>
-      </w:r>
-      <w:proofErr w:type="spellStart"/>
-      <w:r>
-        <w:rPr>
-          <w:sz w:val="20"/>
-          <w:szCs w:val="20"/>
-          <w:lang w:val="es-US"/>
-        </w:rPr>
-        <w:t>NaN</w:t>
-      </w:r>
-      <w:proofErr w:type="spellEnd"/>
-      <w:r>
-        <w:rPr>
-          <w:sz w:val="20"/>
-          <w:szCs w:val="20"/>
-          <w:lang w:val="es-US"/>
-        </w:rPr>
-        <w:t xml:space="preserve"> tenga, más oscuro debe ser el color. Recuerda</w:t>
+        <w:t>, donde se contabilice el número de NaN; mientras más proporción de NaN tenga, más oscuro debe ser el color. Recuerda</w:t>
       </w:r>
       <w:r>
         <w:rPr>
@@ -9881,34 +9667,16 @@
           <w:szCs w:val="20"/>
           <w:lang w:val="es-US"/>
         </w:rPr>
-        <w:t xml:space="preserve">Deseo realizar una tabla descriptiva con todas las variables de mi base, excluyendo </w:t>
-      </w:r>
-      <w:proofErr w:type="gramStart"/>
+        <w:t xml:space="preserve">Deseo realizar una tabla descriptiva con todas las variables de mi base, excluyendo ( </w:t>
+      </w:r>
+      <w:proofErr w:type="spellStart"/>
       <w:r>
         <w:rPr>
           <w:sz w:val="20"/>
           <w:szCs w:val="20"/>
           <w:lang w:val="es-US"/>
         </w:rPr>
-        <w:t xml:space="preserve">( </w:t>
-      </w:r>
-      <w:proofErr w:type="spellStart"/>
-      <w:r>
-        <w:rPr>
-          <w:sz w:val="20"/>
-          <w:szCs w:val="20"/>
-          <w:lang w:val="es-US"/>
-        </w:rPr>
-        <w:t>cod</w:t>
-      </w:r>
-      <w:proofErr w:type="gramEnd"/>
-      <w:r>
-        <w:rPr>
-          <w:sz w:val="20"/>
-          <w:szCs w:val="20"/>
-          <w:lang w:val="es-US"/>
-        </w:rPr>
-        <w:t>_vivienda</w:t>
+        <w:t>cod_vivienda</w:t>
       </w:r>
       <w:proofErr w:type="spellEnd"/>
       <w:r>
@@ -10034,7 +9802,7 @@
 </file>
 
 <file path=word/endnotes.xml><?xml version="1.0" encoding="utf-8"?>
-<w:endnotes xmlns:wpc="http://schemas.microsoft.com/office/word/2010/wordprocessingCanvas" xmlns:cx="http://schemas.microsoft.com/office/drawing/2014/chartex" xmlns:cx1="http://schemas.microsoft.com/office/drawing/2015/9/8/chartex" xmlns:cx2="http://schemas.microsoft.com/office/drawing/2015/10/21/chartex" xmlns:cx3="http://schemas.microsoft.com/office/drawing/2016/5/9/chartex" xmlns:cx4="http://schemas.microsoft.com/office/drawing/2016/5/10/chartex" xmlns:cx5="http://schemas.microsoft.com/office/drawing/2016/5/11/chartex" xmlns:cx6="http://schemas.microsoft.com/office/drawing/2016/5/12/chartex" xmlns:cx7="http://schemas.microsoft.com/office/drawing/2016/5/13/chartex" xmlns:cx8="http://schemas.microsoft.com/office/drawing/2016/5/14/chartex" xmlns:mc="http://schemas.openxmlformats.org/markup-compatibility/2006" xmlns:aink="http://schemas.microsoft.com/office/drawing/2016/ink" xmlns:am3d="http://schemas.microsoft.com/office/drawing/2017/model3d" xmlns:o="urn:schemas-microsoft-com:office:office" xmlns:r="http://schemas.openxmlformats.org/officeDocument/2006/relationships" xmlns:m="http://schemas.openxmlformats.org/officeDocument/2006/math" xmlns:v="urn:schemas-microsoft-com:vml" xmlns:wp14="http://schemas.microsoft.com/office/word/2010/wordprocessingDrawing" xmlns:wp="http://schemas.openxmlformats.org/drawingml/2006/wordprocessingDrawing" xmlns:w10="urn:schemas-microsoft-com:office:word" xmlns:w="http://schemas.openxmlformats.org/wordprocessingml/2006/main" xmlns:w14="http://schemas.microsoft.com/office/word/2010/wordml" xmlns:w15="http://schemas.microsoft.com/office/word/2012/wordml" xmlns:w16cex="http://schemas.microsoft.com/office/word/2018/wordml/cex" xmlns:w16cid="http://schemas.microsoft.com/office/word/2016/wordml/cid" xmlns:w16="http://schemas.microsoft.com/office/word/2018/wordml" xmlns:w16sdtdh="http://schemas.microsoft.com/office/word/2020/wordml/sdtdatahash" xmlns:w16se="http://schemas.microsoft.com/office/word/2015/wordml/symex" xmlns:wpg="http://schemas.microsoft.com/office/word/2010/wordprocessingGroup" xmlns:wpi="http://schemas.microsoft.com/office/word/2010/wordprocessingInk" xmlns:wne="http://schemas.microsoft.com/office/word/2006/wordml" xmlns:wps="http://schemas.microsoft.com/office/word/2010/wordprocessingShape" mc:Ignorable="w14 w15 w16se w16cid w16 w16cex w16sdtdh wp14">
+<w:endnotes xmlns:wpc="http://schemas.microsoft.com/office/word/2010/wordprocessingCanvas" xmlns:cx="http://schemas.microsoft.com/office/drawing/2014/chartex" xmlns:cx1="http://schemas.microsoft.com/office/drawing/2015/9/8/chartex" xmlns:cx2="http://schemas.microsoft.com/office/drawing/2015/10/21/chartex" xmlns:cx3="http://schemas.microsoft.com/office/drawing/2016/5/9/chartex" xmlns:cx4="http://schemas.microsoft.com/office/drawing/2016/5/10/chartex" xmlns:cx5="http://schemas.microsoft.com/office/drawing/2016/5/11/chartex" xmlns:cx6="http://schemas.microsoft.com/office/drawing/2016/5/12/chartex" xmlns:cx7="http://schemas.microsoft.com/office/drawing/2016/5/13/chartex" xmlns:cx8="http://schemas.microsoft.com/office/drawing/2016/5/14/chartex" xmlns:mc="http://schemas.openxmlformats.org/markup-compatibility/2006" xmlns:aink="http://schemas.microsoft.com/office/drawing/2016/ink" xmlns:am3d="http://schemas.microsoft.com/office/drawing/2017/model3d" xmlns:o="urn:schemas-microsoft-com:office:office" xmlns:oel="http://schemas.microsoft.com/office/2019/extlst" xmlns:r="http://schemas.openxmlformats.org/officeDocument/2006/relationships" xmlns:m="http://schemas.openxmlformats.org/officeDocument/2006/math" xmlns:v="urn:schemas-microsoft-com:vml" xmlns:wp14="http://schemas.microsoft.com/office/word/2010/wordprocessingDrawing" xmlns:wp="http://schemas.openxmlformats.org/drawingml/2006/wordprocessingDrawing" xmlns:w10="urn:schemas-microsoft-com:office:word" xmlns:w="http://schemas.openxmlformats.org/wordprocessingml/2006/main" xmlns:w14="http://schemas.microsoft.com/office/word/2010/wordml" xmlns:w15="http://schemas.microsoft.com/office/word/2012/wordml" xmlns:w16cex="http://schemas.microsoft.com/office/word/2018/wordml/cex" xmlns:w16cid="http://schemas.microsoft.com/office/word/2016/wordml/cid" xmlns:w16="http://schemas.microsoft.com/office/word/2018/wordml" xmlns:w16du="http://schemas.microsoft.com/office/word/2023/wordml/word16du" xmlns:w16sdtdh="http://schemas.microsoft.com/office/word/2020/wordml/sdtdatahash" xmlns:w16sdtfl="http://schemas.microsoft.com/office/word/2024/wordml/sdtformatlock" xmlns:w16se="http://schemas.microsoft.com/office/word/2015/wordml/symex" xmlns:wpg="http://schemas.microsoft.com/office/word/2010/wordprocessingGroup" xmlns:wpi="http://schemas.microsoft.com/office/word/2010/wordprocessingInk" xmlns:wne="http://schemas.microsoft.com/office/word/2006/wordml" xmlns:wps="http://schemas.microsoft.com/office/word/2010/wordprocessingShape" mc:Ignorable="w14 w15 w16se w16cid w16 w16cex w16sdtdh w16sdtfl w16du wp14">
   <w:endnote w:type="separator" w:id="-1">
     <w:p>
       <w:pPr>
@@ -10059,7 +9827,7 @@
 </file>
 
 <file path=word/footer1.xml><?xml version="1.0" encoding="utf-8"?>
-<w:ftr xmlns:wpc="http://schemas.microsoft.com/office/word/2010/wordprocessingCanvas" xmlns:cx="http://schemas.microsoft.com/office/drawing/2014/chartex" xmlns:cx1="http://schemas.microsoft.com/office/drawing/2015/9/8/chartex" xmlns:cx2="http://schemas.microsoft.com/office/drawing/2015/10/21/chartex" xmlns:cx3="http://schemas.microsoft.com/office/drawing/2016/5/9/chartex" xmlns:cx4="http://schemas.microsoft.com/office/drawing/2016/5/10/chartex" xmlns:cx5="http://schemas.microsoft.com/office/drawing/2016/5/11/chartex" xmlns:cx6="http://schemas.microsoft.com/office/drawing/2016/5/12/chartex" xmlns:cx7="http://schemas.microsoft.com/office/drawing/2016/5/13/chartex" xmlns:cx8="http://schemas.microsoft.com/office/drawing/2016/5/14/chartex" xmlns:mc="http://schemas.openxmlformats.org/markup-compatibility/2006" xmlns:aink="http://schemas.microsoft.com/office/drawing/2016/ink" xmlns:am3d="http://schemas.microsoft.com/office/drawing/2017/model3d" xmlns:o="urn:schemas-microsoft-com:office:office" xmlns:r="http://schemas.openxmlformats.org/officeDocument/2006/relationships" xmlns:m="http://schemas.openxmlformats.org/officeDocument/2006/math" xmlns:v="urn:schemas-microsoft-com:vml" xmlns:wp14="http://schemas.microsoft.com/office/word/2010/wordprocessingDrawing" xmlns:wp="http://schemas.openxmlformats.org/drawingml/2006/wordprocessingDrawing" xmlns:w10="urn:schemas-microsoft-com:office:word" xmlns:w="http://schemas.openxmlformats.org/wordprocessingml/2006/main" xmlns:w14="http://schemas.microsoft.com/office/word/2010/wordml" xmlns:w15="http://schemas.microsoft.com/office/word/2012/wordml" xmlns:w16cex="http://schemas.microsoft.com/office/word/2018/wordml/cex" xmlns:w16cid="http://schemas.microsoft.com/office/word/2016/wordml/cid" xmlns:w16="http://schemas.microsoft.com/office/word/2018/wordml" xmlns:w16sdtdh="http://schemas.microsoft.com/office/word/2020/wordml/sdtdatahash" xmlns:w16se="http://schemas.microsoft.com/office/word/2015/wordml/symex" xmlns:wpg="http://schemas.microsoft.com/office/word/2010/wordprocessingGroup" xmlns:wpi="http://schemas.microsoft.com/office/word/2010/wordprocessingInk" xmlns:wne="http://schemas.microsoft.com/office/word/2006/wordml" xmlns:wps="http://schemas.microsoft.com/office/word/2010/wordprocessingShape" mc:Ignorable="w14 w15 w16se w16cid w16 w16cex w16sdtdh wp14">
+<w:ftr xmlns:wpc="http://schemas.microsoft.com/office/word/2010/wordprocessingCanvas" xmlns:cx="http://schemas.microsoft.com/office/drawing/2014/chartex" xmlns:cx1="http://schemas.microsoft.com/office/drawing/2015/9/8/chartex" xmlns:cx2="http://schemas.microsoft.com/office/drawing/2015/10/21/chartex" xmlns:cx3="http://schemas.microsoft.com/office/drawing/2016/5/9/chartex" xmlns:cx4="http://schemas.microsoft.com/office/drawing/2016/5/10/chartex" xmlns:cx5="http://schemas.microsoft.com/office/drawing/2016/5/11/chartex" xmlns:cx6="http://schemas.microsoft.com/office/drawing/2016/5/12/chartex" xmlns:cx7="http://schemas.microsoft.com/office/drawing/2016/5/13/chartex" xmlns:cx8="http://schemas.microsoft.com/office/drawing/2016/5/14/chartex" xmlns:mc="http://schemas.openxmlformats.org/markup-compatibility/2006" xmlns:aink="http://schemas.microsoft.com/office/drawing/2016/ink" xmlns:am3d="http://schemas.microsoft.com/office/drawing/2017/model3d" xmlns:o="urn:schemas-microsoft-com:office:office" xmlns:oel="http://schemas.microsoft.com/office/2019/extlst" xmlns:r="http://schemas.openxmlformats.org/officeDocument/2006/relationships" xmlns:m="http://schemas.openxmlformats.org/officeDocument/2006/math" xmlns:v="urn:schemas-microsoft-com:vml" xmlns:wp14="http://schemas.microsoft.com/office/word/2010/wordprocessingDrawing" xmlns:wp="http://schemas.openxmlformats.org/drawingml/2006/wordprocessingDrawing" xmlns:w10="urn:schemas-microsoft-com:office:word" xmlns:w="http://schemas.openxmlformats.org/wordprocessingml/2006/main" xmlns:w14="http://schemas.microsoft.com/office/word/2010/wordml" xmlns:w15="http://schemas.microsoft.com/office/word/2012/wordml" xmlns:w16cex="http://schemas.microsoft.com/office/word/2018/wordml/cex" xmlns:w16cid="http://schemas.microsoft.com/office/word/2016/wordml/cid" xmlns:w16="http://schemas.microsoft.com/office/word/2018/wordml" xmlns:w16du="http://schemas.microsoft.com/office/word/2023/wordml/word16du" xmlns:w16sdtdh="http://schemas.microsoft.com/office/word/2020/wordml/sdtdatahash" xmlns:w16sdtfl="http://schemas.microsoft.com/office/word/2024/wordml/sdtformatlock" xmlns:w16se="http://schemas.microsoft.com/office/word/2015/wordml/symex" xmlns:wpg="http://schemas.microsoft.com/office/word/2010/wordprocessingGroup" xmlns:wpi="http://schemas.microsoft.com/office/word/2010/wordprocessingInk" xmlns:wne="http://schemas.microsoft.com/office/word/2006/wordml" xmlns:wps="http://schemas.microsoft.com/office/word/2010/wordprocessingShape" mc:Ignorable="w14 w15 w16se w16cid w16 w16cex w16sdtdh w16sdtfl w16du wp14">
   <w:sdt>
     <w:sdtPr>
       <w:rPr>
@@ -10071,11 +9839,6 @@
         <w:docPartUnique/>
       </w:docPartObj>
     </w:sdtPr>
-    <w:sdtEndPr>
-      <w:rPr>
-        <w:rStyle w:val="Nmerodepgina"/>
-      </w:rPr>
-    </w:sdtEndPr>
     <w:sdtContent>
       <w:p>
         <w:pPr>
@@ -10121,7 +9884,7 @@
 </file>
 
 <file path=word/footer2.xml><?xml version="1.0" encoding="utf-8"?>
-<w:ftr xmlns:wpc="http://schemas.microsoft.com/office/word/2010/wordprocessingCanvas" xmlns:cx="http://schemas.microsoft.com/office/drawing/2014/chartex" xmlns:cx1="http://schemas.microsoft.com/office/drawing/2015/9/8/chartex" xmlns:cx2="http://schemas.microsoft.com/office/drawing/2015/10/21/chartex" xmlns:cx3="http://schemas.microsoft.com/office/drawing/2016/5/9/chartex" xmlns:cx4="http://schemas.microsoft.com/office/drawing/2016/5/10/chartex" xmlns:cx5="http://schemas.microsoft.com/office/drawing/2016/5/11/chartex" xmlns:cx6="http://schemas.microsoft.com/office/drawing/2016/5/12/chartex" xmlns:cx7="http://schemas.microsoft.com/office/drawing/2016/5/13/chartex" xmlns:cx8="http://schemas.microsoft.com/office/drawing/2016/5/14/chartex" xmlns:mc="http://schemas.openxmlformats.org/markup-compatibility/2006" xmlns:aink="http://schemas.microsoft.com/office/drawing/2016/ink" xmlns:am3d="http://schemas.microsoft.com/office/drawing/2017/model3d" xmlns:o="urn:schemas-microsoft-com:office:office" xmlns:r="http://schemas.openxmlformats.org/officeDocument/2006/relationships" xmlns:m="http://schemas.openxmlformats.org/officeDocument/2006/math" xmlns:v="urn:schemas-microsoft-com:vml" xmlns:wp14="http://schemas.microsoft.com/office/word/2010/wordprocessingDrawing" xmlns:wp="http://schemas.openxmlformats.org/drawingml/2006/wordprocessingDrawing" xmlns:w10="urn:schemas-microsoft-com:office:word" xmlns:w="http://schemas.openxmlformats.org/wordprocessingml/2006/main" xmlns:w14="http://schemas.microsoft.com/office/word/2010/wordml" xmlns:w15="http://schemas.microsoft.com/office/word/2012/wordml" xmlns:w16cex="http://schemas.microsoft.com/office/word/2018/wordml/cex" xmlns:w16cid="http://schemas.microsoft.com/office/word/2016/wordml/cid" xmlns:w16="http://schemas.microsoft.com/office/word/2018/wordml" xmlns:w16sdtdh="http://schemas.microsoft.com/office/word/2020/wordml/sdtdatahash" xmlns:w16se="http://schemas.microsoft.com/office/word/2015/wordml/symex" xmlns:wpg="http://schemas.microsoft.com/office/word/2010/wordprocessingGroup" xmlns:wpi="http://schemas.microsoft.com/office/word/2010/wordprocessingInk" xmlns:wne="http://schemas.microsoft.com/office/word/2006/wordml" xmlns:wps="http://schemas.microsoft.com/office/word/2010/wordprocessingShape" mc:Ignorable="w14 w15 w16se w16cid w16 w16cex w16sdtdh wp14">
+<w:ftr xmlns:wpc="http://schemas.microsoft.com/office/word/2010/wordprocessingCanvas" xmlns:cx="http://schemas.microsoft.com/office/drawing/2014/chartex" xmlns:cx1="http://schemas.microsoft.com/office/drawing/2015/9/8/chartex" xmlns:cx2="http://schemas.microsoft.com/office/drawing/2015/10/21/chartex" xmlns:cx3="http://schemas.microsoft.com/office/drawing/2016/5/9/chartex" xmlns:cx4="http://schemas.microsoft.com/office/drawing/2016/5/10/chartex" xmlns:cx5="http://schemas.microsoft.com/office/drawing/2016/5/11/chartex" xmlns:cx6="http://schemas.microsoft.com/office/drawing/2016/5/12/chartex" xmlns:cx7="http://schemas.microsoft.com/office/drawing/2016/5/13/chartex" xmlns:cx8="http://schemas.microsoft.com/office/drawing/2016/5/14/chartex" xmlns:mc="http://schemas.openxmlformats.org/markup-compatibility/2006" xmlns:aink="http://schemas.microsoft.com/office/drawing/2016/ink" xmlns:am3d="http://schemas.microsoft.com/office/drawing/2017/model3d" xmlns:o="urn:schemas-microsoft-com:office:office" xmlns:oel="http://schemas.microsoft.com/office/2019/extlst" xmlns:r="http://schemas.openxmlformats.org/officeDocument/2006/relationships" xmlns:m="http://schemas.openxmlformats.org/officeDocument/2006/math" xmlns:v="urn:schemas-microsoft-com:vml" xmlns:wp14="http://schemas.microsoft.com/office/word/2010/wordprocessingDrawing" xmlns:wp="http://schemas.openxmlformats.org/drawingml/2006/wordprocessingDrawing" xmlns:w10="urn:schemas-microsoft-com:office:word" xmlns:w="http://schemas.openxmlformats.org/wordprocessingml/2006/main" xmlns:w14="http://schemas.microsoft.com/office/word/2010/wordml" xmlns:w15="http://schemas.microsoft.com/office/word/2012/wordml" xmlns:w16cex="http://schemas.microsoft.com/office/word/2018/wordml/cex" xmlns:w16cid="http://schemas.microsoft.com/office/word/2016/wordml/cid" xmlns:w16="http://schemas.microsoft.com/office/word/2018/wordml" xmlns:w16du="http://schemas.microsoft.com/office/word/2023/wordml/word16du" xmlns:w16sdtdh="http://schemas.microsoft.com/office/word/2020/wordml/sdtdatahash" xmlns:w16sdtfl="http://schemas.microsoft.com/office/word/2024/wordml/sdtformatlock" xmlns:w16se="http://schemas.microsoft.com/office/word/2015/wordml/symex" xmlns:wpg="http://schemas.microsoft.com/office/word/2010/wordprocessingGroup" xmlns:wpi="http://schemas.microsoft.com/office/word/2010/wordprocessingInk" xmlns:wne="http://schemas.microsoft.com/office/word/2006/wordml" xmlns:wps="http://schemas.microsoft.com/office/word/2010/wordprocessingShape" mc:Ignorable="w14 w15 w16se w16cid w16 w16cex w16sdtdh w16sdtfl w16du wp14">
   <w:p>
     <w:pPr>
       <w:pStyle w:val="Piedepgina"/>
@@ -10140,7 +9903,7 @@
 </file>
 
 <file path=word/footer3.xml><?xml version="1.0" encoding="utf-8"?>
-<w:ftr xmlns:wpc="http://schemas.microsoft.com/office/word/2010/wordprocessingCanvas" xmlns:cx="http://schemas.microsoft.com/office/drawing/2014/chartex" xmlns:cx1="http://schemas.microsoft.com/office/drawing/2015/9/8/chartex" xmlns:cx2="http://schemas.microsoft.com/office/drawing/2015/10/21/chartex" xmlns:cx3="http://schemas.microsoft.com/office/drawing/2016/5/9/chartex" xmlns:cx4="http://schemas.microsoft.com/office/drawing/2016/5/10/chartex" xmlns:cx5="http://schemas.microsoft.com/office/drawing/2016/5/11/chartex" xmlns:cx6="http://schemas.microsoft.com/office/drawing/2016/5/12/chartex" xmlns:cx7="http://schemas.microsoft.com/office/drawing/2016/5/13/chartex" xmlns:cx8="http://schemas.microsoft.com/office/drawing/2016/5/14/chartex" xmlns:mc="http://schemas.openxmlformats.org/markup-compatibility/2006" xmlns:aink="http://schemas.microsoft.com/office/drawing/2016/ink" xmlns:am3d="http://schemas.microsoft.com/office/drawing/2017/model3d" xmlns:o="urn:schemas-microsoft-com:office:office" xmlns:r="http://schemas.openxmlformats.org/officeDocument/2006/relationships" xmlns:m="http://schemas.openxmlformats.org/officeDocument/2006/math" xmlns:v="urn:schemas-microsoft-com:vml" xmlns:wp14="http://schemas.microsoft.com/office/word/2010/wordprocessingDrawing" xmlns:wp="http://schemas.openxmlformats.org/drawingml/2006/wordprocessingDrawing" xmlns:w10="urn:schemas-microsoft-com:office:word" xmlns:w="http://schemas.openxmlformats.org/wordprocessingml/2006/main" xmlns:w14="http://schemas.microsoft.com/office/word/2010/wordml" xmlns:w15="http://schemas.microsoft.com/office/word/2012/wordml" xmlns:w16cex="http://schemas.microsoft.com/office/word/2018/wordml/cex" xmlns:w16cid="http://schemas.microsoft.com/office/word/2016/wordml/cid" xmlns:w16="http://schemas.microsoft.com/office/word/2018/wordml" xmlns:w16sdtdh="http://schemas.microsoft.com/office/word/2020/wordml/sdtdatahash" xmlns:w16se="http://schemas.microsoft.com/office/word/2015/wordml/symex" xmlns:wpg="http://schemas.microsoft.com/office/word/2010/wordprocessingGroup" xmlns:wpi="http://schemas.microsoft.com/office/word/2010/wordprocessingInk" xmlns:wne="http://schemas.microsoft.com/office/word/2006/wordml" xmlns:wps="http://schemas.microsoft.com/office/word/2010/wordprocessingShape" mc:Ignorable="w14 w15 w16se w16cid w16 w16cex w16sdtdh wp14">
+<w:ftr xmlns:wpc="http://schemas.microsoft.com/office/word/2010/wordprocessingCanvas" xmlns:cx="http://schemas.microsoft.com/office/drawing/2014/chartex" xmlns:cx1="http://schemas.microsoft.com/office/drawing/2015/9/8/chartex" xmlns:cx2="http://schemas.microsoft.com/office/drawing/2015/10/21/chartex" xmlns:cx3="http://schemas.microsoft.com/office/drawing/2016/5/9/chartex" xmlns:cx4="http://schemas.microsoft.com/office/drawing/2016/5/10/chartex" xmlns:cx5="http://schemas.microsoft.com/office/drawing/2016/5/11/chartex" xmlns:cx6="http://schemas.microsoft.com/office/drawing/2016/5/12/chartex" xmlns:cx7="http://schemas.microsoft.com/office/drawing/2016/5/13/chartex" xmlns:cx8="http://schemas.microsoft.com/office/drawing/2016/5/14/chartex" xmlns:mc="http://schemas.openxmlformats.org/markup-compatibility/2006" xmlns:aink="http://schemas.microsoft.com/office/drawing/2016/ink" xmlns:am3d="http://schemas.microsoft.com/office/drawing/2017/model3d" xmlns:o="urn:schemas-microsoft-com:office:office" xmlns:oel="http://schemas.microsoft.com/office/2019/extlst" xmlns:r="http://schemas.openxmlformats.org/officeDocument/2006/relationships" xmlns:m="http://schemas.openxmlformats.org/officeDocument/2006/math" xmlns:v="urn:schemas-microsoft-com:vml" xmlns:wp14="http://schemas.microsoft.com/office/word/2010/wordprocessingDrawing" xmlns:wp="http://schemas.openxmlformats.org/drawingml/2006/wordprocessingDrawing" xmlns:w10="urn:schemas-microsoft-com:office:word" xmlns:w="http://schemas.openxmlformats.org/wordprocessingml/2006/main" xmlns:w14="http://schemas.microsoft.com/office/word/2010/wordml" xmlns:w15="http://schemas.microsoft.com/office/word/2012/wordml" xmlns:w16cex="http://schemas.microsoft.com/office/word/2018/wordml/cex" xmlns:w16cid="http://schemas.microsoft.com/office/word/2016/wordml/cid" xmlns:w16="http://schemas.microsoft.com/office/word/2018/wordml" xmlns:w16du="http://schemas.microsoft.com/office/word/2023/wordml/word16du" xmlns:w16sdtdh="http://schemas.microsoft.com/office/word/2020/wordml/sdtdatahash" xmlns:w16sdtfl="http://schemas.microsoft.com/office/word/2024/wordml/sdtformatlock" xmlns:w16se="http://schemas.microsoft.com/office/word/2015/wordml/symex" xmlns:wpg="http://schemas.microsoft.com/office/word/2010/wordprocessingGroup" xmlns:wpi="http://schemas.microsoft.com/office/word/2010/wordprocessingInk" xmlns:wne="http://schemas.microsoft.com/office/word/2006/wordml" xmlns:wps="http://schemas.microsoft.com/office/word/2010/wordprocessingShape" mc:Ignorable="w14 w15 w16se w16cid w16 w16cex w16sdtdh w16sdtfl w16du wp14">
   <w:sdt>
     <w:sdtPr>
       <w:rPr>
@@ -10152,11 +9915,6 @@
         <w:docPartUnique/>
       </w:docPartObj>
     </w:sdtPr>
-    <w:sdtEndPr>
-      <w:rPr>
-        <w:rStyle w:val="Nmerodepgina"/>
-      </w:rPr>
-    </w:sdtEndPr>
     <w:sdtContent>
       <w:p>
         <w:pPr>
@@ -10209,7 +9967,7 @@
 </file>
 
 <file path=word/footnotes.xml><?xml version="1.0" encoding="utf-8"?>
-<w:footnotes xmlns:wpc="http://schemas.microsoft.com/office/word/2010/wordprocessingCanvas" xmlns:cx="http://schemas.microsoft.com/office/drawing/2014/chartex" xmlns:cx1="http://schemas.microsoft.com/office/drawing/2015/9/8/chartex" xmlns:cx2="http://schemas.microsoft.com/office/drawing/2015/10/21/chartex" xmlns:cx3="http://schemas.microsoft.com/office/drawing/2016/5/9/chartex" xmlns:cx4="http://schemas.microsoft.com/office/drawing/2016/5/10/chartex" xmlns:cx5="http://schemas.microsoft.com/office/drawing/2016/5/11/chartex" xmlns:cx6="http://schemas.microsoft.com/office/drawing/2016/5/12/chartex" xmlns:cx7="http://schemas.microsoft.com/office/drawing/2016/5/13/chartex" xmlns:cx8="http://schemas.microsoft.com/office/drawing/2016/5/14/chartex" xmlns:mc="http://schemas.openxmlformats.org/markup-compatibility/2006" xmlns:aink="http://schemas.microsoft.com/office/drawing/2016/ink" xmlns:am3d="http://schemas.microsoft.com/office/drawing/2017/model3d" xmlns:o="urn:schemas-microsoft-com:office:office" xmlns:r="http://schemas.openxmlformats.org/officeDocument/2006/relationships" xmlns:m="http://schemas.openxmlformats.org/officeDocument/2006/math" xmlns:v="urn:schemas-microsoft-com:vml" xmlns:wp14="http://schemas.microsoft.com/office/word/2010/wordprocessingDrawing" xmlns:wp="http://schemas.openxmlformats.org/drawingml/2006/wordprocessingDrawing" xmlns:w10="urn:schemas-microsoft-com:office:word" xmlns:w="http://schemas.openxmlformats.org/wordprocessingml/2006/main" xmlns:w14="http://schemas.microsoft.com/office/word/2010/wordml" xmlns:w15="http://schemas.microsoft.com/office/word/2012/wordml" xmlns:w16cex="http://schemas.microsoft.com/office/word/2018/wordml/cex" xmlns:w16cid="http://schemas.microsoft.com/office/word/2016/wordml/cid" xmlns:w16="http://schemas.microsoft.com/office/word/2018/wordml" xmlns:w16sdtdh="http://schemas.microsoft.com/office/word/2020/wordml/sdtdatahash" xmlns:w16se="http://schemas.microsoft.com/office/word/2015/wordml/symex" xmlns:wpg="http://schemas.microsoft.com/office/word/2010/wordprocessingGroup" xmlns:wpi="http://schemas.microsoft.com/office/word/2010/wordprocessingInk" xmlns:wne="http://schemas.microsoft.com/office/word/2006/wordml" xmlns:wps="http://schemas.microsoft.com/office/word/2010/wordprocessingShape" mc:Ignorable="w14 w15 w16se w16cid w16 w16cex w16sdtdh wp14">
+<w:footnotes xmlns:wpc="http://schemas.microsoft.com/office/word/2010/wordprocessingCanvas" xmlns:cx="http://schemas.microsoft.com/office/drawing/2014/chartex" xmlns:cx1="http://schemas.microsoft.com/office/drawing/2015/9/8/chartex" xmlns:cx2="http://schemas.microsoft.com/office/drawing/2015/10/21/chartex" xmlns:cx3="http://schemas.microsoft.com/office/drawing/2016/5/9/chartex" xmlns:cx4="http://schemas.microsoft.com/office/drawing/2016/5/10/chartex" xmlns:cx5="http://schemas.microsoft.com/office/drawing/2016/5/11/chartex" xmlns:cx6="http://schemas.microsoft.com/office/drawing/2016/5/12/chartex" xmlns:cx7="http://schemas.microsoft.com/office/drawing/2016/5/13/chartex" xmlns:cx8="http://schemas.microsoft.com/office/drawing/2016/5/14/chartex" xmlns:mc="http://schemas.openxmlformats.org/markup-compatibility/2006" xmlns:aink="http://schemas.microsoft.com/office/drawing/2016/ink" xmlns:am3d="http://schemas.microsoft.com/office/drawing/2017/model3d" xmlns:o="urn:schemas-microsoft-com:office:office" xmlns:oel="http://schemas.microsoft.com/office/2019/extlst" xmlns:r="http://schemas.openxmlformats.org/officeDocument/2006/relationships" xmlns:m="http://schemas.openxmlformats.org/officeDocument/2006/math" xmlns:v="urn:schemas-microsoft-com:vml" xmlns:wp14="http://schemas.microsoft.com/office/word/2010/wordprocessingDrawing" xmlns:wp="http://schemas.openxmlformats.org/drawingml/2006/wordprocessingDrawing" xmlns:w10="urn:schemas-microsoft-com:office:word" xmlns:w="http://schemas.openxmlformats.org/wordprocessingml/2006/main" xmlns:w14="http://schemas.microsoft.com/office/word/2010/wordml" xmlns:w15="http://schemas.microsoft.com/office/word/2012/wordml" xmlns:w16cex="http://schemas.microsoft.com/office/word/2018/wordml/cex" xmlns:w16cid="http://schemas.microsoft.com/office/word/2016/wordml/cid" xmlns:w16="http://schemas.microsoft.com/office/word/2018/wordml" xmlns:w16du="http://schemas.microsoft.com/office/word/2023/wordml/word16du" xmlns:w16sdtdh="http://schemas.microsoft.com/office/word/2020/wordml/sdtdatahash" xmlns:w16sdtfl="http://schemas.microsoft.com/office/word/2024/wordml/sdtformatlock" xmlns:w16se="http://schemas.microsoft.com/office/word/2015/wordml/symex" xmlns:wpg="http://schemas.microsoft.com/office/word/2010/wordprocessingGroup" xmlns:wpi="http://schemas.microsoft.com/office/word/2010/wordprocessingInk" xmlns:wne="http://schemas.microsoft.com/office/word/2006/wordml" xmlns:wps="http://schemas.microsoft.com/office/word/2010/wordprocessingShape" mc:Ignorable="w14 w15 w16se w16cid w16 w16cex w16sdtdh w16sdtfl w16du wp14">
   <w:footnote w:type="separator" w:id="-1">
     <w:p>
       <w:pPr>
@@ -10268,7 +10026,7 @@
 </file>
 
 <file path=word/numbering.xml><?xml version="1.0" encoding="utf-8"?>
-<w:numbering xmlns:wpc="http://schemas.microsoft.com/office/word/2010/wordprocessingCanvas" xmlns:cx="http://schemas.microsoft.com/office/drawing/2014/chartex" xmlns:cx1="http://schemas.microsoft.com/office/drawing/2015/9/8/chartex" xmlns:cx2="http://schemas.microsoft.com/office/drawing/2015/10/21/chartex" xmlns:cx3="http://schemas.microsoft.com/office/drawing/2016/5/9/chartex" xmlns:cx4="http://schemas.microsoft.com/office/drawing/2016/5/10/chartex" xmlns:cx5="http://schemas.microsoft.com/office/drawing/2016/5/11/chartex" xmlns:cx6="http://schemas.microsoft.com/office/drawing/2016/5/12/chartex" xmlns:cx7="http://schemas.microsoft.com/office/drawing/2016/5/13/chartex" xmlns:cx8="http://schemas.microsoft.com/office/drawing/2016/5/14/chartex" xmlns:mc="http://schemas.openxmlformats.org/markup-compatibility/2006" xmlns:aink="http://schemas.microsoft.com/office/drawing/2016/ink" xmlns:am3d="http://schemas.microsoft.com/office/drawing/2017/model3d" xmlns:o="urn:schemas-microsoft-com:office:office" xmlns:r="http://schemas.openxmlformats.org/officeDocument/2006/relationships" xmlns:m="http://schemas.openxmlformats.org/officeDocument/2006/math" xmlns:v="urn:schemas-microsoft-com:vml" xmlns:wp14="http://schemas.microsoft.com/office/word/2010/wordprocessingDrawing" xmlns:wp="http://schemas.openxmlformats.org/drawingml/2006/wordprocessingDrawing" xmlns:w10="urn:schemas-microsoft-com:office:word" xmlns:w="http://schemas.openxmlformats.org/wordprocessingml/2006/main" xmlns:w14="http://schemas.microsoft.com/office/word/2010/wordml" xmlns:w15="http://schemas.microsoft.com/office/word/2012/wordml" xmlns:w16cex="http://schemas.microsoft.com/office/word/2018/wordml/cex" xmlns:w16cid="http://schemas.microsoft.com/office/word/2016/wordml/cid" xmlns:w16="http://schemas.microsoft.com/office/word/2018/wordml" xmlns:w16sdtdh="http://schemas.microsoft.com/office/word/2020/wordml/sdtdatahash" xmlns:w16se="http://schemas.microsoft.com/office/word/2015/wordml/symex" xmlns:wpg="http://schemas.microsoft.com/office/word/2010/wordprocessingGroup" xmlns:wpi="http://schemas.microsoft.com/office/word/2010/wordprocessingInk" xmlns:wne="http://schemas.microsoft.com/office/word/2006/wordml" xmlns:wps="http://schemas.microsoft.com/office/word/2010/wordprocessingShape" mc:Ignorable="w14 w15 w16se w16cid w16 w16cex w16sdtdh wp14">
+<w:numbering xmlns:wpc="http://schemas.microsoft.com/office/word/2010/wordprocessingCanvas" xmlns:cx="http://schemas.microsoft.com/office/drawing/2014/chartex" xmlns:cx1="http://schemas.microsoft.com/office/drawing/2015/9/8/chartex" xmlns:cx2="http://schemas.microsoft.com/office/drawing/2015/10/21/chartex" xmlns:cx3="http://schemas.microsoft.com/office/drawing/2016/5/9/chartex" xmlns:cx4="http://schemas.microsoft.com/office/drawing/2016/5/10/chartex" xmlns:cx5="http://schemas.microsoft.com/office/drawing/2016/5/11/chartex" xmlns:cx6="http://schemas.microsoft.com/office/drawing/2016/5/12/chartex" xmlns:cx7="http://schemas.microsoft.com/office/drawing/2016/5/13/chartex" xmlns:cx8="http://schemas.microsoft.com/office/drawing/2016/5/14/chartex" xmlns:mc="http://schemas.openxmlformats.org/markup-compatibility/2006" xmlns:aink="http://schemas.microsoft.com/office/drawing/2016/ink" xmlns:am3d="http://schemas.microsoft.com/office/drawing/2017/model3d" xmlns:o="urn:schemas-microsoft-com:office:office" xmlns:oel="http://schemas.microsoft.com/office/2019/extlst" xmlns:r="http://schemas.openxmlformats.org/officeDocument/2006/relationships" xmlns:m="http://schemas.openxmlformats.org/officeDocument/2006/math" xmlns:v="urn:schemas-microsoft-com:vml" xmlns:wp14="http://schemas.microsoft.com/office/word/2010/wordprocessingDrawing" xmlns:wp="http://schemas.openxmlformats.org/drawingml/2006/wordprocessingDrawing" xmlns:w10="urn:schemas-microsoft-com:office:word" xmlns:w="http://schemas.openxmlformats.org/wordprocessingml/2006/main" xmlns:w14="http://schemas.microsoft.com/office/word/2010/wordml" xmlns:w15="http://schemas.microsoft.com/office/word/2012/wordml" xmlns:w16cex="http://schemas.microsoft.com/office/word/2018/wordml/cex" xmlns:w16cid="http://schemas.microsoft.com/office/word/2016/wordml/cid" xmlns:w16="http://schemas.microsoft.com/office/word/2018/wordml" xmlns:w16du="http://schemas.microsoft.com/office/word/2023/wordml/word16du" xmlns:w16sdtdh="http://schemas.microsoft.com/office/word/2020/wordml/sdtdatahash" xmlns:w16sdtfl="http://schemas.microsoft.com/office/word/2024/wordml/sdtformatlock" xmlns:w16se="http://schemas.microsoft.com/office/word/2015/wordml/symex" xmlns:wpg="http://schemas.microsoft.com/office/word/2010/wordprocessingGroup" xmlns:wpi="http://schemas.microsoft.com/office/word/2010/wordprocessingInk" xmlns:wne="http://schemas.microsoft.com/office/word/2006/wordml" xmlns:wps="http://schemas.microsoft.com/office/word/2010/wordprocessingShape" mc:Ignorable="w14 w15 w16se w16cid w16 w16cex w16sdtdh w16sdtfl w16du wp14">
   <w:abstractNum w:abstractNumId="0" w15:restartNumberingAfterBreak="0">
     <w:nsid w:val="00543D0E"/>
     <w:multiLevelType w:val="hybridMultilevel"/>
@@ -14961,155 +14719,155 @@
       </w:rPr>
     </w:lvl>
   </w:abstractNum>
-  <w:num w:numId="1">
+  <w:num w:numId="1" w16cid:durableId="2067876815">
     <w:abstractNumId w:val="4"/>
   </w:num>
-  <w:num w:numId="2">
+  <w:num w:numId="2" w16cid:durableId="175922462">
     <w:abstractNumId w:val="41"/>
   </w:num>
-  <w:num w:numId="3">
+  <w:num w:numId="3" w16cid:durableId="1595164537">
     <w:abstractNumId w:val="8"/>
   </w:num>
-  <w:num w:numId="4">
+  <w:num w:numId="4" w16cid:durableId="1278022568">
     <w:abstractNumId w:val="2"/>
   </w:num>
-  <w:num w:numId="5">
+  <w:num w:numId="5" w16cid:durableId="147791760">
     <w:abstractNumId w:val="7"/>
   </w:num>
-  <w:num w:numId="6">
+  <w:num w:numId="6" w16cid:durableId="1037655483">
     <w:abstractNumId w:val="12"/>
   </w:num>
-  <w:num w:numId="7">
+  <w:num w:numId="7" w16cid:durableId="820657267">
     <w:abstractNumId w:val="42"/>
   </w:num>
-  <w:num w:numId="8">
+  <w:num w:numId="8" w16cid:durableId="549193685">
     <w:abstractNumId w:val="31"/>
   </w:num>
-  <w:num w:numId="9">
+  <w:num w:numId="9" w16cid:durableId="662247890">
     <w:abstractNumId w:val="22"/>
   </w:num>
-  <w:num w:numId="10">
+  <w:num w:numId="10" w16cid:durableId="1597904170">
     <w:abstractNumId w:val="32"/>
   </w:num>
-  <w:num w:numId="11">
+  <w:num w:numId="11" w16cid:durableId="273097271">
     <w:abstractNumId w:val="9"/>
   </w:num>
-  <w:num w:numId="12">
+  <w:num w:numId="12" w16cid:durableId="968583514">
     <w:abstractNumId w:val="14"/>
   </w:num>
-  <w:num w:numId="13">
+  <w:num w:numId="13" w16cid:durableId="353002836">
     <w:abstractNumId w:val="13"/>
   </w:num>
-  <w:num w:numId="14">
+  <w:num w:numId="14" w16cid:durableId="2077701384">
     <w:abstractNumId w:val="11"/>
   </w:num>
-  <w:num w:numId="15">
+  <w:num w:numId="15" w16cid:durableId="1197036012">
     <w:abstractNumId w:val="10"/>
   </w:num>
-  <w:num w:numId="16">
+  <w:num w:numId="16" w16cid:durableId="253129604">
     <w:abstractNumId w:val="24"/>
   </w:num>
-  <w:num w:numId="17">
+  <w:num w:numId="17" w16cid:durableId="820730271">
     <w:abstractNumId w:val="40"/>
   </w:num>
-  <w:num w:numId="18">
+  <w:num w:numId="18" w16cid:durableId="628588332">
     <w:abstractNumId w:val="35"/>
   </w:num>
-  <w:num w:numId="19">
+  <w:num w:numId="19" w16cid:durableId="686322801">
     <w:abstractNumId w:val="27"/>
   </w:num>
-  <w:num w:numId="20">
+  <w:num w:numId="20" w16cid:durableId="750614603">
     <w:abstractNumId w:val="0"/>
   </w:num>
-  <w:num w:numId="21">
+  <w:num w:numId="21" w16cid:durableId="2140414578">
     <w:abstractNumId w:val="15"/>
   </w:num>
-  <w:num w:numId="22">
+  <w:num w:numId="22" w16cid:durableId="196740268">
     <w:abstractNumId w:val="6"/>
   </w:num>
-  <w:num w:numId="23">
+  <w:num w:numId="23" w16cid:durableId="2110008752">
     <w:abstractNumId w:val="37"/>
   </w:num>
-  <w:num w:numId="24">
+  <w:num w:numId="24" w16cid:durableId="1965770459">
     <w:abstractNumId w:val="44"/>
   </w:num>
-  <w:num w:numId="25">
+  <w:num w:numId="25" w16cid:durableId="908030977">
     <w:abstractNumId w:val="33"/>
   </w:num>
-  <w:num w:numId="26">
+  <w:num w:numId="26" w16cid:durableId="92476964">
     <w:abstractNumId w:val="34"/>
   </w:num>
-  <w:num w:numId="27">
+  <w:num w:numId="27" w16cid:durableId="1034768180">
     <w:abstractNumId w:val="43"/>
   </w:num>
-  <w:num w:numId="28">
+  <w:num w:numId="28" w16cid:durableId="1058549282">
     <w:abstractNumId w:val="23"/>
   </w:num>
-  <w:num w:numId="29">
+  <w:num w:numId="29" w16cid:durableId="1944920831">
     <w:abstractNumId w:val="28"/>
   </w:num>
-  <w:num w:numId="30">
+  <w:num w:numId="30" w16cid:durableId="1683623284">
     <w:abstractNumId w:val="38"/>
   </w:num>
-  <w:num w:numId="31">
+  <w:num w:numId="31" w16cid:durableId="617759472">
     <w:abstractNumId w:val="19"/>
   </w:num>
-  <w:num w:numId="32">
+  <w:num w:numId="32" w16cid:durableId="943922047">
     <w:abstractNumId w:val="1"/>
   </w:num>
-  <w:num w:numId="33">
+  <w:num w:numId="33" w16cid:durableId="1021933385">
     <w:abstractNumId w:val="16"/>
   </w:num>
-  <w:num w:numId="34">
+  <w:num w:numId="34" w16cid:durableId="130638494">
     <w:abstractNumId w:val="39"/>
   </w:num>
-  <w:num w:numId="35">
+  <w:num w:numId="35" w16cid:durableId="461701494">
     <w:abstractNumId w:val="3"/>
   </w:num>
-  <w:num w:numId="36">
+  <w:num w:numId="36" w16cid:durableId="2094886283">
     <w:abstractNumId w:val="17"/>
   </w:num>
-  <w:num w:numId="37">
+  <w:num w:numId="37" w16cid:durableId="1659772583">
     <w:abstractNumId w:val="36"/>
   </w:num>
-  <w:num w:numId="38">
+  <w:num w:numId="38" w16cid:durableId="1598055255">
     <w:abstractNumId w:val="18"/>
   </w:num>
-  <w:num w:numId="39">
+  <w:num w:numId="39" w16cid:durableId="249897470">
     <w:abstractNumId w:val="5"/>
   </w:num>
-  <w:num w:numId="40">
+  <w:num w:numId="40" w16cid:durableId="1435050951">
     <w:abstractNumId w:val="25"/>
   </w:num>
-  <w:num w:numId="41">
+  <w:num w:numId="41" w16cid:durableId="1467695067">
     <w:abstractNumId w:val="17"/>
   </w:num>
-  <w:num w:numId="42">
+  <w:num w:numId="42" w16cid:durableId="43793733">
     <w:abstractNumId w:val="20"/>
   </w:num>
-  <w:num w:numId="43">
+  <w:num w:numId="43" w16cid:durableId="890069206">
     <w:abstractNumId w:val="21"/>
   </w:num>
-  <w:num w:numId="44">
+  <w:num w:numId="44" w16cid:durableId="1858305217">
     <w:abstractNumId w:val="17"/>
   </w:num>
-  <w:num w:numId="45">
+  <w:num w:numId="45" w16cid:durableId="415904962">
     <w:abstractNumId w:val="17"/>
   </w:num>
-  <w:num w:numId="46">
+  <w:num w:numId="46" w16cid:durableId="1849174454">
     <w:abstractNumId w:val="30"/>
   </w:num>
-  <w:num w:numId="47">
+  <w:num w:numId="47" w16cid:durableId="1304654600">
     <w:abstractNumId w:val="29"/>
   </w:num>
-  <w:num w:numId="48">
+  <w:num w:numId="48" w16cid:durableId="487406836">
     <w:abstractNumId w:val="26"/>
   </w:num>
 </w:numbering>
 </file>
 
 <file path=word/styles.xml><?xml version="1.0" encoding="utf-8"?>
-<w:styles xmlns:mc="http://schemas.openxmlformats.org/markup-compatibility/2006" xmlns:r="http://schemas.openxmlformats.org/officeDocument/2006/relationships" xmlns:w="http://schemas.openxmlformats.org/wordprocessingml/2006/main" xmlns:w14="http://schemas.microsoft.com/office/word/2010/wordml" xmlns:w15="http://schemas.microsoft.com/office/word/2012/wordml" xmlns:w16cex="http://schemas.microsoft.com/office/word/2018/wordml/cex" xmlns:w16cid="http://schemas.microsoft.com/office/word/2016/wordml/cid" xmlns:w16="http://schemas.microsoft.com/office/word/2018/wordml" xmlns:w16sdtdh="http://schemas.microsoft.com/office/word/2020/wordml/sdtdatahash" xmlns:w16se="http://schemas.microsoft.com/office/word/2015/wordml/symex" mc:Ignorable="w14 w15 w16se w16cid w16 w16cex w16sdtdh">
+<w:styles xmlns:mc="http://schemas.openxmlformats.org/markup-compatibility/2006" xmlns:r="http://schemas.openxmlformats.org/officeDocument/2006/relationships" xmlns:w="http://schemas.openxmlformats.org/wordprocessingml/2006/main" xmlns:w14="http://schemas.microsoft.com/office/word/2010/wordml" xmlns:w15="http://schemas.microsoft.com/office/word/2012/wordml" xmlns:w16cex="http://schemas.microsoft.com/office/word/2018/wordml/cex" xmlns:w16cid="http://schemas.microsoft.com/office/word/2016/wordml/cid" xmlns:w16="http://schemas.microsoft.com/office/word/2018/wordml" xmlns:w16du="http://schemas.microsoft.com/office/word/2023/wordml/word16du" xmlns:w16sdtdh="http://schemas.microsoft.com/office/word/2020/wordml/sdtdatahash" xmlns:w16sdtfl="http://schemas.microsoft.com/office/word/2024/wordml/sdtformatlock" xmlns:w16se="http://schemas.microsoft.com/office/word/2015/wordml/symex" mc:Ignorable="w14 w15 w16se w16cid w16 w16cex w16sdtdh w16sdtfl w16du">
   <w:docDefaults>
     <w:rPrDefault>
       <w:rPr>
@@ -16684,7 +16442,7 @@
 </file>
 
 <file path=word/glossary/document.xml><?xml version="1.0" encoding="utf-8"?>
-<w:glossaryDocument xmlns:wpc="http://schemas.microsoft.com/office/word/2010/wordprocessingCanvas" xmlns:cx="http://schemas.microsoft.com/office/drawing/2014/chartex" xmlns:cx1="http://schemas.microsoft.com/office/drawing/2015/9/8/chartex" xmlns:cx2="http://schemas.microsoft.com/office/drawing/2015/10/21/chartex" xmlns:cx3="http://schemas.microsoft.com/office/drawing/2016/5/9/chartex" xmlns:cx4="http://schemas.microsoft.com/office/drawing/2016/5/10/chartex" xmlns:cx5="http://schemas.microsoft.com/office/drawing/2016/5/11/chartex" xmlns:cx6="http://schemas.microsoft.com/office/drawing/2016/5/12/chartex" xmlns:cx7="http://schemas.microsoft.com/office/drawing/2016/5/13/chartex" xmlns:cx8="http://schemas.microsoft.com/office/drawing/2016/5/14/chartex" xmlns:mc="http://schemas.openxmlformats.org/markup-compatibility/2006" xmlns:aink="http://schemas.microsoft.com/office/drawing/2016/ink" xmlns:am3d="http://schemas.microsoft.com/office/drawing/2017/model3d" xmlns:o="urn:schemas-microsoft-com:office:office" xmlns:r="http://schemas.openxmlformats.org/officeDocument/2006/relationships" xmlns:m="http://schemas.openxmlformats.org/officeDocument/2006/math" xmlns:v="urn:schemas-microsoft-com:vml" xmlns:wp14="http://schemas.microsoft.com/office/word/2010/wordprocessingDrawing" xmlns:wp="http://schemas.openxmlformats.org/drawingml/2006/wordprocessingDrawing" xmlns:w10="urn:schemas-microsoft-com:office:word" xmlns:w="http://schemas.openxmlformats.org/wordprocessingml/2006/main" xmlns:w14="http://schemas.microsoft.com/office/word/2010/wordml" xmlns:w15="http://schemas.microsoft.com/office/word/2012/wordml" xmlns:w16cex="http://schemas.microsoft.com/office/word/2018/wordml/cex" xmlns:w16cid="http://schemas.microsoft.com/office/word/2016/wordml/cid" xmlns:w16="http://schemas.microsoft.com/office/word/2018/wordml" xmlns:w16sdtdh="http://schemas.microsoft.com/office/word/2020/wordml/sdtdatahash" xmlns:w16se="http://schemas.microsoft.com/office/word/2015/wordml/symex" xmlns:wpg="http://schemas.microsoft.com/office/word/2010/wordprocessingGroup" xmlns:wpi="http://schemas.microsoft.com/office/word/2010/wordprocessingInk" xmlns:wne="http://schemas.microsoft.com/office/word/2006/wordml" xmlns:wps="http://schemas.microsoft.com/office/word/2010/wordprocessingShape" mc:Ignorable="w14 w15 w16se w16cid w16 w16cex w16sdtdh wp14">
+<w:glossaryDocument xmlns:wpc="http://schemas.microsoft.com/office/word/2010/wordprocessingCanvas" xmlns:cx="http://schemas.microsoft.com/office/drawing/2014/chartex" xmlns:cx1="http://schemas.microsoft.com/office/drawing/2015/9/8/chartex" xmlns:cx2="http://schemas.microsoft.com/office/drawing/2015/10/21/chartex" xmlns:cx3="http://schemas.microsoft.com/office/drawing/2016/5/9/chartex" xmlns:cx4="http://schemas.microsoft.com/office/drawing/2016/5/10/chartex" xmlns:cx5="http://schemas.microsoft.com/office/drawing/2016/5/11/chartex" xmlns:cx6="http://schemas.microsoft.com/office/drawing/2016/5/12/chartex" xmlns:cx7="http://schemas.microsoft.com/office/drawing/2016/5/13/chartex" xmlns:cx8="http://schemas.microsoft.com/office/drawing/2016/5/14/chartex" xmlns:mc="http://schemas.openxmlformats.org/markup-compatibility/2006" xmlns:aink="http://schemas.microsoft.com/office/drawing/2016/ink" xmlns:am3d="http://schemas.microsoft.com/office/drawing/2017/model3d" xmlns:o="urn:schemas-microsoft-com:office:office" xmlns:oel="http://schemas.microsoft.com/office/2019/extlst" xmlns:r="http://schemas.openxmlformats.org/officeDocument/2006/relationships" xmlns:m="http://schemas.openxmlformats.org/officeDocument/2006/math" xmlns:v="urn:schemas-microsoft-com:vml" xmlns:wp14="http://schemas.microsoft.com/office/word/2010/wordprocessingDrawing" xmlns:wp="http://schemas.openxmlformats.org/drawingml/2006/wordprocessingDrawing" xmlns:w10="urn:schemas-microsoft-com:office:word" xmlns:w="http://schemas.openxmlformats.org/wordprocessingml/2006/main" xmlns:w14="http://schemas.microsoft.com/office/word/2010/wordml" xmlns:w15="http://schemas.microsoft.com/office/word/2012/wordml" xmlns:w16cex="http://schemas.microsoft.com/office/word/2018/wordml/cex" xmlns:w16cid="http://schemas.microsoft.com/office/word/2016/wordml/cid" xmlns:w16="http://schemas.microsoft.com/office/word/2018/wordml" xmlns:w16du="http://schemas.microsoft.com/office/word/2023/wordml/word16du" xmlns:w16sdtdh="http://schemas.microsoft.com/office/word/2020/wordml/sdtdatahash" xmlns:w16sdtfl="http://schemas.microsoft.com/office/word/2024/wordml/sdtformatlock" xmlns:w16se="http://schemas.microsoft.com/office/word/2015/wordml/symex" xmlns:wpg="http://schemas.microsoft.com/office/word/2010/wordprocessingGroup" xmlns:wpi="http://schemas.microsoft.com/office/word/2010/wordprocessingInk" xmlns:wne="http://schemas.microsoft.com/office/word/2006/wordml" xmlns:wps="http://schemas.microsoft.com/office/word/2010/wordprocessingShape" mc:Ignorable="w14 w15 w16se w16cid w16 w16cex w16sdtdh w16sdtfl w16du wp14">
   <w:docParts>
     <w:docPart>
       <w:docPartPr>
@@ -16898,11 +16656,11 @@
 </file>
 
 <file path=word/glossary/fontTable.xml><?xml version="1.0" encoding="utf-8"?>
-<w:fonts xmlns:mc="http://schemas.openxmlformats.org/markup-compatibility/2006" xmlns:r="http://schemas.openxmlformats.org/officeDocument/2006/relationships" xmlns:w="http://schemas.openxmlformats.org/wordprocessingml/2006/main" xmlns:w14="http://schemas.microsoft.com/office/word/2010/wordml" xmlns:w15="http://schemas.microsoft.com/office/word/2012/wordml" xmlns:w16cex="http://schemas.microsoft.com/office/word/2018/wordml/cex" xmlns:w16cid="http://schemas.microsoft.com/office/word/2016/wordml/cid" xmlns:w16="http://schemas.microsoft.com/office/word/2018/wordml" xmlns:w16sdtdh="http://schemas.microsoft.com/office/word/2020/wordml/sdtdatahash" xmlns:w16se="http://schemas.microsoft.com/office/word/2015/wordml/symex" mc:Ignorable="w14 w15 w16se w16cid w16 w16cex w16sdtdh">
+<w:fonts xmlns:mc="http://schemas.openxmlformats.org/markup-compatibility/2006" xmlns:r="http://schemas.openxmlformats.org/officeDocument/2006/relationships" xmlns:w="http://schemas.openxmlformats.org/wordprocessingml/2006/main" xmlns:w14="http://schemas.microsoft.com/office/word/2010/wordml" xmlns:w15="http://schemas.microsoft.com/office/word/2012/wordml" xmlns:w16cex="http://schemas.microsoft.com/office/word/2018/wordml/cex" xmlns:w16cid="http://schemas.microsoft.com/office/word/2016/wordml/cid" xmlns:w16="http://schemas.microsoft.com/office/word/2018/wordml" xmlns:w16du="http://schemas.microsoft.com/office/word/2023/wordml/word16du" xmlns:w16sdtdh="http://schemas.microsoft.com/office/word/2020/wordml/sdtdatahash" xmlns:w16sdtfl="http://schemas.microsoft.com/office/word/2024/wordml/sdtformatlock" xmlns:w16se="http://schemas.microsoft.com/office/word/2015/wordml/symex" mc:Ignorable="w14 w15 w16se w16cid w16 w16cex w16sdtdh w16sdtfl w16du">
   <w:font w:name="Symbol">
     <w:panose1 w:val="05050102010706020507"/>
     <w:charset w:val="02"/>
-    <w:family w:val="roman"/>
+    <w:family w:val="decorative"/>
     <w:pitch w:val="variable"/>
     <w:sig w:usb0="00000000" w:usb1="10000000" w:usb2="00000000" w:usb3="00000000" w:csb0="80000000" w:csb1="00000000"/>
   </w:font>
@@ -16922,17 +16680,17 @@
   </w:font>
   <w:font w:name="Wingdings">
     <w:panose1 w:val="05000000000000000000"/>
-    <w:charset w:val="02"/>
-    <w:family w:val="auto"/>
+    <w:charset w:val="4D"/>
+    <w:family w:val="decorative"/>
     <w:pitch w:val="variable"/>
-    <w:sig w:usb0="00000000" w:usb1="10000000" w:usb2="00000000" w:usb3="00000000" w:csb0="80000000" w:csb1="00000000"/>
+    <w:sig w:usb0="00000003" w:usb1="00000000" w:usb2="00000000" w:usb3="00000000" w:csb0="80000001" w:csb1="00000000"/>
   </w:font>
   <w:font w:name="Calibri">
     <w:panose1 w:val="020F0502020204030204"/>
     <w:charset w:val="00"/>
     <w:family w:val="swiss"/>
     <w:pitch w:val="variable"/>
-    <w:sig w:usb0="E4002EFF" w:usb1="C200247B" w:usb2="00000009" w:usb3="00000000" w:csb0="000001FF" w:csb1="00000000"/>
+    <w:sig w:usb0="E4002EFF" w:usb1="C200ACFF" w:usb2="00000009" w:usb3="00000000" w:csb0="000001FF" w:csb1="00000000"/>
   </w:font>
   <w:font w:name="Arial">
     <w:panose1 w:val="020B0604020202020204"/>
@@ -16964,16 +16722,31 @@
     <w:sig w:usb0="E4002EFF" w:usb1="C200247B" w:usb2="00000009" w:usb3="00000000" w:csb0="000001FF" w:csb1="00000000"/>
   </w:font>
   <w:font w:name="Yu Mincho">
+    <w:panose1 w:val="02020400000000000000"/>
     <w:charset w:val="80"/>
     <w:family w:val="roman"/>
     <w:pitch w:val="variable"/>
     <w:sig w:usb0="800002E7" w:usb1="2AC7FCFF" w:usb2="00000012" w:usb3="00000000" w:csb0="0002009F" w:csb1="00000000"/>
   </w:font>
+  <w:font w:name="Aptos">
+    <w:panose1 w:val="020B0004020202020204"/>
+    <w:charset w:val="00"/>
+    <w:family w:val="swiss"/>
+    <w:pitch w:val="variable"/>
+    <w:sig w:usb0="20000287" w:usb1="00000003" w:usb2="00000000" w:usb3="00000000" w:csb0="0000019F" w:csb1="00000000"/>
+  </w:font>
+  <w:font w:name="Aptos Display">
+    <w:panose1 w:val="020B0004020202020204"/>
+    <w:charset w:val="00"/>
+    <w:family w:val="swiss"/>
+    <w:pitch w:val="variable"/>
+    <w:sig w:usb0="20000287" w:usb1="00000003" w:usb2="00000000" w:usb3="00000000" w:csb0="0000019F" w:csb1="00000000"/>
+  </w:font>
 </w:fonts>
 </file>
 
 <file path=word/glossary/settings.xml><?xml version="1.0" encoding="utf-8"?>
-<w:settings xmlns:mc="http://schemas.openxmlformats.org/markup-compatibility/2006" xmlns:o="urn:schemas-microsoft-com:office:office" xmlns:r="http://schemas.openxmlformats.org/officeDocument/2006/relationships" xmlns:m="http://schemas.openxmlformats.org/officeDocument/2006/math" xmlns:v="urn:schemas-microsoft-com:vml" xmlns:w10="urn:schemas-microsoft-com:office:word" xmlns:w="http://schemas.openxmlformats.org/wordprocessingml/2006/main" xmlns:w14="http://schemas.microsoft.com/office/word/2010/wordml" xmlns:w15="http://schemas.microsoft.com/office/word/2012/wordml" xmlns:w16cex="http://schemas.microsoft.com/office/word/2018/wordml/cex" xmlns:w16cid="http://schemas.microsoft.com/office/word/2016/wordml/cid" xmlns:w16="http://schemas.microsoft.com/office/word/2018/wordml" xmlns:w16sdtdh="http://schemas.microsoft.com/office/word/2020/wordml/sdtdatahash" xmlns:w16se="http://schemas.microsoft.com/office/word/2015/wordml/symex" xmlns:sl="http://schemas.openxmlformats.org/schemaLibrary/2006/main" mc:Ignorable="w14 w15 w16se w16cid w16 w16cex w16sdtdh">
+<w:settings xmlns:mc="http://schemas.openxmlformats.org/markup-compatibility/2006" xmlns:o="urn:schemas-microsoft-com:office:office" xmlns:r="http://schemas.openxmlformats.org/officeDocument/2006/relationships" xmlns:m="http://schemas.openxmlformats.org/officeDocument/2006/math" xmlns:v="urn:schemas-microsoft-com:vml" xmlns:w10="urn:schemas-microsoft-com:office:word" xmlns:w="http://schemas.openxmlformats.org/wordprocessingml/2006/main" xmlns:w14="http://schemas.microsoft.com/office/word/2010/wordml" xmlns:w15="http://schemas.microsoft.com/office/word/2012/wordml" xmlns:w16cex="http://schemas.microsoft.com/office/word/2018/wordml/cex" xmlns:w16cid="http://schemas.microsoft.com/office/word/2016/wordml/cid" xmlns:w16="http://schemas.microsoft.com/office/word/2018/wordml" xmlns:w16du="http://schemas.microsoft.com/office/word/2023/wordml/word16du" xmlns:w16sdtdh="http://schemas.microsoft.com/office/word/2020/wordml/sdtdatahash" xmlns:w16sdtfl="http://schemas.microsoft.com/office/word/2024/wordml/sdtformatlock" xmlns:w16se="http://schemas.microsoft.com/office/word/2015/wordml/symex" xmlns:sl="http://schemas.openxmlformats.org/schemaLibrary/2006/main" mc:Ignorable="w14 w15 w16se w16cid w16 w16cex w16sdtdh w16sdtfl w16du">
   <w:view w:val="normal"/>
   <w:defaultTabStop w:val="708"/>
   <w:hyphenationZone w:val="425"/>
@@ -17006,10 +16779,12 @@
     <w:rsid w:val="00A92590"/>
     <w:rsid w:val="00AC13E3"/>
     <w:rsid w:val="00AF2C96"/>
+    <w:rsid w:val="00D348EA"/>
     <w:rsid w:val="00DA4981"/>
     <w:rsid w:val="00E36221"/>
     <w:rsid w:val="00E877D6"/>
     <w:rsid w:val="00F07D25"/>
+    <w:rsid w:val="00FB4D52"/>
   </w:rsids>
   <m:mathPr>
     <m:mathFont m:val="Cambria Math"/>
@@ -17026,14 +16801,14 @@
   </m:mathPr>
   <w:themeFontLang w:val="es-EC"/>
   <w:clrSchemeMapping w:bg1="light1" w:t1="dark1" w:bg2="light2" w:t2="dark2" w:accent1="accent1" w:accent2="accent2" w:accent3="accent3" w:accent4="accent4" w:accent5="accent5" w:accent6="accent6" w:hyperlink="hyperlink" w:followedHyperlink="followedHyperlink"/>
-  <w:decimalSymbol w:val="."/>
+  <w:decimalSymbol w:val=","/>
   <w:listSeparator w:val=";"/>
   <w15:chartTrackingRefBased/>
 </w:settings>
 </file>
 
 <file path=word/glossary/styles.xml><?xml version="1.0" encoding="utf-8"?>
-<w:styles xmlns:mc="http://schemas.openxmlformats.org/markup-compatibility/2006" xmlns:r="http://schemas.openxmlformats.org/officeDocument/2006/relationships" xmlns:w="http://schemas.openxmlformats.org/wordprocessingml/2006/main" xmlns:w14="http://schemas.microsoft.com/office/word/2010/wordml" xmlns:w15="http://schemas.microsoft.com/office/word/2012/wordml" xmlns:w16cex="http://schemas.microsoft.com/office/word/2018/wordml/cex" xmlns:w16cid="http://schemas.microsoft.com/office/word/2016/wordml/cid" xmlns:w16="http://schemas.microsoft.com/office/word/2018/wordml" xmlns:w16sdtdh="http://schemas.microsoft.com/office/word/2020/wordml/sdtdatahash" xmlns:w16se="http://schemas.microsoft.com/office/word/2015/wordml/symex" mc:Ignorable="w14 w15 w16se w16cid w16 w16cex w16sdtdh">
+<w:styles xmlns:mc="http://schemas.openxmlformats.org/markup-compatibility/2006" xmlns:r="http://schemas.openxmlformats.org/officeDocument/2006/relationships" xmlns:w="http://schemas.openxmlformats.org/wordprocessingml/2006/main" xmlns:w14="http://schemas.microsoft.com/office/word/2010/wordml" xmlns:w15="http://schemas.microsoft.com/office/word/2012/wordml" xmlns:w16cex="http://schemas.microsoft.com/office/word/2018/wordml/cex" xmlns:w16cid="http://schemas.microsoft.com/office/word/2016/wordml/cid" xmlns:w16="http://schemas.microsoft.com/office/word/2018/wordml" xmlns:w16du="http://schemas.microsoft.com/office/word/2023/wordml/word16du" xmlns:w16sdtdh="http://schemas.microsoft.com/office/word/2020/wordml/sdtdatahash" xmlns:w16sdtfl="http://schemas.microsoft.com/office/word/2024/wordml/sdtformatlock" xmlns:w16se="http://schemas.microsoft.com/office/word/2015/wordml/symex" mc:Ignorable="w14 w15 w16se w16cid w16 w16cex w16sdtdh w16sdtfl w16du">
   <w:docDefaults>
     <w:rPrDefault>
       <w:rPr>
@@ -17498,7 +17273,7 @@
 </file>
 
 <file path=word/glossary/webSettings.xml><?xml version="1.0" encoding="utf-8"?>
-<w:webSettings xmlns:mc="http://schemas.openxmlformats.org/markup-compatibility/2006" xmlns:r="http://schemas.openxmlformats.org/officeDocument/2006/relationships" xmlns:w="http://schemas.openxmlformats.org/wordprocessingml/2006/main" xmlns:w14="http://schemas.microsoft.com/office/word/2010/wordml" xmlns:w15="http://schemas.microsoft.com/office/word/2012/wordml" xmlns:w16cex="http://schemas.microsoft.com/office/word/2018/wordml/cex" xmlns:w16cid="http://schemas.microsoft.com/office/word/2016/wordml/cid" xmlns:w16="http://schemas.microsoft.com/office/word/2018/wordml" xmlns:w16sdtdh="http://schemas.microsoft.com/office/word/2020/wordml/sdtdatahash" xmlns:w16se="http://schemas.microsoft.com/office/word/2015/wordml/symex" mc:Ignorable="w14 w15 w16se w16cid w16 w16cex w16sdtdh">
+<w:webSettings xmlns:mc="http://schemas.openxmlformats.org/markup-compatibility/2006" xmlns:r="http://schemas.openxmlformats.org/officeDocument/2006/relationships" xmlns:w="http://schemas.openxmlformats.org/wordprocessingml/2006/main" xmlns:w14="http://schemas.microsoft.com/office/word/2010/wordml" xmlns:w15="http://schemas.microsoft.com/office/word/2012/wordml" xmlns:w16cex="http://schemas.microsoft.com/office/word/2018/wordml/cex" xmlns:w16cid="http://schemas.microsoft.com/office/word/2016/wordml/cid" xmlns:w16="http://schemas.microsoft.com/office/word/2018/wordml" xmlns:w16du="http://schemas.microsoft.com/office/word/2023/wordml/word16du" xmlns:w16sdtdh="http://schemas.microsoft.com/office/word/2020/wordml/sdtdatahash" xmlns:w16sdtfl="http://schemas.microsoft.com/office/word/2024/wordml/sdtformatlock" xmlns:w16se="http://schemas.microsoft.com/office/word/2015/wordml/symex" mc:Ignorable="w14 w15 w16se w16cid w16 w16cex w16sdtdh w16sdtfl w16du">
   <w:optimizeForBrowser/>
   <w:allowPNG/>
 </w:webSettings>
@@ -17883,15 +17658,6 @@
 </file>
 
 <file path=customXml/item1.xml><?xml version="1.0" encoding="utf-8"?>
-<p:properties xmlns:p="http://schemas.microsoft.com/office/2006/metadata/properties" xmlns:xsi="http://www.w3.org/2001/XMLSchema-instance" xmlns:pc="http://schemas.microsoft.com/office/infopath/2007/PartnerControls">
-  <documentManagement>
-    <Nro xmlns="e62bc30b-b884-4ee1-b0ab-e2e35dfacfd5">0</Nro>
-    <Unidad xmlns="e62bc30b-b884-4ee1-b0ab-e2e35dfacfd5" xsi:nil="true"/>
-  </documentManagement>
-</p:properties>
-</file>
-
-<file path=customXml/item2.xml><?xml version="1.0" encoding="utf-8"?>
 <ct:contentTypeSchema xmlns:ct="http://schemas.microsoft.com/office/2006/metadata/contentType" xmlns:ma="http://schemas.microsoft.com/office/2006/metadata/properties/metaAttributes" ct:_="" ma:_="" ma:contentTypeName="Documento" ma:contentTypeID="0x01010006ACA7DB3593B24E887290A71F51A18F" ma:contentTypeVersion="10" ma:contentTypeDescription="Crear nuevo documento." ma:contentTypeScope="" ma:versionID="5fde8b866a40f115df17144418c3774a">
   <xsd:schema xmlns:xsd="http://www.w3.org/2001/XMLSchema" xmlns:xs="http://www.w3.org/2001/XMLSchema" xmlns:p="http://schemas.microsoft.com/office/2006/metadata/properties" xmlns:ns2="e62bc30b-b884-4ee1-b0ab-e2e35dfacfd5" targetNamespace="http://schemas.microsoft.com/office/2006/metadata/properties" ma:root="true" ma:fieldsID="722d0d74b5f1a0e9a135ab2398c17b72" ns2:_="">
     <xsd:import namespace="e62bc30b-b884-4ee1-b0ab-e2e35dfacfd5"/>
@@ -18071,11 +17837,16 @@
 </ct:contentTypeSchema>
 </file>
 
-<file path=customXml/item3.xml><?xml version="1.0" encoding="utf-8"?>
-<b:Sources xmlns:b="http://schemas.openxmlformats.org/officeDocument/2006/bibliography" xmlns="http://schemas.openxmlformats.org/officeDocument/2006/bibliography" SelectedStyle="/APASixthEditionOfficeOnline.xsl" StyleName="APA" Version="6"/>
+<file path=customXml/item2.xml><?xml version="1.0" encoding="utf-8"?>
+<p:properties xmlns:p="http://schemas.microsoft.com/office/2006/metadata/properties" xmlns:xsi="http://www.w3.org/2001/XMLSchema-instance" xmlns:pc="http://schemas.microsoft.com/office/infopath/2007/PartnerControls">
+  <documentManagement>
+    <Nro xmlns="e62bc30b-b884-4ee1-b0ab-e2e35dfacfd5">0</Nro>
+    <Unidad xmlns="e62bc30b-b884-4ee1-b0ab-e2e35dfacfd5" xsi:nil="true"/>
+  </documentManagement>
+</p:properties>
 </file>
 
-<file path=customXml/item4.xml><?xml version="1.0" encoding="utf-8"?>
+<file path=customXml/item3.xml><?xml version="1.0" encoding="utf-8"?>
 <?mso-contentType ?>
 <FormTemplates xmlns="http://schemas.microsoft.com/sharepoint/v3/contenttype/forms">
   <Display>DocumentLibraryForm</Display>
@@ -18084,17 +17855,11 @@
 </FormTemplates>
 </file>
 
-<file path=customXml/itemProps1.xml><?xml version="1.0" encoding="utf-8"?>
-<ds:datastoreItem xmlns:ds="http://schemas.openxmlformats.org/officeDocument/2006/customXml" ds:itemID="{DAAF528F-7240-408A-9BF0-E37AC9702D32}">
-  <ds:schemaRefs>
-    <ds:schemaRef ds:uri="http://schemas.microsoft.com/office/2006/metadata/properties"/>
-    <ds:schemaRef ds:uri="http://schemas.microsoft.com/office/infopath/2007/PartnerControls"/>
-    <ds:schemaRef ds:uri="e62bc30b-b884-4ee1-b0ab-e2e35dfacfd5"/>
-  </ds:schemaRefs>
-</ds:datastoreItem>
+<file path=customXml/item4.xml><?xml version="1.0" encoding="utf-8"?>
+<b:Sources xmlns:b="http://schemas.openxmlformats.org/officeDocument/2006/bibliography" xmlns="http://schemas.openxmlformats.org/officeDocument/2006/bibliography" SelectedStyle="/APASixthEditionOfficeOnline.xsl" StyleName="APA" Version="6"/>
 </file>
 
-<file path=customXml/itemProps2.xml><?xml version="1.0" encoding="utf-8"?>
+<file path=customXml/itemProps1.xml><?xml version="1.0" encoding="utf-8"?>
 <ds:datastoreItem xmlns:ds="http://schemas.openxmlformats.org/officeDocument/2006/customXml" ds:itemID="{BB19413B-A659-4239-B251-6BE967D5DACB}">
   <ds:schemaRefs>
     <ds:schemaRef ds:uri="http://schemas.microsoft.com/office/2006/metadata/contentType"/>
@@ -18112,18 +17877,28 @@
 </ds:datastoreItem>
 </file>
 
+<file path=customXml/itemProps2.xml><?xml version="1.0" encoding="utf-8"?>
+<ds:datastoreItem xmlns:ds="http://schemas.openxmlformats.org/officeDocument/2006/customXml" ds:itemID="{DAAF528F-7240-408A-9BF0-E37AC9702D32}">
+  <ds:schemaRefs>
+    <ds:schemaRef ds:uri="http://schemas.microsoft.com/office/2006/metadata/properties"/>
+    <ds:schemaRef ds:uri="http://schemas.microsoft.com/office/infopath/2007/PartnerControls"/>
+    <ds:schemaRef ds:uri="e62bc30b-b884-4ee1-b0ab-e2e35dfacfd5"/>
+  </ds:schemaRefs>
+</ds:datastoreItem>
+</file>
+
 <file path=customXml/itemProps3.xml><?xml version="1.0" encoding="utf-8"?>
+<ds:datastoreItem xmlns:ds="http://schemas.openxmlformats.org/officeDocument/2006/customXml" ds:itemID="{7E3075BF-FDAF-4D4D-8DC1-23126609A178}">
+  <ds:schemaRefs>
+    <ds:schemaRef ds:uri="http://schemas.microsoft.com/sharepoint/v3/contenttype/forms"/>
+  </ds:schemaRefs>
+</ds:datastoreItem>
+</file>
+
+<file path=customXml/itemProps4.xml><?xml version="1.0" encoding="utf-8"?>
 <ds:datastoreItem xmlns:ds="http://schemas.openxmlformats.org/officeDocument/2006/customXml" ds:itemID="{BE0E3CBB-9640-C643-97A5-411B9F838128}">
   <ds:schemaRefs>
     <ds:schemaRef ds:uri="http://schemas.openxmlformats.org/officeDocument/2006/bibliography"/>
   </ds:schemaRefs>
 </ds:datastoreItem>
-</file>
-
-<file path=customXml/itemProps4.xml><?xml version="1.0" encoding="utf-8"?>
-<ds:datastoreItem xmlns:ds="http://schemas.openxmlformats.org/officeDocument/2006/customXml" ds:itemID="{7E3075BF-FDAF-4D4D-8DC1-23126609A178}">
-  <ds:schemaRefs>
-    <ds:schemaRef ds:uri="http://schemas.microsoft.com/sharepoint/v3/contenttype/forms"/>
-  </ds:schemaRefs>
-</ds:datastoreItem>
 </file>
</xml_diff>